<commit_message>
Agregando Identificación de Actores y Alcance del Sistema
</commit_message>
<xml_diff>
--- a/Caso 5.docx
+++ b/Caso 5.docx
@@ -553,6 +553,1753 @@
           <w:shd w:fill="auto" w:val="clear"/>
         </w:rPr>
         <w:t>Ofrecer a los clientes visibilidad sobre su nivel de participación, destacando su contribución directa a la economía circular.</w:t>
+      </w:r>
+    </w:p>
+    <w:p>
+      <w:pPr>
+        <w:pStyle w:val="BodyText"/>
+        <w:numPr>
+          <w:ilvl w:val="0"/>
+          <w:numId w:val="0"/>
+        </w:numPr>
+        <w:pBdr/>
+        <w:bidi w:val="0"/>
+        <w:spacing w:lineRule="auto" w:line="331" w:before="0" w:after="0"/>
+        <w:ind w:hanging="0" w:start="0" w:end="0"/>
+        <w:rPr>
+          <w:rFonts w:ascii="times new roman " w:hAnsi="times new roman "/>
+          <w:b/>
+          <w:i w:val="false"/>
+          <w:caps w:val="false"/>
+          <w:smallCaps w:val="false"/>
+          <w:strike w:val="false"/>
+          <w:dstrike w:val="false"/>
+          <w:color w:val="000000"/>
+          <w:sz w:val="24"/>
+          <w:u w:val="none"/>
+          <w:effect w:val="none"/>
+          <w:shd w:fill="auto" w:val="clear"/>
+        </w:rPr>
+      </w:pPr>
+      <w:bookmarkStart w:id="1" w:name="docs-internal-guid-046de91a-7fff-3b82-80"/>
+      <w:bookmarkEnd w:id="1"/>
+      <w:r>
+        <w:rPr>
+          <w:rFonts w:ascii="times new roman " w:hAnsi="times new roman "/>
+          <w:b/>
+          <w:i w:val="false"/>
+          <w:caps w:val="false"/>
+          <w:smallCaps w:val="false"/>
+          <w:strike w:val="false"/>
+          <w:dstrike w:val="false"/>
+          <w:color w:val="000000"/>
+          <w:sz w:val="24"/>
+          <w:u w:val="none"/>
+          <w:effect w:val="none"/>
+          <w:shd w:fill="auto" w:val="clear"/>
+        </w:rPr>
+        <w:t>1.4 Identificación de Actores </w:t>
+      </w:r>
+    </w:p>
+    <w:p>
+      <w:pPr>
+        <w:pStyle w:val="BodyText"/>
+        <w:spacing w:lineRule="auto" w:line="331" w:before="0" w:after="0"/>
+        <w:rPr>
+          <w:rFonts w:ascii="times new roman " w:hAnsi="times new roman "/>
+          <w:color w:val="000000"/>
+          <w:sz w:val="24"/>
+        </w:rPr>
+      </w:pPr>
+      <w:r>
+        <w:rPr>
+          <w:rFonts w:ascii="times new roman " w:hAnsi="times new roman "/>
+          <w:color w:val="000000"/>
+          <w:sz w:val="24"/>
+        </w:rPr>
+      </w:r>
+    </w:p>
+    <w:tbl>
+      <w:tblPr>
+        <w:tblW w:w="8504" w:type="dxa"/>
+        <w:jc w:val="start"/>
+        <w:tblInd w:w="-7" w:type="dxa"/>
+        <w:tblLayout w:type="fixed"/>
+        <w:tblCellMar>
+          <w:top w:w="120" w:type="dxa"/>
+          <w:start w:w="180" w:type="dxa"/>
+          <w:bottom w:w="120" w:type="dxa"/>
+          <w:end w:w="180" w:type="dxa"/>
+        </w:tblCellMar>
+      </w:tblPr>
+      <w:tblGrid>
+        <w:gridCol w:w="2321"/>
+        <w:gridCol w:w="1531"/>
+        <w:gridCol w:w="4652"/>
+      </w:tblGrid>
+      <w:tr>
+        <w:trPr/>
+        <w:tc>
+          <w:tcPr>
+            <w:tcW w:w="2321" w:type="dxa"/>
+            <w:tcBorders>
+              <w:top w:val="single" w:sz="6" w:space="0" w:color="C4C7C5"/>
+              <w:start w:val="single" w:sz="6" w:space="0" w:color="C4C7C5"/>
+              <w:bottom w:val="single" w:sz="6" w:space="0" w:color="C4C7C5"/>
+              <w:end w:val="single" w:sz="6" w:space="0" w:color="C4C7C5"/>
+            </w:tcBorders>
+            <w:vAlign w:val="center"/>
+          </w:tcPr>
+          <w:p>
+            <w:pPr>
+              <w:pStyle w:val="Contenidodelatabla"/>
+              <w:widowControl/>
+              <w:bidi w:val="0"/>
+              <w:spacing w:lineRule="auto" w:line="331" w:before="0" w:after="480"/>
+              <w:ind w:hanging="0" w:start="0" w:end="0"/>
+              <w:rPr>
+                <w:rFonts w:ascii="times new roman " w:hAnsi="times new roman "/>
+                <w:b/>
+                <w:i w:val="false"/>
+                <w:caps w:val="false"/>
+                <w:smallCaps w:val="false"/>
+                <w:strike w:val="false"/>
+                <w:dstrike w:val="false"/>
+                <w:color w:val="000000"/>
+                <w:sz w:val="24"/>
+                <w:u w:val="none"/>
+                <w:effect w:val="none"/>
+                <w:shd w:fill="auto" w:val="clear"/>
+              </w:rPr>
+            </w:pPr>
+            <w:r>
+              <w:rPr>
+                <w:rFonts w:ascii="times new roman " w:hAnsi="times new roman "/>
+                <w:b/>
+                <w:i w:val="false"/>
+                <w:caps w:val="false"/>
+                <w:smallCaps w:val="false"/>
+                <w:strike w:val="false"/>
+                <w:dstrike w:val="false"/>
+                <w:color w:val="000000"/>
+                <w:sz w:val="24"/>
+                <w:u w:val="none"/>
+                <w:effect w:val="none"/>
+                <w:shd w:fill="auto" w:val="clear"/>
+              </w:rPr>
+              <w:t>Actor</w:t>
+            </w:r>
+          </w:p>
+        </w:tc>
+        <w:tc>
+          <w:tcPr>
+            <w:tcW w:w="1531" w:type="dxa"/>
+            <w:tcBorders>
+              <w:top w:val="single" w:sz="6" w:space="0" w:color="C4C7C5"/>
+              <w:start w:val="single" w:sz="6" w:space="0" w:color="C4C7C5"/>
+              <w:bottom w:val="single" w:sz="6" w:space="0" w:color="C4C7C5"/>
+              <w:end w:val="single" w:sz="6" w:space="0" w:color="C4C7C5"/>
+            </w:tcBorders>
+            <w:vAlign w:val="center"/>
+          </w:tcPr>
+          <w:p>
+            <w:pPr>
+              <w:pStyle w:val="Contenidodelatabla"/>
+              <w:widowControl/>
+              <w:bidi w:val="0"/>
+              <w:spacing w:lineRule="auto" w:line="331" w:before="0" w:after="480"/>
+              <w:ind w:hanging="0" w:start="0" w:end="0"/>
+              <w:rPr>
+                <w:rFonts w:ascii="times new roman " w:hAnsi="times new roman "/>
+                <w:b/>
+                <w:i w:val="false"/>
+                <w:caps w:val="false"/>
+                <w:smallCaps w:val="false"/>
+                <w:strike w:val="false"/>
+                <w:dstrike w:val="false"/>
+                <w:color w:val="000000"/>
+                <w:sz w:val="24"/>
+                <w:u w:val="none"/>
+                <w:effect w:val="none"/>
+                <w:shd w:fill="auto" w:val="clear"/>
+              </w:rPr>
+            </w:pPr>
+            <w:r>
+              <w:rPr>
+                <w:rFonts w:ascii="times new roman " w:hAnsi="times new roman "/>
+                <w:b/>
+                <w:i w:val="false"/>
+                <w:caps w:val="false"/>
+                <w:smallCaps w:val="false"/>
+                <w:strike w:val="false"/>
+                <w:dstrike w:val="false"/>
+                <w:color w:val="000000"/>
+                <w:sz w:val="24"/>
+                <w:u w:val="none"/>
+                <w:effect w:val="none"/>
+                <w:shd w:fill="auto" w:val="clear"/>
+              </w:rPr>
+              <w:t>Tipo</w:t>
+            </w:r>
+          </w:p>
+        </w:tc>
+        <w:tc>
+          <w:tcPr>
+            <w:tcW w:w="4652" w:type="dxa"/>
+            <w:tcBorders>
+              <w:top w:val="single" w:sz="6" w:space="0" w:color="C4C7C5"/>
+              <w:start w:val="single" w:sz="6" w:space="0" w:color="C4C7C5"/>
+              <w:bottom w:val="single" w:sz="6" w:space="0" w:color="C4C7C5"/>
+              <w:end w:val="single" w:sz="6" w:space="0" w:color="C4C7C5"/>
+            </w:tcBorders>
+            <w:vAlign w:val="center"/>
+          </w:tcPr>
+          <w:p>
+            <w:pPr>
+              <w:pStyle w:val="Contenidodelatabla"/>
+              <w:widowControl/>
+              <w:bidi w:val="0"/>
+              <w:spacing w:lineRule="auto" w:line="331" w:before="0" w:after="480"/>
+              <w:ind w:hanging="0" w:start="0" w:end="0"/>
+              <w:rPr>
+                <w:rFonts w:ascii="times new roman " w:hAnsi="times new roman "/>
+                <w:b/>
+                <w:i w:val="false"/>
+                <w:caps w:val="false"/>
+                <w:smallCaps w:val="false"/>
+                <w:strike w:val="false"/>
+                <w:dstrike w:val="false"/>
+                <w:color w:val="000000"/>
+                <w:sz w:val="24"/>
+                <w:u w:val="none"/>
+                <w:effect w:val="none"/>
+                <w:shd w:fill="auto" w:val="clear"/>
+              </w:rPr>
+            </w:pPr>
+            <w:r>
+              <w:rPr>
+                <w:rFonts w:ascii="times new roman " w:hAnsi="times new roman "/>
+                <w:b/>
+                <w:i w:val="false"/>
+                <w:caps w:val="false"/>
+                <w:smallCaps w:val="false"/>
+                <w:strike w:val="false"/>
+                <w:dstrike w:val="false"/>
+                <w:color w:val="000000"/>
+                <w:sz w:val="24"/>
+                <w:u w:val="none"/>
+                <w:effect w:val="none"/>
+                <w:shd w:fill="auto" w:val="clear"/>
+              </w:rPr>
+              <w:t>Descripción</w:t>
+            </w:r>
+          </w:p>
+        </w:tc>
+      </w:tr>
+      <w:tr>
+        <w:trPr/>
+        <w:tc>
+          <w:tcPr>
+            <w:tcW w:w="2321" w:type="dxa"/>
+            <w:tcBorders>
+              <w:top w:val="single" w:sz="6" w:space="0" w:color="C4C7C5"/>
+              <w:start w:val="single" w:sz="6" w:space="0" w:color="C4C7C5"/>
+              <w:bottom w:val="single" w:sz="6" w:space="0" w:color="C4C7C5"/>
+              <w:end w:val="single" w:sz="6" w:space="0" w:color="C4C7C5"/>
+            </w:tcBorders>
+            <w:vAlign w:val="center"/>
+          </w:tcPr>
+          <w:p>
+            <w:pPr>
+              <w:pStyle w:val="Contenidodelatabla"/>
+              <w:widowControl/>
+              <w:bidi w:val="0"/>
+              <w:spacing w:lineRule="auto" w:line="331" w:before="0" w:after="480"/>
+              <w:ind w:hanging="0" w:start="0" w:end="0"/>
+              <w:rPr>
+                <w:rFonts w:ascii="times new roman " w:hAnsi="times new roman "/>
+                <w:b/>
+                <w:i w:val="false"/>
+                <w:caps w:val="false"/>
+                <w:smallCaps w:val="false"/>
+                <w:strike w:val="false"/>
+                <w:dstrike w:val="false"/>
+                <w:color w:val="000000"/>
+                <w:sz w:val="24"/>
+                <w:u w:val="none"/>
+                <w:effect w:val="none"/>
+                <w:shd w:fill="auto" w:val="clear"/>
+              </w:rPr>
+            </w:pPr>
+            <w:r>
+              <w:rPr>
+                <w:rFonts w:ascii="times new roman " w:hAnsi="times new roman "/>
+                <w:b/>
+                <w:i w:val="false"/>
+                <w:caps w:val="false"/>
+                <w:smallCaps w:val="false"/>
+                <w:strike w:val="false"/>
+                <w:dstrike w:val="false"/>
+                <w:color w:val="000000"/>
+                <w:sz w:val="24"/>
+                <w:u w:val="none"/>
+                <w:effect w:val="none"/>
+                <w:shd w:fill="auto" w:val="clear"/>
+              </w:rPr>
+              <w:t>Administrador del Sistema</w:t>
+            </w:r>
+          </w:p>
+        </w:tc>
+        <w:tc>
+          <w:tcPr>
+            <w:tcW w:w="1531" w:type="dxa"/>
+            <w:tcBorders>
+              <w:top w:val="single" w:sz="6" w:space="0" w:color="C4C7C5"/>
+              <w:start w:val="single" w:sz="6" w:space="0" w:color="C4C7C5"/>
+              <w:bottom w:val="single" w:sz="6" w:space="0" w:color="C4C7C5"/>
+              <w:end w:val="single" w:sz="6" w:space="0" w:color="C4C7C5"/>
+            </w:tcBorders>
+            <w:vAlign w:val="center"/>
+          </w:tcPr>
+          <w:p>
+            <w:pPr>
+              <w:pStyle w:val="Contenidodelatabla"/>
+              <w:widowControl/>
+              <w:bidi w:val="0"/>
+              <w:spacing w:lineRule="auto" w:line="331" w:before="0" w:after="480"/>
+              <w:ind w:hanging="0" w:start="0" w:end="0"/>
+              <w:rPr>
+                <w:rFonts w:ascii="times new roman " w:hAnsi="times new roman "/>
+                <w:b w:val="false"/>
+                <w:bCs w:val="false"/>
+                <w:i w:val="false"/>
+                <w:caps w:val="false"/>
+                <w:smallCaps w:val="false"/>
+                <w:strike w:val="false"/>
+                <w:dstrike w:val="false"/>
+                <w:color w:val="000000"/>
+                <w:sz w:val="24"/>
+                <w:u w:val="none"/>
+                <w:effect w:val="none"/>
+                <w:shd w:fill="auto" w:val="clear"/>
+              </w:rPr>
+            </w:pPr>
+            <w:r>
+              <w:rPr>
+                <w:rFonts w:ascii="times new roman " w:hAnsi="times new roman "/>
+                <w:b w:val="false"/>
+                <w:bCs w:val="false"/>
+                <w:i w:val="false"/>
+                <w:caps w:val="false"/>
+                <w:smallCaps w:val="false"/>
+                <w:strike w:val="false"/>
+                <w:dstrike w:val="false"/>
+                <w:color w:val="000000"/>
+                <w:sz w:val="24"/>
+                <w:u w:val="none"/>
+                <w:effect w:val="none"/>
+                <w:shd w:fill="auto" w:val="clear"/>
+              </w:rPr>
+              <w:t>Interno</w:t>
+            </w:r>
+          </w:p>
+        </w:tc>
+        <w:tc>
+          <w:tcPr>
+            <w:tcW w:w="4652" w:type="dxa"/>
+            <w:tcBorders>
+              <w:top w:val="single" w:sz="6" w:space="0" w:color="C4C7C5"/>
+              <w:start w:val="single" w:sz="6" w:space="0" w:color="C4C7C5"/>
+              <w:bottom w:val="single" w:sz="6" w:space="0" w:color="C4C7C5"/>
+              <w:end w:val="single" w:sz="6" w:space="0" w:color="C4C7C5"/>
+            </w:tcBorders>
+            <w:vAlign w:val="center"/>
+          </w:tcPr>
+          <w:p>
+            <w:pPr>
+              <w:pStyle w:val="Contenidodelatabla"/>
+              <w:widowControl/>
+              <w:bidi w:val="0"/>
+              <w:spacing w:lineRule="auto" w:line="331" w:before="0" w:after="480"/>
+              <w:ind w:hanging="0" w:start="0" w:end="0"/>
+              <w:rPr>
+                <w:rFonts w:ascii="times new roman " w:hAnsi="times new roman "/>
+                <w:b w:val="false"/>
+                <w:bCs w:val="false"/>
+                <w:i w:val="false"/>
+                <w:caps w:val="false"/>
+                <w:smallCaps w:val="false"/>
+                <w:strike w:val="false"/>
+                <w:dstrike w:val="false"/>
+                <w:color w:val="000000"/>
+                <w:sz w:val="24"/>
+                <w:u w:val="none"/>
+                <w:effect w:val="none"/>
+                <w:shd w:fill="auto" w:val="clear"/>
+              </w:rPr>
+            </w:pPr>
+            <w:r>
+              <w:rPr>
+                <w:rFonts w:ascii="times new roman " w:hAnsi="times new roman "/>
+                <w:b w:val="false"/>
+                <w:bCs w:val="false"/>
+                <w:i w:val="false"/>
+                <w:caps w:val="false"/>
+                <w:smallCaps w:val="false"/>
+                <w:strike w:val="false"/>
+                <w:dstrike w:val="false"/>
+                <w:color w:val="000000"/>
+                <w:sz w:val="24"/>
+                <w:u w:val="none"/>
+                <w:effect w:val="none"/>
+                <w:shd w:fill="auto" w:val="clear"/>
+              </w:rPr>
+              <w:t>Encargado de la configuración general del software, la gestión de usuarios y el control de parámetros operativos para garantizar el correcto funcionamiento del sistema.</w:t>
+            </w:r>
+          </w:p>
+        </w:tc>
+      </w:tr>
+      <w:tr>
+        <w:trPr/>
+        <w:tc>
+          <w:tcPr>
+            <w:tcW w:w="2321" w:type="dxa"/>
+            <w:tcBorders>
+              <w:top w:val="single" w:sz="6" w:space="0" w:color="C4C7C5"/>
+              <w:start w:val="single" w:sz="6" w:space="0" w:color="C4C7C5"/>
+              <w:bottom w:val="single" w:sz="6" w:space="0" w:color="C4C7C5"/>
+              <w:end w:val="single" w:sz="6" w:space="0" w:color="C4C7C5"/>
+            </w:tcBorders>
+            <w:vAlign w:val="center"/>
+          </w:tcPr>
+          <w:p>
+            <w:pPr>
+              <w:pStyle w:val="Contenidodelatabla"/>
+              <w:widowControl/>
+              <w:bidi w:val="0"/>
+              <w:spacing w:lineRule="auto" w:line="331" w:before="0" w:after="480"/>
+              <w:ind w:hanging="0" w:start="0" w:end="0"/>
+              <w:rPr>
+                <w:rFonts w:ascii="times new roman " w:hAnsi="times new roman "/>
+                <w:b/>
+                <w:i w:val="false"/>
+                <w:caps w:val="false"/>
+                <w:smallCaps w:val="false"/>
+                <w:strike w:val="false"/>
+                <w:dstrike w:val="false"/>
+                <w:color w:val="000000"/>
+                <w:sz w:val="24"/>
+                <w:u w:val="none"/>
+                <w:effect w:val="none"/>
+                <w:shd w:fill="auto" w:val="clear"/>
+              </w:rPr>
+            </w:pPr>
+            <w:r>
+              <w:rPr>
+                <w:rFonts w:ascii="times new roman " w:hAnsi="times new roman "/>
+                <w:b/>
+                <w:i w:val="false"/>
+                <w:caps w:val="false"/>
+                <w:smallCaps w:val="false"/>
+                <w:strike w:val="false"/>
+                <w:dstrike w:val="false"/>
+                <w:color w:val="000000"/>
+                <w:sz w:val="24"/>
+                <w:u w:val="none"/>
+                <w:effect w:val="none"/>
+                <w:shd w:fill="auto" w:val="clear"/>
+              </w:rPr>
+              <w:t>Operador de Recolección</w:t>
+            </w:r>
+          </w:p>
+        </w:tc>
+        <w:tc>
+          <w:tcPr>
+            <w:tcW w:w="1531" w:type="dxa"/>
+            <w:tcBorders>
+              <w:top w:val="single" w:sz="6" w:space="0" w:color="C4C7C5"/>
+              <w:start w:val="single" w:sz="6" w:space="0" w:color="C4C7C5"/>
+              <w:bottom w:val="single" w:sz="6" w:space="0" w:color="C4C7C5"/>
+              <w:end w:val="single" w:sz="6" w:space="0" w:color="C4C7C5"/>
+            </w:tcBorders>
+            <w:vAlign w:val="center"/>
+          </w:tcPr>
+          <w:p>
+            <w:pPr>
+              <w:pStyle w:val="Contenidodelatabla"/>
+              <w:widowControl/>
+              <w:bidi w:val="0"/>
+              <w:spacing w:lineRule="auto" w:line="331" w:before="0" w:after="480"/>
+              <w:ind w:hanging="0" w:start="0" w:end="0"/>
+              <w:rPr>
+                <w:rFonts w:ascii="times new roman " w:hAnsi="times new roman "/>
+                <w:b w:val="false"/>
+                <w:bCs w:val="false"/>
+                <w:i w:val="false"/>
+                <w:caps w:val="false"/>
+                <w:smallCaps w:val="false"/>
+                <w:strike w:val="false"/>
+                <w:dstrike w:val="false"/>
+                <w:color w:val="000000"/>
+                <w:sz w:val="24"/>
+                <w:u w:val="none"/>
+                <w:effect w:val="none"/>
+                <w:shd w:fill="auto" w:val="clear"/>
+              </w:rPr>
+            </w:pPr>
+            <w:r>
+              <w:rPr>
+                <w:rFonts w:ascii="times new roman " w:hAnsi="times new roman "/>
+                <w:b w:val="false"/>
+                <w:bCs w:val="false"/>
+                <w:i w:val="false"/>
+                <w:caps w:val="false"/>
+                <w:smallCaps w:val="false"/>
+                <w:strike w:val="false"/>
+                <w:dstrike w:val="false"/>
+                <w:color w:val="000000"/>
+                <w:sz w:val="24"/>
+                <w:u w:val="none"/>
+                <w:effect w:val="none"/>
+                <w:shd w:fill="auto" w:val="clear"/>
+              </w:rPr>
+              <w:t>Interno</w:t>
+            </w:r>
+          </w:p>
+        </w:tc>
+        <w:tc>
+          <w:tcPr>
+            <w:tcW w:w="4652" w:type="dxa"/>
+            <w:tcBorders>
+              <w:top w:val="single" w:sz="6" w:space="0" w:color="C4C7C5"/>
+              <w:start w:val="single" w:sz="6" w:space="0" w:color="C4C7C5"/>
+              <w:bottom w:val="single" w:sz="6" w:space="0" w:color="C4C7C5"/>
+              <w:end w:val="single" w:sz="6" w:space="0" w:color="C4C7C5"/>
+            </w:tcBorders>
+            <w:vAlign w:val="center"/>
+          </w:tcPr>
+          <w:p>
+            <w:pPr>
+              <w:pStyle w:val="Contenidodelatabla"/>
+              <w:widowControl/>
+              <w:bidi w:val="0"/>
+              <w:spacing w:lineRule="auto" w:line="331" w:before="0" w:after="480"/>
+              <w:ind w:hanging="0" w:start="0" w:end="0"/>
+              <w:rPr>
+                <w:rFonts w:ascii="times new roman " w:hAnsi="times new roman "/>
+                <w:b w:val="false"/>
+                <w:bCs w:val="false"/>
+                <w:i w:val="false"/>
+                <w:caps w:val="false"/>
+                <w:smallCaps w:val="false"/>
+                <w:strike w:val="false"/>
+                <w:dstrike w:val="false"/>
+                <w:color w:val="000000"/>
+                <w:sz w:val="24"/>
+                <w:u w:val="none"/>
+                <w:effect w:val="none"/>
+                <w:shd w:fill="auto" w:val="clear"/>
+              </w:rPr>
+            </w:pPr>
+            <w:r>
+              <w:rPr>
+                <w:rFonts w:ascii="times new roman " w:hAnsi="times new roman "/>
+                <w:b w:val="false"/>
+                <w:bCs w:val="false"/>
+                <w:i w:val="false"/>
+                <w:caps w:val="false"/>
+                <w:smallCaps w:val="false"/>
+                <w:strike w:val="false"/>
+                <w:dstrike w:val="false"/>
+                <w:color w:val="000000"/>
+                <w:sz w:val="24"/>
+                <w:u w:val="none"/>
+                <w:effect w:val="none"/>
+                <w:shd w:fill="auto" w:val="clear"/>
+              </w:rPr>
+              <w:t>Personal de campo que consulta las rutas programadas, registra la recolección en tiempo real y reporta novedades o incidencias durante la jornada.</w:t>
+            </w:r>
+          </w:p>
+        </w:tc>
+      </w:tr>
+      <w:tr>
+        <w:trPr/>
+        <w:tc>
+          <w:tcPr>
+            <w:tcW w:w="2321" w:type="dxa"/>
+            <w:tcBorders>
+              <w:top w:val="single" w:sz="6" w:space="0" w:color="C4C7C5"/>
+              <w:start w:val="single" w:sz="6" w:space="0" w:color="C4C7C5"/>
+              <w:bottom w:val="single" w:sz="6" w:space="0" w:color="C4C7C5"/>
+              <w:end w:val="single" w:sz="6" w:space="0" w:color="C4C7C5"/>
+            </w:tcBorders>
+            <w:vAlign w:val="center"/>
+          </w:tcPr>
+          <w:p>
+            <w:pPr>
+              <w:pStyle w:val="Contenidodelatabla"/>
+              <w:widowControl/>
+              <w:bidi w:val="0"/>
+              <w:spacing w:lineRule="auto" w:line="331" w:before="0" w:after="480"/>
+              <w:ind w:hanging="0" w:start="0" w:end="0"/>
+              <w:rPr>
+                <w:rFonts w:ascii="times new roman " w:hAnsi="times new roman "/>
+                <w:b/>
+                <w:i w:val="false"/>
+                <w:caps w:val="false"/>
+                <w:smallCaps w:val="false"/>
+                <w:strike w:val="false"/>
+                <w:dstrike w:val="false"/>
+                <w:color w:val="000000"/>
+                <w:sz w:val="24"/>
+                <w:u w:val="none"/>
+                <w:effect w:val="none"/>
+                <w:shd w:fill="auto" w:val="clear"/>
+              </w:rPr>
+            </w:pPr>
+            <w:r>
+              <w:rPr>
+                <w:rFonts w:ascii="times new roman " w:hAnsi="times new roman "/>
+                <w:b/>
+                <w:i w:val="false"/>
+                <w:caps w:val="false"/>
+                <w:smallCaps w:val="false"/>
+                <w:strike w:val="false"/>
+                <w:dstrike w:val="false"/>
+                <w:color w:val="000000"/>
+                <w:sz w:val="24"/>
+                <w:u w:val="none"/>
+                <w:effect w:val="none"/>
+                <w:shd w:fill="auto" w:val="clear"/>
+              </w:rPr>
+              <w:t>Técnico Ambiental</w:t>
+            </w:r>
+          </w:p>
+        </w:tc>
+        <w:tc>
+          <w:tcPr>
+            <w:tcW w:w="1531" w:type="dxa"/>
+            <w:tcBorders>
+              <w:top w:val="single" w:sz="6" w:space="0" w:color="C4C7C5"/>
+              <w:start w:val="single" w:sz="6" w:space="0" w:color="C4C7C5"/>
+              <w:bottom w:val="single" w:sz="6" w:space="0" w:color="C4C7C5"/>
+              <w:end w:val="single" w:sz="6" w:space="0" w:color="C4C7C5"/>
+            </w:tcBorders>
+            <w:vAlign w:val="center"/>
+          </w:tcPr>
+          <w:p>
+            <w:pPr>
+              <w:pStyle w:val="Contenidodelatabla"/>
+              <w:widowControl/>
+              <w:bidi w:val="0"/>
+              <w:spacing w:lineRule="auto" w:line="331" w:before="0" w:after="480"/>
+              <w:ind w:hanging="0" w:start="0" w:end="0"/>
+              <w:rPr>
+                <w:rFonts w:ascii="times new roman " w:hAnsi="times new roman "/>
+                <w:b w:val="false"/>
+                <w:bCs w:val="false"/>
+                <w:i w:val="false"/>
+                <w:caps w:val="false"/>
+                <w:smallCaps w:val="false"/>
+                <w:strike w:val="false"/>
+                <w:dstrike w:val="false"/>
+                <w:color w:val="000000"/>
+                <w:sz w:val="24"/>
+                <w:u w:val="none"/>
+                <w:effect w:val="none"/>
+                <w:shd w:fill="auto" w:val="clear"/>
+              </w:rPr>
+            </w:pPr>
+            <w:r>
+              <w:rPr>
+                <w:rFonts w:ascii="times new roman " w:hAnsi="times new roman "/>
+                <w:b w:val="false"/>
+                <w:bCs w:val="false"/>
+                <w:i w:val="false"/>
+                <w:caps w:val="false"/>
+                <w:smallCaps w:val="false"/>
+                <w:strike w:val="false"/>
+                <w:dstrike w:val="false"/>
+                <w:color w:val="000000"/>
+                <w:sz w:val="24"/>
+                <w:u w:val="none"/>
+                <w:effect w:val="none"/>
+                <w:shd w:fill="auto" w:val="clear"/>
+              </w:rPr>
+              <w:t>Interno</w:t>
+            </w:r>
+          </w:p>
+        </w:tc>
+        <w:tc>
+          <w:tcPr>
+            <w:tcW w:w="4652" w:type="dxa"/>
+            <w:tcBorders>
+              <w:top w:val="single" w:sz="6" w:space="0" w:color="C4C7C5"/>
+              <w:start w:val="single" w:sz="6" w:space="0" w:color="C4C7C5"/>
+              <w:bottom w:val="single" w:sz="6" w:space="0" w:color="C4C7C5"/>
+              <w:end w:val="single" w:sz="6" w:space="0" w:color="C4C7C5"/>
+            </w:tcBorders>
+            <w:vAlign w:val="center"/>
+          </w:tcPr>
+          <w:p>
+            <w:pPr>
+              <w:pStyle w:val="Contenidodelatabla"/>
+              <w:widowControl/>
+              <w:bidi w:val="0"/>
+              <w:spacing w:lineRule="auto" w:line="331" w:before="0" w:after="480"/>
+              <w:ind w:hanging="0" w:start="0" w:end="0"/>
+              <w:rPr>
+                <w:rFonts w:ascii="times new roman " w:hAnsi="times new roman "/>
+                <w:b w:val="false"/>
+                <w:bCs w:val="false"/>
+                <w:i w:val="false"/>
+                <w:caps w:val="false"/>
+                <w:smallCaps w:val="false"/>
+                <w:strike w:val="false"/>
+                <w:dstrike w:val="false"/>
+                <w:color w:val="000000"/>
+                <w:sz w:val="24"/>
+                <w:u w:val="none"/>
+                <w:effect w:val="none"/>
+                <w:shd w:fill="auto" w:val="clear"/>
+              </w:rPr>
+            </w:pPr>
+            <w:r>
+              <w:rPr>
+                <w:rFonts w:ascii="times new roman " w:hAnsi="times new roman "/>
+                <w:b w:val="false"/>
+                <w:bCs w:val="false"/>
+                <w:i w:val="false"/>
+                <w:caps w:val="false"/>
+                <w:smallCaps w:val="false"/>
+                <w:strike w:val="false"/>
+                <w:dstrike w:val="false"/>
+                <w:color w:val="000000"/>
+                <w:sz w:val="24"/>
+                <w:u w:val="none"/>
+                <w:effect w:val="none"/>
+                <w:shd w:fill="auto" w:val="clear"/>
+              </w:rPr>
+              <w:t>Profesional responsable de auditar la calidad del insumo orgánico, supervisar las fases de transformación y elaborar los indicadores de impacto ambiental.</w:t>
+            </w:r>
+          </w:p>
+        </w:tc>
+      </w:tr>
+      <w:tr>
+        <w:trPr/>
+        <w:tc>
+          <w:tcPr>
+            <w:tcW w:w="2321" w:type="dxa"/>
+            <w:tcBorders>
+              <w:top w:val="single" w:sz="6" w:space="0" w:color="C4C7C5"/>
+              <w:start w:val="single" w:sz="6" w:space="0" w:color="C4C7C5"/>
+              <w:bottom w:val="single" w:sz="6" w:space="0" w:color="C4C7C5"/>
+              <w:end w:val="single" w:sz="6" w:space="0" w:color="C4C7C5"/>
+            </w:tcBorders>
+            <w:vAlign w:val="center"/>
+          </w:tcPr>
+          <w:p>
+            <w:pPr>
+              <w:pStyle w:val="Contenidodelatabla"/>
+              <w:widowControl/>
+              <w:bidi w:val="0"/>
+              <w:spacing w:lineRule="auto" w:line="331" w:before="0" w:after="480"/>
+              <w:ind w:hanging="0" w:start="0" w:end="0"/>
+              <w:rPr>
+                <w:rFonts w:ascii="times new roman " w:hAnsi="times new roman "/>
+                <w:b/>
+                <w:i w:val="false"/>
+                <w:caps w:val="false"/>
+                <w:smallCaps w:val="false"/>
+                <w:strike w:val="false"/>
+                <w:dstrike w:val="false"/>
+                <w:color w:val="000000"/>
+                <w:sz w:val="24"/>
+                <w:u w:val="none"/>
+                <w:effect w:val="none"/>
+                <w:shd w:fill="auto" w:val="clear"/>
+              </w:rPr>
+            </w:pPr>
+            <w:r>
+              <w:rPr>
+                <w:rFonts w:ascii="times new roman " w:hAnsi="times new roman "/>
+                <w:b/>
+                <w:i w:val="false"/>
+                <w:caps w:val="false"/>
+                <w:smallCaps w:val="false"/>
+                <w:strike w:val="false"/>
+                <w:dstrike w:val="false"/>
+                <w:color w:val="000000"/>
+                <w:sz w:val="24"/>
+                <w:u w:val="none"/>
+                <w:effect w:val="none"/>
+                <w:shd w:fill="auto" w:val="clear"/>
+              </w:rPr>
+              <w:t>Administrador de la Planta</w:t>
+            </w:r>
+          </w:p>
+        </w:tc>
+        <w:tc>
+          <w:tcPr>
+            <w:tcW w:w="1531" w:type="dxa"/>
+            <w:tcBorders>
+              <w:top w:val="single" w:sz="6" w:space="0" w:color="C4C7C5"/>
+              <w:start w:val="single" w:sz="6" w:space="0" w:color="C4C7C5"/>
+              <w:bottom w:val="single" w:sz="6" w:space="0" w:color="C4C7C5"/>
+              <w:end w:val="single" w:sz="6" w:space="0" w:color="C4C7C5"/>
+            </w:tcBorders>
+            <w:vAlign w:val="center"/>
+          </w:tcPr>
+          <w:p>
+            <w:pPr>
+              <w:pStyle w:val="Contenidodelatabla"/>
+              <w:widowControl/>
+              <w:bidi w:val="0"/>
+              <w:spacing w:lineRule="auto" w:line="331" w:before="0" w:after="480"/>
+              <w:ind w:hanging="0" w:start="0" w:end="0"/>
+              <w:rPr>
+                <w:rFonts w:ascii="times new roman " w:hAnsi="times new roman "/>
+                <w:b w:val="false"/>
+                <w:bCs w:val="false"/>
+                <w:i w:val="false"/>
+                <w:caps w:val="false"/>
+                <w:smallCaps w:val="false"/>
+                <w:strike w:val="false"/>
+                <w:dstrike w:val="false"/>
+                <w:color w:val="000000"/>
+                <w:sz w:val="24"/>
+                <w:u w:val="none"/>
+                <w:effect w:val="none"/>
+                <w:shd w:fill="auto" w:val="clear"/>
+              </w:rPr>
+            </w:pPr>
+            <w:r>
+              <w:rPr>
+                <w:rFonts w:ascii="times new roman " w:hAnsi="times new roman "/>
+                <w:b w:val="false"/>
+                <w:bCs w:val="false"/>
+                <w:i w:val="false"/>
+                <w:caps w:val="false"/>
+                <w:smallCaps w:val="false"/>
+                <w:strike w:val="false"/>
+                <w:dstrike w:val="false"/>
+                <w:color w:val="000000"/>
+                <w:sz w:val="24"/>
+                <w:u w:val="none"/>
+                <w:effect w:val="none"/>
+                <w:shd w:fill="auto" w:val="clear"/>
+              </w:rPr>
+              <w:t>Interno</w:t>
+            </w:r>
+          </w:p>
+        </w:tc>
+        <w:tc>
+          <w:tcPr>
+            <w:tcW w:w="4652" w:type="dxa"/>
+            <w:tcBorders>
+              <w:top w:val="single" w:sz="6" w:space="0" w:color="C4C7C5"/>
+              <w:start w:val="single" w:sz="6" w:space="0" w:color="C4C7C5"/>
+              <w:bottom w:val="single" w:sz="6" w:space="0" w:color="C4C7C5"/>
+              <w:end w:val="single" w:sz="6" w:space="0" w:color="C4C7C5"/>
+            </w:tcBorders>
+            <w:vAlign w:val="center"/>
+          </w:tcPr>
+          <w:p>
+            <w:pPr>
+              <w:pStyle w:val="Contenidodelatabla"/>
+              <w:widowControl/>
+              <w:bidi w:val="0"/>
+              <w:spacing w:lineRule="auto" w:line="331" w:before="0" w:after="480"/>
+              <w:ind w:hanging="0" w:start="0" w:end="0"/>
+              <w:rPr>
+                <w:rFonts w:ascii="times new roman " w:hAnsi="times new roman "/>
+                <w:b w:val="false"/>
+                <w:bCs w:val="false"/>
+                <w:i w:val="false"/>
+                <w:caps w:val="false"/>
+                <w:smallCaps w:val="false"/>
+                <w:strike w:val="false"/>
+                <w:dstrike w:val="false"/>
+                <w:color w:val="000000"/>
+                <w:sz w:val="24"/>
+                <w:u w:val="none"/>
+                <w:effect w:val="none"/>
+                <w:shd w:fill="auto" w:val="clear"/>
+              </w:rPr>
+            </w:pPr>
+            <w:r>
+              <w:rPr>
+                <w:rFonts w:ascii="times new roman " w:hAnsi="times new roman "/>
+                <w:b w:val="false"/>
+                <w:bCs w:val="false"/>
+                <w:i w:val="false"/>
+                <w:caps w:val="false"/>
+                <w:smallCaps w:val="false"/>
+                <w:strike w:val="false"/>
+                <w:dstrike w:val="false"/>
+                <w:color w:val="000000"/>
+                <w:sz w:val="24"/>
+                <w:u w:val="none"/>
+                <w:effect w:val="none"/>
+                <w:shd w:fill="auto" w:val="clear"/>
+              </w:rPr>
+              <w:t>Gestiona el volumen de residuos que ingresa a la instalación, da seguimiento a las etapas del proceso y controla el stock de compost terminado.</w:t>
+            </w:r>
+          </w:p>
+        </w:tc>
+      </w:tr>
+      <w:tr>
+        <w:trPr/>
+        <w:tc>
+          <w:tcPr>
+            <w:tcW w:w="2321" w:type="dxa"/>
+            <w:tcBorders>
+              <w:top w:val="single" w:sz="6" w:space="0" w:color="C4C7C5"/>
+              <w:start w:val="single" w:sz="6" w:space="0" w:color="C4C7C5"/>
+              <w:bottom w:val="single" w:sz="6" w:space="0" w:color="C4C7C5"/>
+              <w:end w:val="single" w:sz="6" w:space="0" w:color="C4C7C5"/>
+            </w:tcBorders>
+            <w:vAlign w:val="center"/>
+          </w:tcPr>
+          <w:p>
+            <w:pPr>
+              <w:pStyle w:val="Contenidodelatabla"/>
+              <w:widowControl/>
+              <w:bidi w:val="0"/>
+              <w:spacing w:lineRule="auto" w:line="331" w:before="0" w:after="480"/>
+              <w:ind w:hanging="0" w:start="0" w:end="0"/>
+              <w:rPr>
+                <w:rFonts w:ascii="times new roman " w:hAnsi="times new roman "/>
+                <w:b/>
+                <w:i w:val="false"/>
+                <w:caps w:val="false"/>
+                <w:smallCaps w:val="false"/>
+                <w:strike w:val="false"/>
+                <w:dstrike w:val="false"/>
+                <w:color w:val="000000"/>
+                <w:sz w:val="24"/>
+                <w:u w:val="none"/>
+                <w:effect w:val="none"/>
+                <w:shd w:fill="auto" w:val="clear"/>
+              </w:rPr>
+            </w:pPr>
+            <w:r>
+              <w:rPr>
+                <w:rFonts w:ascii="times new roman " w:hAnsi="times new roman "/>
+                <w:b/>
+                <w:i w:val="false"/>
+                <w:caps w:val="false"/>
+                <w:smallCaps w:val="false"/>
+                <w:strike w:val="false"/>
+                <w:dstrike w:val="false"/>
+                <w:color w:val="000000"/>
+                <w:sz w:val="24"/>
+                <w:u w:val="none"/>
+                <w:effect w:val="none"/>
+                <w:shd w:fill="auto" w:val="clear"/>
+              </w:rPr>
+              <w:t>Cliente Residencial</w:t>
+            </w:r>
+          </w:p>
+        </w:tc>
+        <w:tc>
+          <w:tcPr>
+            <w:tcW w:w="1531" w:type="dxa"/>
+            <w:tcBorders>
+              <w:top w:val="single" w:sz="6" w:space="0" w:color="C4C7C5"/>
+              <w:start w:val="single" w:sz="6" w:space="0" w:color="C4C7C5"/>
+              <w:bottom w:val="single" w:sz="6" w:space="0" w:color="C4C7C5"/>
+              <w:end w:val="single" w:sz="6" w:space="0" w:color="C4C7C5"/>
+            </w:tcBorders>
+            <w:vAlign w:val="center"/>
+          </w:tcPr>
+          <w:p>
+            <w:pPr>
+              <w:pStyle w:val="Contenidodelatabla"/>
+              <w:widowControl/>
+              <w:bidi w:val="0"/>
+              <w:spacing w:lineRule="auto" w:line="331" w:before="0" w:after="480"/>
+              <w:ind w:hanging="0" w:start="0" w:end="0"/>
+              <w:rPr>
+                <w:rFonts w:ascii="times new roman " w:hAnsi="times new roman "/>
+                <w:b w:val="false"/>
+                <w:bCs w:val="false"/>
+                <w:i w:val="false"/>
+                <w:caps w:val="false"/>
+                <w:smallCaps w:val="false"/>
+                <w:strike w:val="false"/>
+                <w:dstrike w:val="false"/>
+                <w:color w:val="000000"/>
+                <w:sz w:val="24"/>
+                <w:u w:val="none"/>
+                <w:effect w:val="none"/>
+                <w:shd w:fill="auto" w:val="clear"/>
+              </w:rPr>
+            </w:pPr>
+            <w:r>
+              <w:rPr>
+                <w:rFonts w:ascii="times new roman " w:hAnsi="times new roman "/>
+                <w:b w:val="false"/>
+                <w:bCs w:val="false"/>
+                <w:i w:val="false"/>
+                <w:caps w:val="false"/>
+                <w:smallCaps w:val="false"/>
+                <w:strike w:val="false"/>
+                <w:dstrike w:val="false"/>
+                <w:color w:val="000000"/>
+                <w:sz w:val="24"/>
+                <w:u w:val="none"/>
+                <w:effect w:val="none"/>
+                <w:shd w:fill="auto" w:val="clear"/>
+              </w:rPr>
+              <w:t>Externo</w:t>
+            </w:r>
+          </w:p>
+        </w:tc>
+        <w:tc>
+          <w:tcPr>
+            <w:tcW w:w="4652" w:type="dxa"/>
+            <w:tcBorders>
+              <w:top w:val="single" w:sz="6" w:space="0" w:color="C4C7C5"/>
+              <w:start w:val="single" w:sz="6" w:space="0" w:color="C4C7C5"/>
+              <w:bottom w:val="single" w:sz="6" w:space="0" w:color="C4C7C5"/>
+              <w:end w:val="single" w:sz="6" w:space="0" w:color="C4C7C5"/>
+            </w:tcBorders>
+            <w:vAlign w:val="center"/>
+          </w:tcPr>
+          <w:p>
+            <w:pPr>
+              <w:pStyle w:val="Contenidodelatabla"/>
+              <w:widowControl/>
+              <w:bidi w:val="0"/>
+              <w:spacing w:lineRule="auto" w:line="331" w:before="0" w:after="480"/>
+              <w:ind w:hanging="0" w:start="0" w:end="0"/>
+              <w:rPr>
+                <w:rFonts w:ascii="times new roman " w:hAnsi="times new roman "/>
+                <w:b w:val="false"/>
+                <w:bCs w:val="false"/>
+                <w:i w:val="false"/>
+                <w:caps w:val="false"/>
+                <w:smallCaps w:val="false"/>
+                <w:strike w:val="false"/>
+                <w:dstrike w:val="false"/>
+                <w:color w:val="000000"/>
+                <w:sz w:val="24"/>
+                <w:u w:val="none"/>
+                <w:effect w:val="none"/>
+                <w:shd w:fill="auto" w:val="clear"/>
+              </w:rPr>
+            </w:pPr>
+            <w:r>
+              <w:rPr>
+                <w:rFonts w:ascii="times new roman " w:hAnsi="times new roman "/>
+                <w:b w:val="false"/>
+                <w:bCs w:val="false"/>
+                <w:i w:val="false"/>
+                <w:caps w:val="false"/>
+                <w:smallCaps w:val="false"/>
+                <w:strike w:val="false"/>
+                <w:dstrike w:val="false"/>
+                <w:color w:val="000000"/>
+                <w:sz w:val="24"/>
+                <w:u w:val="none"/>
+                <w:effect w:val="none"/>
+                <w:shd w:fill="auto" w:val="clear"/>
+              </w:rPr>
+              <w:t>Usuario del hogar que dispone sus residuos orgánicos y accede a la plataforma para conocer su historial de entrega y el valor de su aporte ambiental.</w:t>
+            </w:r>
+          </w:p>
+        </w:tc>
+      </w:tr>
+      <w:tr>
+        <w:trPr/>
+        <w:tc>
+          <w:tcPr>
+            <w:tcW w:w="2321" w:type="dxa"/>
+            <w:tcBorders>
+              <w:top w:val="single" w:sz="6" w:space="0" w:color="C4C7C5"/>
+              <w:start w:val="single" w:sz="6" w:space="0" w:color="C4C7C5"/>
+              <w:bottom w:val="single" w:sz="6" w:space="0" w:color="C4C7C5"/>
+              <w:end w:val="single" w:sz="6" w:space="0" w:color="C4C7C5"/>
+            </w:tcBorders>
+            <w:vAlign w:val="center"/>
+          </w:tcPr>
+          <w:p>
+            <w:pPr>
+              <w:pStyle w:val="Contenidodelatabla"/>
+              <w:widowControl/>
+              <w:bidi w:val="0"/>
+              <w:spacing w:lineRule="auto" w:line="331" w:before="0" w:after="480"/>
+              <w:ind w:hanging="0" w:start="0" w:end="0"/>
+              <w:rPr>
+                <w:rFonts w:ascii="times new roman " w:hAnsi="times new roman "/>
+                <w:b/>
+                <w:i w:val="false"/>
+                <w:caps w:val="false"/>
+                <w:smallCaps w:val="false"/>
+                <w:strike w:val="false"/>
+                <w:dstrike w:val="false"/>
+                <w:color w:val="000000"/>
+                <w:sz w:val="24"/>
+                <w:u w:val="none"/>
+                <w:effect w:val="none"/>
+                <w:shd w:fill="auto" w:val="clear"/>
+              </w:rPr>
+            </w:pPr>
+            <w:r>
+              <w:rPr>
+                <w:rFonts w:ascii="times new roman " w:hAnsi="times new roman "/>
+                <w:b/>
+                <w:i w:val="false"/>
+                <w:caps w:val="false"/>
+                <w:smallCaps w:val="false"/>
+                <w:strike w:val="false"/>
+                <w:dstrike w:val="false"/>
+                <w:color w:val="000000"/>
+                <w:sz w:val="24"/>
+                <w:u w:val="none"/>
+                <w:effect w:val="none"/>
+                <w:shd w:fill="auto" w:val="clear"/>
+              </w:rPr>
+              <w:t>Cliente Comercial</w:t>
+            </w:r>
+          </w:p>
+        </w:tc>
+        <w:tc>
+          <w:tcPr>
+            <w:tcW w:w="1531" w:type="dxa"/>
+            <w:tcBorders>
+              <w:top w:val="single" w:sz="6" w:space="0" w:color="C4C7C5"/>
+              <w:start w:val="single" w:sz="6" w:space="0" w:color="C4C7C5"/>
+              <w:bottom w:val="single" w:sz="6" w:space="0" w:color="C4C7C5"/>
+              <w:end w:val="single" w:sz="6" w:space="0" w:color="C4C7C5"/>
+            </w:tcBorders>
+            <w:vAlign w:val="center"/>
+          </w:tcPr>
+          <w:p>
+            <w:pPr>
+              <w:pStyle w:val="Contenidodelatabla"/>
+              <w:widowControl/>
+              <w:bidi w:val="0"/>
+              <w:spacing w:lineRule="auto" w:line="331" w:before="0" w:after="480"/>
+              <w:ind w:hanging="0" w:start="0" w:end="0"/>
+              <w:rPr>
+                <w:rFonts w:ascii="times new roman " w:hAnsi="times new roman "/>
+                <w:b w:val="false"/>
+                <w:bCs w:val="false"/>
+                <w:i w:val="false"/>
+                <w:caps w:val="false"/>
+                <w:smallCaps w:val="false"/>
+                <w:strike w:val="false"/>
+                <w:dstrike w:val="false"/>
+                <w:color w:val="000000"/>
+                <w:sz w:val="24"/>
+                <w:u w:val="none"/>
+                <w:effect w:val="none"/>
+                <w:shd w:fill="auto" w:val="clear"/>
+              </w:rPr>
+            </w:pPr>
+            <w:r>
+              <w:rPr>
+                <w:rFonts w:ascii="times new roman " w:hAnsi="times new roman "/>
+                <w:b w:val="false"/>
+                <w:bCs w:val="false"/>
+                <w:i w:val="false"/>
+                <w:caps w:val="false"/>
+                <w:smallCaps w:val="false"/>
+                <w:strike w:val="false"/>
+                <w:dstrike w:val="false"/>
+                <w:color w:val="000000"/>
+                <w:sz w:val="24"/>
+                <w:u w:val="none"/>
+                <w:effect w:val="none"/>
+                <w:shd w:fill="auto" w:val="clear"/>
+              </w:rPr>
+              <w:t>Externo</w:t>
+            </w:r>
+          </w:p>
+        </w:tc>
+        <w:tc>
+          <w:tcPr>
+            <w:tcW w:w="4652" w:type="dxa"/>
+            <w:tcBorders>
+              <w:top w:val="single" w:sz="6" w:space="0" w:color="C4C7C5"/>
+              <w:start w:val="single" w:sz="6" w:space="0" w:color="C4C7C5"/>
+              <w:bottom w:val="single" w:sz="6" w:space="0" w:color="C4C7C5"/>
+              <w:end w:val="single" w:sz="6" w:space="0" w:color="C4C7C5"/>
+            </w:tcBorders>
+            <w:vAlign w:val="center"/>
+          </w:tcPr>
+          <w:p>
+            <w:pPr>
+              <w:pStyle w:val="Contenidodelatabla"/>
+              <w:widowControl/>
+              <w:bidi w:val="0"/>
+              <w:spacing w:lineRule="auto" w:line="331" w:before="0" w:after="480"/>
+              <w:ind w:hanging="0" w:start="0" w:end="0"/>
+              <w:rPr>
+                <w:rFonts w:ascii="times new roman " w:hAnsi="times new roman "/>
+                <w:b w:val="false"/>
+                <w:bCs w:val="false"/>
+                <w:i w:val="false"/>
+                <w:caps w:val="false"/>
+                <w:smallCaps w:val="false"/>
+                <w:strike w:val="false"/>
+                <w:dstrike w:val="false"/>
+                <w:color w:val="000000"/>
+                <w:sz w:val="24"/>
+                <w:u w:val="none"/>
+                <w:effect w:val="none"/>
+                <w:shd w:fill="auto" w:val="clear"/>
+              </w:rPr>
+            </w:pPr>
+            <w:r>
+              <w:rPr>
+                <w:rFonts w:ascii="times new roman " w:hAnsi="times new roman "/>
+                <w:b w:val="false"/>
+                <w:bCs w:val="false"/>
+                <w:i w:val="false"/>
+                <w:caps w:val="false"/>
+                <w:smallCaps w:val="false"/>
+                <w:strike w:val="false"/>
+                <w:dstrike w:val="false"/>
+                <w:color w:val="000000"/>
+                <w:sz w:val="24"/>
+                <w:u w:val="none"/>
+                <w:effect w:val="none"/>
+                <w:shd w:fill="auto" w:val="clear"/>
+              </w:rPr>
+              <w:t>Negocio o restaurante que gestiona la recolección de sus desechos y consulta métricas específicas sobre la masa orgánica generada por su actividad.</w:t>
+            </w:r>
+          </w:p>
+        </w:tc>
+      </w:tr>
+      <w:tr>
+        <w:trPr/>
+        <w:tc>
+          <w:tcPr>
+            <w:tcW w:w="2321" w:type="dxa"/>
+            <w:tcBorders>
+              <w:top w:val="single" w:sz="6" w:space="0" w:color="C4C7C5"/>
+              <w:start w:val="single" w:sz="6" w:space="0" w:color="C4C7C5"/>
+              <w:bottom w:val="single" w:sz="6" w:space="0" w:color="C4C7C5"/>
+              <w:end w:val="single" w:sz="6" w:space="0" w:color="C4C7C5"/>
+            </w:tcBorders>
+            <w:vAlign w:val="center"/>
+          </w:tcPr>
+          <w:p>
+            <w:pPr>
+              <w:pStyle w:val="Contenidodelatabla"/>
+              <w:widowControl/>
+              <w:bidi w:val="0"/>
+              <w:spacing w:lineRule="auto" w:line="331" w:before="0" w:after="480"/>
+              <w:ind w:hanging="0" w:start="0" w:end="0"/>
+              <w:rPr>
+                <w:rFonts w:ascii="times new roman " w:hAnsi="times new roman "/>
+                <w:b/>
+                <w:i w:val="false"/>
+                <w:caps w:val="false"/>
+                <w:smallCaps w:val="false"/>
+                <w:strike w:val="false"/>
+                <w:dstrike w:val="false"/>
+                <w:color w:val="000000"/>
+                <w:sz w:val="24"/>
+                <w:u w:val="none"/>
+                <w:effect w:val="none"/>
+                <w:shd w:fill="auto" w:val="clear"/>
+              </w:rPr>
+            </w:pPr>
+            <w:r>
+              <w:rPr>
+                <w:rFonts w:ascii="times new roman " w:hAnsi="times new roman "/>
+                <w:b/>
+                <w:i w:val="false"/>
+                <w:caps w:val="false"/>
+                <w:smallCaps w:val="false"/>
+                <w:strike w:val="false"/>
+                <w:dstrike w:val="false"/>
+                <w:color w:val="000000"/>
+                <w:sz w:val="24"/>
+                <w:u w:val="none"/>
+                <w:effect w:val="none"/>
+                <w:shd w:fill="auto" w:val="clear"/>
+              </w:rPr>
+              <w:t>Gobierno Local</w:t>
+            </w:r>
+          </w:p>
+        </w:tc>
+        <w:tc>
+          <w:tcPr>
+            <w:tcW w:w="1531" w:type="dxa"/>
+            <w:tcBorders>
+              <w:top w:val="single" w:sz="6" w:space="0" w:color="C4C7C5"/>
+              <w:start w:val="single" w:sz="6" w:space="0" w:color="C4C7C5"/>
+              <w:bottom w:val="single" w:sz="6" w:space="0" w:color="C4C7C5"/>
+              <w:end w:val="single" w:sz="6" w:space="0" w:color="C4C7C5"/>
+            </w:tcBorders>
+            <w:vAlign w:val="center"/>
+          </w:tcPr>
+          <w:p>
+            <w:pPr>
+              <w:pStyle w:val="Contenidodelatabla"/>
+              <w:widowControl/>
+              <w:bidi w:val="0"/>
+              <w:spacing w:lineRule="auto" w:line="331" w:before="0" w:after="480"/>
+              <w:ind w:hanging="0" w:start="0" w:end="0"/>
+              <w:rPr>
+                <w:rFonts w:ascii="times new roman " w:hAnsi="times new roman "/>
+                <w:b w:val="false"/>
+                <w:bCs w:val="false"/>
+                <w:i w:val="false"/>
+                <w:caps w:val="false"/>
+                <w:smallCaps w:val="false"/>
+                <w:strike w:val="false"/>
+                <w:dstrike w:val="false"/>
+                <w:color w:val="000000"/>
+                <w:sz w:val="24"/>
+                <w:u w:val="none"/>
+                <w:effect w:val="none"/>
+                <w:shd w:fill="auto" w:val="clear"/>
+              </w:rPr>
+            </w:pPr>
+            <w:r>
+              <w:rPr>
+                <w:rFonts w:ascii="times new roman " w:hAnsi="times new roman "/>
+                <w:b w:val="false"/>
+                <w:bCs w:val="false"/>
+                <w:i w:val="false"/>
+                <w:caps w:val="false"/>
+                <w:smallCaps w:val="false"/>
+                <w:strike w:val="false"/>
+                <w:dstrike w:val="false"/>
+                <w:color w:val="000000"/>
+                <w:sz w:val="24"/>
+                <w:u w:val="none"/>
+                <w:effect w:val="none"/>
+                <w:shd w:fill="auto" w:val="clear"/>
+              </w:rPr>
+              <w:t>Externo</w:t>
+            </w:r>
+          </w:p>
+        </w:tc>
+        <w:tc>
+          <w:tcPr>
+            <w:tcW w:w="4652" w:type="dxa"/>
+            <w:tcBorders>
+              <w:top w:val="single" w:sz="6" w:space="0" w:color="C4C7C5"/>
+              <w:start w:val="single" w:sz="6" w:space="0" w:color="C4C7C5"/>
+              <w:bottom w:val="single" w:sz="6" w:space="0" w:color="C4C7C5"/>
+              <w:end w:val="single" w:sz="6" w:space="0" w:color="C4C7C5"/>
+            </w:tcBorders>
+            <w:vAlign w:val="center"/>
+          </w:tcPr>
+          <w:p>
+            <w:pPr>
+              <w:pStyle w:val="Contenidodelatabla"/>
+              <w:widowControl/>
+              <w:bidi w:val="0"/>
+              <w:spacing w:lineRule="auto" w:line="331" w:before="0" w:after="480"/>
+              <w:ind w:hanging="0" w:start="0" w:end="0"/>
+              <w:rPr>
+                <w:rFonts w:ascii="times new roman " w:hAnsi="times new roman "/>
+                <w:b w:val="false"/>
+                <w:bCs w:val="false"/>
+                <w:i w:val="false"/>
+                <w:caps w:val="false"/>
+                <w:smallCaps w:val="false"/>
+                <w:strike w:val="false"/>
+                <w:dstrike w:val="false"/>
+                <w:color w:val="000000"/>
+                <w:sz w:val="24"/>
+                <w:u w:val="none"/>
+                <w:effect w:val="none"/>
+                <w:shd w:fill="auto" w:val="clear"/>
+              </w:rPr>
+            </w:pPr>
+            <w:r>
+              <w:rPr>
+                <w:rFonts w:ascii="times new roman " w:hAnsi="times new roman "/>
+                <w:b w:val="false"/>
+                <w:bCs w:val="false"/>
+                <w:i w:val="false"/>
+                <w:caps w:val="false"/>
+                <w:smallCaps w:val="false"/>
+                <w:strike w:val="false"/>
+                <w:dstrike w:val="false"/>
+                <w:color w:val="000000"/>
+                <w:sz w:val="24"/>
+                <w:u w:val="none"/>
+                <w:effect w:val="none"/>
+                <w:shd w:fill="auto" w:val="clear"/>
+              </w:rPr>
+              <w:t>Entidad fiscalizadora con acceso a reportes e indicadores validados para el seguimiento de las políticas de gestión integral de residuos.</w:t>
+            </w:r>
+          </w:p>
+        </w:tc>
+      </w:tr>
+      <w:tr>
+        <w:trPr/>
+        <w:tc>
+          <w:tcPr>
+            <w:tcW w:w="2321" w:type="dxa"/>
+            <w:tcBorders>
+              <w:top w:val="single" w:sz="6" w:space="0" w:color="C4C7C5"/>
+              <w:start w:val="single" w:sz="6" w:space="0" w:color="C4C7C5"/>
+              <w:bottom w:val="single" w:sz="6" w:space="0" w:color="C4C7C5"/>
+              <w:end w:val="single" w:sz="6" w:space="0" w:color="C4C7C5"/>
+            </w:tcBorders>
+            <w:vAlign w:val="center"/>
+          </w:tcPr>
+          <w:p>
+            <w:pPr>
+              <w:pStyle w:val="Contenidodelatabla"/>
+              <w:widowControl/>
+              <w:bidi w:val="0"/>
+              <w:spacing w:lineRule="auto" w:line="331" w:before="0" w:after="480"/>
+              <w:ind w:hanging="0" w:start="0" w:end="0"/>
+              <w:rPr>
+                <w:rFonts w:ascii="times new roman " w:hAnsi="times new roman "/>
+                <w:b/>
+                <w:i w:val="false"/>
+                <w:caps w:val="false"/>
+                <w:smallCaps w:val="false"/>
+                <w:strike w:val="false"/>
+                <w:dstrike w:val="false"/>
+                <w:color w:val="000000"/>
+                <w:sz w:val="24"/>
+                <w:u w:val="none"/>
+                <w:effect w:val="none"/>
+                <w:shd w:fill="auto" w:val="clear"/>
+              </w:rPr>
+            </w:pPr>
+            <w:r>
+              <w:rPr>
+                <w:rFonts w:ascii="times new roman " w:hAnsi="times new roman "/>
+                <w:b/>
+                <w:i w:val="false"/>
+                <w:caps w:val="false"/>
+                <w:smallCaps w:val="false"/>
+                <w:strike w:val="false"/>
+                <w:dstrike w:val="false"/>
+                <w:color w:val="000000"/>
+                <w:sz w:val="24"/>
+                <w:u w:val="none"/>
+                <w:effect w:val="none"/>
+                <w:shd w:fill="auto" w:val="clear"/>
+              </w:rPr>
+              <w:t>Comprador de Compost</w:t>
+            </w:r>
+          </w:p>
+        </w:tc>
+        <w:tc>
+          <w:tcPr>
+            <w:tcW w:w="1531" w:type="dxa"/>
+            <w:tcBorders>
+              <w:top w:val="single" w:sz="6" w:space="0" w:color="C4C7C5"/>
+              <w:start w:val="single" w:sz="6" w:space="0" w:color="C4C7C5"/>
+              <w:bottom w:val="single" w:sz="6" w:space="0" w:color="C4C7C5"/>
+              <w:end w:val="single" w:sz="6" w:space="0" w:color="C4C7C5"/>
+            </w:tcBorders>
+            <w:vAlign w:val="center"/>
+          </w:tcPr>
+          <w:p>
+            <w:pPr>
+              <w:pStyle w:val="Contenidodelatabla"/>
+              <w:widowControl/>
+              <w:bidi w:val="0"/>
+              <w:spacing w:lineRule="auto" w:line="331" w:before="0" w:after="480"/>
+              <w:ind w:hanging="0" w:start="0" w:end="0"/>
+              <w:rPr>
+                <w:rFonts w:ascii="times new roman " w:hAnsi="times new roman "/>
+                <w:b w:val="false"/>
+                <w:bCs w:val="false"/>
+                <w:i w:val="false"/>
+                <w:caps w:val="false"/>
+                <w:smallCaps w:val="false"/>
+                <w:strike w:val="false"/>
+                <w:dstrike w:val="false"/>
+                <w:color w:val="000000"/>
+                <w:sz w:val="24"/>
+                <w:u w:val="none"/>
+                <w:effect w:val="none"/>
+                <w:shd w:fill="auto" w:val="clear"/>
+              </w:rPr>
+            </w:pPr>
+            <w:r>
+              <w:rPr>
+                <w:rFonts w:ascii="times new roman " w:hAnsi="times new roman "/>
+                <w:b w:val="false"/>
+                <w:bCs w:val="false"/>
+                <w:i w:val="false"/>
+                <w:caps w:val="false"/>
+                <w:smallCaps w:val="false"/>
+                <w:strike w:val="false"/>
+                <w:dstrike w:val="false"/>
+                <w:color w:val="000000"/>
+                <w:sz w:val="24"/>
+                <w:u w:val="none"/>
+                <w:effect w:val="none"/>
+                <w:shd w:fill="auto" w:val="clear"/>
+              </w:rPr>
+              <w:t>Externo</w:t>
+            </w:r>
+          </w:p>
+        </w:tc>
+        <w:tc>
+          <w:tcPr>
+            <w:tcW w:w="4652" w:type="dxa"/>
+            <w:tcBorders>
+              <w:top w:val="single" w:sz="6" w:space="0" w:color="C4C7C5"/>
+              <w:start w:val="single" w:sz="6" w:space="0" w:color="C4C7C5"/>
+              <w:bottom w:val="single" w:sz="6" w:space="0" w:color="C4C7C5"/>
+              <w:end w:val="single" w:sz="6" w:space="0" w:color="C4C7C5"/>
+            </w:tcBorders>
+            <w:vAlign w:val="center"/>
+          </w:tcPr>
+          <w:p>
+            <w:pPr>
+              <w:pStyle w:val="Contenidodelatabla"/>
+              <w:widowControl/>
+              <w:bidi w:val="0"/>
+              <w:spacing w:lineRule="auto" w:line="331" w:before="0" w:after="480"/>
+              <w:ind w:hanging="0" w:start="0" w:end="0"/>
+              <w:rPr>
+                <w:rFonts w:ascii="times new roman " w:hAnsi="times new roman "/>
+                <w:b w:val="false"/>
+                <w:bCs w:val="false"/>
+                <w:i w:val="false"/>
+                <w:caps w:val="false"/>
+                <w:smallCaps w:val="false"/>
+                <w:strike w:val="false"/>
+                <w:dstrike w:val="false"/>
+                <w:color w:val="000000"/>
+                <w:sz w:val="24"/>
+                <w:u w:val="none"/>
+                <w:effect w:val="none"/>
+                <w:shd w:fill="auto" w:val="clear"/>
+              </w:rPr>
+            </w:pPr>
+            <w:r>
+              <w:rPr>
+                <w:rFonts w:ascii="times new roman " w:hAnsi="times new roman "/>
+                <w:b w:val="false"/>
+                <w:bCs w:val="false"/>
+                <w:i w:val="false"/>
+                <w:caps w:val="false"/>
+                <w:smallCaps w:val="false"/>
+                <w:strike w:val="false"/>
+                <w:dstrike w:val="false"/>
+                <w:color w:val="000000"/>
+                <w:sz w:val="24"/>
+                <w:u w:val="none"/>
+                <w:effect w:val="none"/>
+                <w:shd w:fill="auto" w:val="clear"/>
+              </w:rPr>
+              <w:t>Cliente final o empresa interesada en verificar la disponibilidad del fertilizante producido y formalizar pedidos de compra.</w:t>
+            </w:r>
+          </w:p>
+        </w:tc>
+      </w:tr>
+    </w:tbl>
+    <w:p>
+      <w:pPr>
+        <w:pStyle w:val="Heading3"/>
+        <w:bidi w:val="0"/>
+        <w:spacing w:lineRule="auto" w:line="331" w:before="280" w:after="80"/>
+        <w:ind w:hanging="0" w:start="0" w:end="0"/>
+        <w:rPr>
+          <w:rFonts w:ascii="times new roman " w:hAnsi="times new roman "/>
+          <w:b/>
+          <w:i w:val="false"/>
+          <w:caps w:val="false"/>
+          <w:smallCaps w:val="false"/>
+          <w:strike w:val="false"/>
+          <w:dstrike w:val="false"/>
+          <w:color w:val="000000"/>
+          <w:sz w:val="26"/>
+          <w:u w:val="none"/>
+          <w:effect w:val="none"/>
+          <w:shd w:fill="auto" w:val="clear"/>
+        </w:rPr>
+      </w:pPr>
+      <w:r>
+        <w:rPr>
+          <w:rFonts w:ascii="times new roman " w:hAnsi="times new roman "/>
+          <w:b/>
+          <w:i w:val="false"/>
+          <w:caps w:val="false"/>
+          <w:smallCaps w:val="false"/>
+          <w:strike w:val="false"/>
+          <w:dstrike w:val="false"/>
+          <w:color w:val="000000"/>
+          <w:sz w:val="26"/>
+          <w:u w:val="none"/>
+          <w:effect w:val="none"/>
+          <w:shd w:fill="auto" w:val="clear"/>
+        </w:rPr>
+        <w:t>1.5 Alcance del Sistema</w:t>
+      </w:r>
+    </w:p>
+    <w:p>
+      <w:pPr>
+        <w:pStyle w:val="BodyText"/>
+        <w:bidi w:val="0"/>
+        <w:spacing w:lineRule="auto" w:line="331" w:before="240" w:after="240"/>
+        <w:ind w:hanging="0" w:start="0" w:end="0"/>
+        <w:rPr>
+          <w:rFonts w:ascii="times new roman " w:hAnsi="times new roman "/>
+          <w:b w:val="false"/>
+          <w:i w:val="false"/>
+          <w:caps w:val="false"/>
+          <w:smallCaps w:val="false"/>
+          <w:strike w:val="false"/>
+          <w:dstrike w:val="false"/>
+          <w:color w:val="000000"/>
+          <w:sz w:val="24"/>
+          <w:u w:val="none"/>
+          <w:effect w:val="none"/>
+          <w:shd w:fill="auto" w:val="clear"/>
+        </w:rPr>
+      </w:pPr>
+      <w:r>
+        <w:rPr>
+          <w:rFonts w:ascii="times new roman " w:hAnsi="times new roman "/>
+          <w:b w:val="false"/>
+          <w:i w:val="false"/>
+          <w:caps w:val="false"/>
+          <w:smallCaps w:val="false"/>
+          <w:strike w:val="false"/>
+          <w:dstrike w:val="false"/>
+          <w:color w:val="000000"/>
+          <w:sz w:val="24"/>
+          <w:u w:val="none"/>
+          <w:effect w:val="none"/>
+          <w:shd w:fill="auto" w:val="clear"/>
+        </w:rPr>
+        <w:t>La plataforma abarcará la gestión integral del ciclo de vida de los residuos orgánicos, desde el alta inicial de los clientes hasta la obtención del producto final en planta.</w:t>
+      </w:r>
+    </w:p>
+    <w:p>
+      <w:pPr>
+        <w:pStyle w:val="BodyText"/>
+        <w:bidi w:val="0"/>
+        <w:spacing w:lineRule="auto" w:line="331" w:before="240" w:after="240"/>
+        <w:ind w:hanging="0" w:start="0" w:end="0"/>
+        <w:rPr>
+          <w:rFonts w:ascii="times new roman " w:hAnsi="times new roman "/>
+          <w:b w:val="false"/>
+          <w:i w:val="false"/>
+          <w:caps w:val="false"/>
+          <w:smallCaps w:val="false"/>
+          <w:strike w:val="false"/>
+          <w:dstrike w:val="false"/>
+          <w:color w:val="000000"/>
+          <w:sz w:val="24"/>
+          <w:u w:val="none"/>
+          <w:effect w:val="none"/>
+          <w:shd w:fill="auto" w:val="clear"/>
+        </w:rPr>
+      </w:pPr>
+      <w:r>
+        <w:rPr>
+          <w:rFonts w:ascii="times new roman " w:hAnsi="times new roman "/>
+          <w:b w:val="false"/>
+          <w:i w:val="false"/>
+          <w:caps w:val="false"/>
+          <w:smallCaps w:val="false"/>
+          <w:strike w:val="false"/>
+          <w:dstrike w:val="false"/>
+          <w:color w:val="000000"/>
+          <w:sz w:val="24"/>
+          <w:u w:val="none"/>
+          <w:effect w:val="none"/>
+          <w:shd w:fill="auto" w:val="clear"/>
+        </w:rPr>
+        <w:t>En esta fase, el software centralizará el registro de hogares y comercios, la trazabilidad de los contenedores asignados, la planificación logística de rutas y la asignación del personal de recolección. Asimismo, permitirá cuantificar el volumen capturado en cada jornada y monitorear el progreso de los lotes a lo largo de las distintas etapas del compostaje. Para la toma de decisiones y el seguimiento del programa, se incluirán herramientas analíticas capaces de consolidar reportes operativos, métricas de producción e indicadores sobre la huella ambiental mitigada, complementadas con un portal de usuarios donde los clientes podrán consultar su historial y visualizar el impacto real de su participación.</w:t>
+      </w:r>
+    </w:p>
+    <w:p>
+      <w:pPr>
+        <w:pStyle w:val="BodyText"/>
+        <w:bidi w:val="0"/>
+        <w:spacing w:lineRule="auto" w:line="331" w:before="240" w:after="240"/>
+        <w:ind w:hanging="0" w:start="0" w:end="0"/>
+        <w:rPr>
+          <w:rFonts w:ascii="times new roman " w:hAnsi="times new roman "/>
+          <w:b w:val="false"/>
+          <w:i w:val="false"/>
+          <w:caps w:val="false"/>
+          <w:smallCaps w:val="false"/>
+          <w:strike w:val="false"/>
+          <w:dstrike w:val="false"/>
+          <w:color w:val="000000"/>
+          <w:sz w:val="24"/>
+          <w:u w:val="none"/>
+          <w:effect w:val="none"/>
+          <w:shd w:fill="auto" w:val="clear"/>
+        </w:rPr>
+      </w:pPr>
+      <w:r>
+        <w:rPr>
+          <w:rFonts w:ascii="times new roman " w:hAnsi="times new roman "/>
+          <w:b w:val="false"/>
+          <w:i w:val="false"/>
+          <w:caps w:val="false"/>
+          <w:smallCaps w:val="false"/>
+          <w:strike w:val="false"/>
+          <w:dstrike w:val="false"/>
+          <w:color w:val="000000"/>
+          <w:sz w:val="24"/>
+          <w:u w:val="none"/>
+          <w:effect w:val="none"/>
+          <w:shd w:fill="auto" w:val="clear"/>
+        </w:rPr>
+        <w:t>Por otro lado, esta primera versión no contempla la comercialización en línea del compost terminado, la integración mediante API con plataformas de entidades gubernamentales ni el monitoreo automatizado de contenedores a través de sensores IoT.</w:t>
+      </w:r>
+    </w:p>
+    <w:p>
+      <w:pPr>
+        <w:pStyle w:val="BodyText"/>
+        <w:numPr>
+          <w:ilvl w:val="0"/>
+          <w:numId w:val="0"/>
+        </w:numPr>
+        <w:pBdr/>
+        <w:bidi w:val="0"/>
+        <w:spacing w:lineRule="auto" w:line="331" w:before="0" w:after="0"/>
+        <w:ind w:hanging="0" w:start="0" w:end="0"/>
+        <w:rPr>
+          <w:rFonts w:ascii="times new roman " w:hAnsi="times new roman "/>
+          <w:b w:val="false"/>
+          <w:i w:val="false"/>
+          <w:caps w:val="false"/>
+          <w:smallCaps w:val="false"/>
+          <w:strike w:val="false"/>
+          <w:dstrike w:val="false"/>
+          <w:color w:val="000000"/>
+          <w:sz w:val="24"/>
+          <w:szCs w:val="24"/>
+          <w:u w:val="none"/>
+          <w:effect w:val="none"/>
+          <w:shd w:fill="auto" w:val="clear"/>
+        </w:rPr>
+      </w:pPr>
+      <w:r>
+        <w:rPr>
+          <w:rFonts w:ascii="times new roman " w:hAnsi="times new roman "/>
+          <w:b w:val="false"/>
+          <w:i w:val="false"/>
+          <w:caps w:val="false"/>
+          <w:smallCaps w:val="false"/>
+          <w:strike w:val="false"/>
+          <w:dstrike w:val="false"/>
+          <w:color w:val="000000"/>
+          <w:sz w:val="24"/>
+          <w:szCs w:val="24"/>
+          <w:u w:val="none"/>
+          <w:effect w:val="none"/>
+          <w:shd w:fill="auto" w:val="clear"/>
+        </w:rPr>
       </w:r>
     </w:p>
     <w:p>
@@ -1839,6 +3586,29 @@
       <w:color w:themeColor="accent1" w:themeShade="bf" w:val="2F5496"/>
     </w:rPr>
   </w:style>
+  <w:style w:type="paragraph" w:styleId="Contenidodelatabla">
+    <w:name w:val="Contenido de la tabla"/>
+    <w:basedOn w:val="Normal"/>
+    <w:qFormat/>
+    <w:pPr>
+      <w:widowControl w:val="false"/>
+      <w:suppressLineNumbers/>
+    </w:pPr>
+    <w:rPr/>
+  </w:style>
+  <w:style w:type="paragraph" w:styleId="Ttulodelatabla">
+    <w:name w:val="Título de la tabla"/>
+    <w:basedOn w:val="Contenidodelatabla"/>
+    <w:qFormat/>
+    <w:pPr>
+      <w:suppressLineNumbers/>
+      <w:jc w:val="center"/>
+    </w:pPr>
+    <w:rPr>
+      <w:b/>
+      <w:bCs/>
+    </w:rPr>
+  </w:style>
   <w:style w:type="numbering" w:styleId="Ningunalista" w:default="1">
     <w:name w:val="Ninguna lista"/>
     <w:uiPriority w:val="99"/>

</xml_diff>

<commit_message>
Implememtando Restricciones y Supuestos al documento
</commit_message>
<xml_diff>
--- a/Caso 5.docx
+++ b/Caso 5.docx
@@ -2259,6 +2259,652 @@
     </w:p>
     <w:p>
       <w:pPr>
+        <w:pStyle w:val="Heading3"/>
+        <w:bidi w:val="0"/>
+        <w:spacing w:lineRule="auto" w:line="331" w:before="240" w:after="240"/>
+        <w:ind w:hanging="0" w:start="0" w:end="0"/>
+        <w:rPr>
+          <w:rFonts w:ascii="times new roman " w:hAnsi="times new roman "/>
+          <w:b/>
+          <w:i w:val="false"/>
+          <w:caps w:val="false"/>
+          <w:smallCaps w:val="false"/>
+          <w:strike w:val="false"/>
+          <w:dstrike w:val="false"/>
+          <w:color w:val="000000"/>
+          <w:sz w:val="26"/>
+          <w:u w:val="none"/>
+          <w:effect w:val="none"/>
+          <w:shd w:fill="auto" w:val="clear"/>
+        </w:rPr>
+      </w:pPr>
+      <w:bookmarkStart w:id="2" w:name="docs-internal-guid-1c18147e-7fff-291d-18"/>
+      <w:bookmarkEnd w:id="2"/>
+      <w:r>
+        <w:rPr>
+          <w:rFonts w:ascii="times new roman " w:hAnsi="times new roman "/>
+          <w:b/>
+          <w:i w:val="false"/>
+          <w:caps w:val="false"/>
+          <w:smallCaps w:val="false"/>
+          <w:strike w:val="false"/>
+          <w:dstrike w:val="false"/>
+          <w:color w:val="000000"/>
+          <w:sz w:val="26"/>
+          <w:u w:val="none"/>
+          <w:effect w:val="none"/>
+          <w:shd w:fill="auto" w:val="clear"/>
+        </w:rPr>
+        <w:t>1.6 Restricciones</w:t>
+      </w:r>
+    </w:p>
+    <w:p>
+      <w:pPr>
+        <w:pStyle w:val="BodyText"/>
+        <w:numPr>
+          <w:ilvl w:val="0"/>
+          <w:numId w:val="2"/>
+        </w:numPr>
+        <w:pBdr/>
+        <w:tabs>
+          <w:tab w:val="clear" w:pos="708"/>
+          <w:tab w:val="left" w:pos="0" w:leader="none"/>
+        </w:tabs>
+        <w:bidi w:val="0"/>
+        <w:spacing w:lineRule="auto" w:line="331" w:before="240" w:after="0"/>
+        <w:ind w:hanging="283" w:start="709" w:end="0"/>
+        <w:rPr>
+          <w:rFonts w:ascii="times new roman " w:hAnsi="times new roman "/>
+          <w:b w:val="false"/>
+          <w:i w:val="false"/>
+          <w:caps w:val="false"/>
+          <w:smallCaps w:val="false"/>
+          <w:strike w:val="false"/>
+          <w:dstrike w:val="false"/>
+          <w:color w:val="000000"/>
+          <w:sz w:val="24"/>
+          <w:u w:val="none"/>
+          <w:effect w:val="none"/>
+          <w:shd w:fill="auto" w:val="clear"/>
+        </w:rPr>
+      </w:pPr>
+      <w:r>
+        <w:rPr>
+          <w:rFonts w:ascii="times new roman " w:hAnsi="times new roman "/>
+          <w:b w:val="false"/>
+          <w:i w:val="false"/>
+          <w:caps w:val="false"/>
+          <w:smallCaps w:val="false"/>
+          <w:strike w:val="false"/>
+          <w:dstrike w:val="false"/>
+          <w:color w:val="000000"/>
+          <w:sz w:val="24"/>
+          <w:u w:val="none"/>
+          <w:effect w:val="none"/>
+          <w:shd w:fill="auto" w:val="clear"/>
+        </w:rPr>
+        <w:t>El alcance operativo del software se limita de forma exclusiva a la gestión y trazabilidad de residuos de tipo orgánico orientados al proceso de compostaje.</w:t>
+      </w:r>
+    </w:p>
+    <w:p>
+      <w:pPr>
+        <w:pStyle w:val="BodyText"/>
+        <w:numPr>
+          <w:ilvl w:val="0"/>
+          <w:numId w:val="2"/>
+        </w:numPr>
+        <w:pBdr/>
+        <w:tabs>
+          <w:tab w:val="clear" w:pos="708"/>
+          <w:tab w:val="left" w:pos="0" w:leader="none"/>
+        </w:tabs>
+        <w:bidi w:val="0"/>
+        <w:spacing w:lineRule="auto" w:line="331" w:before="0" w:after="0"/>
+        <w:ind w:hanging="283" w:start="709" w:end="0"/>
+        <w:rPr>
+          <w:rFonts w:ascii="times new roman " w:hAnsi="times new roman "/>
+          <w:b w:val="false"/>
+          <w:i w:val="false"/>
+          <w:caps w:val="false"/>
+          <w:smallCaps w:val="false"/>
+          <w:strike w:val="false"/>
+          <w:dstrike w:val="false"/>
+          <w:color w:val="000000"/>
+          <w:sz w:val="24"/>
+          <w:u w:val="none"/>
+          <w:effect w:val="none"/>
+          <w:shd w:fill="auto" w:val="clear"/>
+        </w:rPr>
+      </w:pPr>
+      <w:r>
+        <w:rPr>
+          <w:rFonts w:ascii="times new roman " w:hAnsi="times new roman "/>
+          <w:b w:val="false"/>
+          <w:i w:val="false"/>
+          <w:caps w:val="false"/>
+          <w:smallCaps w:val="false"/>
+          <w:strike w:val="false"/>
+          <w:dstrike w:val="false"/>
+          <w:color w:val="000000"/>
+          <w:sz w:val="24"/>
+          <w:u w:val="none"/>
+          <w:effect w:val="none"/>
+          <w:shd w:fill="auto" w:val="clear"/>
+        </w:rPr>
+        <w:t>El registro de operaciones y la sincronización de datos en tiempo real estarán supeditados a la disponibilidad continua de conectividad a Internet.</w:t>
+      </w:r>
+    </w:p>
+    <w:p>
+      <w:pPr>
+        <w:pStyle w:val="BodyText"/>
+        <w:numPr>
+          <w:ilvl w:val="0"/>
+          <w:numId w:val="2"/>
+        </w:numPr>
+        <w:pBdr/>
+        <w:tabs>
+          <w:tab w:val="clear" w:pos="708"/>
+          <w:tab w:val="left" w:pos="0" w:leader="none"/>
+        </w:tabs>
+        <w:bidi w:val="0"/>
+        <w:spacing w:lineRule="auto" w:line="331" w:before="0" w:after="0"/>
+        <w:ind w:hanging="283" w:start="709" w:end="0"/>
+        <w:rPr>
+          <w:rFonts w:ascii="times new roman " w:hAnsi="times new roman "/>
+          <w:b w:val="false"/>
+          <w:i w:val="false"/>
+          <w:caps w:val="false"/>
+          <w:smallCaps w:val="false"/>
+          <w:strike w:val="false"/>
+          <w:dstrike w:val="false"/>
+          <w:color w:val="000000"/>
+          <w:sz w:val="24"/>
+          <w:u w:val="none"/>
+          <w:effect w:val="none"/>
+          <w:shd w:fill="auto" w:val="clear"/>
+        </w:rPr>
+      </w:pPr>
+      <w:r>
+        <w:rPr>
+          <w:rFonts w:ascii="times new roman " w:hAnsi="times new roman "/>
+          <w:b w:val="false"/>
+          <w:i w:val="false"/>
+          <w:caps w:val="false"/>
+          <w:smallCaps w:val="false"/>
+          <w:strike w:val="false"/>
+          <w:dstrike w:val="false"/>
+          <w:color w:val="000000"/>
+          <w:sz w:val="24"/>
+          <w:u w:val="none"/>
+          <w:effect w:val="none"/>
+          <w:shd w:fill="auto" w:val="clear"/>
+        </w:rPr>
+        <w:t>La periodicidad del servicio no será uniforme, sino que se adaptará a la segmentación por sector y al perfil específico de cada cliente.</w:t>
+      </w:r>
+    </w:p>
+    <w:p>
+      <w:pPr>
+        <w:pStyle w:val="BodyText"/>
+        <w:numPr>
+          <w:ilvl w:val="0"/>
+          <w:numId w:val="2"/>
+        </w:numPr>
+        <w:pBdr/>
+        <w:tabs>
+          <w:tab w:val="clear" w:pos="708"/>
+          <w:tab w:val="left" w:pos="0" w:leader="none"/>
+        </w:tabs>
+        <w:bidi w:val="0"/>
+        <w:spacing w:lineRule="auto" w:line="331" w:before="0" w:after="0"/>
+        <w:ind w:hanging="283" w:start="709" w:end="0"/>
+        <w:rPr>
+          <w:rFonts w:ascii="times new roman " w:hAnsi="times new roman "/>
+          <w:b w:val="false"/>
+          <w:i w:val="false"/>
+          <w:caps w:val="false"/>
+          <w:smallCaps w:val="false"/>
+          <w:strike w:val="false"/>
+          <w:dstrike w:val="false"/>
+          <w:color w:val="000000"/>
+          <w:sz w:val="24"/>
+          <w:u w:val="none"/>
+          <w:effect w:val="none"/>
+          <w:shd w:fill="auto" w:val="clear"/>
+        </w:rPr>
+      </w:pPr>
+      <w:r>
+        <w:rPr>
+          <w:rFonts w:ascii="times new roman " w:hAnsi="times new roman "/>
+          <w:b w:val="false"/>
+          <w:i w:val="false"/>
+          <w:caps w:val="false"/>
+          <w:smallCaps w:val="false"/>
+          <w:strike w:val="false"/>
+          <w:dstrike w:val="false"/>
+          <w:color w:val="000000"/>
+          <w:sz w:val="24"/>
+          <w:u w:val="none"/>
+          <w:effect w:val="none"/>
+          <w:shd w:fill="auto" w:val="clear"/>
+        </w:rPr>
+        <w:t>La efectividad del proceso de transformación estará condicionada a una separación en fuente adecuada por parte de los generadores.</w:t>
+      </w:r>
+    </w:p>
+    <w:p>
+      <w:pPr>
+        <w:pStyle w:val="BodyText"/>
+        <w:numPr>
+          <w:ilvl w:val="0"/>
+          <w:numId w:val="2"/>
+        </w:numPr>
+        <w:pBdr/>
+        <w:tabs>
+          <w:tab w:val="clear" w:pos="708"/>
+          <w:tab w:val="left" w:pos="0" w:leader="none"/>
+        </w:tabs>
+        <w:bidi w:val="0"/>
+        <w:spacing w:lineRule="auto" w:line="331" w:before="0" w:after="0"/>
+        <w:ind w:hanging="283" w:start="709" w:end="0"/>
+        <w:rPr>
+          <w:rFonts w:ascii="times new roman " w:hAnsi="times new roman "/>
+          <w:b w:val="false"/>
+          <w:i w:val="false"/>
+          <w:caps w:val="false"/>
+          <w:smallCaps w:val="false"/>
+          <w:strike w:val="false"/>
+          <w:dstrike w:val="false"/>
+          <w:color w:val="000000"/>
+          <w:sz w:val="24"/>
+          <w:u w:val="none"/>
+          <w:effect w:val="none"/>
+          <w:shd w:fill="auto" w:val="clear"/>
+        </w:rPr>
+      </w:pPr>
+      <w:r>
+        <w:rPr>
+          <w:rFonts w:ascii="times new roman " w:hAnsi="times new roman "/>
+          <w:b w:val="false"/>
+          <w:i w:val="false"/>
+          <w:caps w:val="false"/>
+          <w:smallCaps w:val="false"/>
+          <w:strike w:val="false"/>
+          <w:dstrike w:val="false"/>
+          <w:color w:val="000000"/>
+          <w:sz w:val="24"/>
+          <w:u w:val="none"/>
+          <w:effect w:val="none"/>
+          <w:shd w:fill="auto" w:val="clear"/>
+        </w:rPr>
+        <w:t>El acceso a los módulos de administración y métricas ambientales estará restringido únicamente al personal que cuente con los permisos de seguridad requeridos.</w:t>
+      </w:r>
+    </w:p>
+    <w:p>
+      <w:pPr>
+        <w:pStyle w:val="BodyText"/>
+        <w:numPr>
+          <w:ilvl w:val="0"/>
+          <w:numId w:val="2"/>
+        </w:numPr>
+        <w:pBdr/>
+        <w:tabs>
+          <w:tab w:val="clear" w:pos="708"/>
+          <w:tab w:val="left" w:pos="0" w:leader="none"/>
+        </w:tabs>
+        <w:bidi w:val="0"/>
+        <w:spacing w:lineRule="auto" w:line="331" w:before="0" w:after="240"/>
+        <w:ind w:hanging="283" w:start="709" w:end="0"/>
+        <w:rPr>
+          <w:rFonts w:ascii="times new roman " w:hAnsi="times new roman "/>
+          <w:b w:val="false"/>
+          <w:i w:val="false"/>
+          <w:caps w:val="false"/>
+          <w:smallCaps w:val="false"/>
+          <w:strike w:val="false"/>
+          <w:dstrike w:val="false"/>
+          <w:color w:val="000000"/>
+          <w:sz w:val="24"/>
+          <w:u w:val="none"/>
+          <w:effect w:val="none"/>
+          <w:shd w:fill="auto" w:val="clear"/>
+        </w:rPr>
+      </w:pPr>
+      <w:r>
+        <w:rPr>
+          <w:rFonts w:ascii="times new roman " w:hAnsi="times new roman "/>
+          <w:b w:val="false"/>
+          <w:i w:val="false"/>
+          <w:caps w:val="false"/>
+          <w:smallCaps w:val="false"/>
+          <w:strike w:val="false"/>
+          <w:dstrike w:val="false"/>
+          <w:color w:val="000000"/>
+          <w:sz w:val="24"/>
+          <w:u w:val="none"/>
+          <w:effect w:val="none"/>
+          <w:shd w:fill="auto" w:val="clear"/>
+        </w:rPr>
+        <w:t>La precisión de la analítica y los reportes generados dependerá directamente de la consistencia y veracidad de los datos ingresados por los operadores e inspectores en planta.</w:t>
+      </w:r>
+    </w:p>
+    <w:p>
+      <w:pPr>
+        <w:pStyle w:val="Heading3"/>
+        <w:bidi w:val="0"/>
+        <w:spacing w:lineRule="auto" w:line="331" w:before="280" w:after="80"/>
+        <w:ind w:hanging="0" w:start="0" w:end="0"/>
+        <w:rPr>
+          <w:rFonts w:ascii="times new roman " w:hAnsi="times new roman "/>
+          <w:b/>
+          <w:i w:val="false"/>
+          <w:caps w:val="false"/>
+          <w:smallCaps w:val="false"/>
+          <w:strike w:val="false"/>
+          <w:dstrike w:val="false"/>
+          <w:color w:val="000000"/>
+          <w:sz w:val="26"/>
+          <w:u w:val="none"/>
+          <w:effect w:val="none"/>
+          <w:shd w:fill="auto" w:val="clear"/>
+        </w:rPr>
+      </w:pPr>
+      <w:r>
+        <w:rPr>
+          <w:rFonts w:ascii="times new roman " w:hAnsi="times new roman "/>
+          <w:b/>
+          <w:i w:val="false"/>
+          <w:caps w:val="false"/>
+          <w:smallCaps w:val="false"/>
+          <w:strike w:val="false"/>
+          <w:dstrike w:val="false"/>
+          <w:color w:val="000000"/>
+          <w:sz w:val="26"/>
+          <w:u w:val="none"/>
+          <w:effect w:val="none"/>
+          <w:shd w:fill="auto" w:val="clear"/>
+        </w:rPr>
+        <w:t>1.7 Supuestos</w:t>
+      </w:r>
+    </w:p>
+    <w:p>
+      <w:pPr>
+        <w:pStyle w:val="BodyText"/>
+        <w:numPr>
+          <w:ilvl w:val="0"/>
+          <w:numId w:val="3"/>
+        </w:numPr>
+        <w:pBdr/>
+        <w:tabs>
+          <w:tab w:val="clear" w:pos="708"/>
+          <w:tab w:val="left" w:pos="0" w:leader="none"/>
+        </w:tabs>
+        <w:bidi w:val="0"/>
+        <w:spacing w:lineRule="auto" w:line="331" w:before="240" w:after="0"/>
+        <w:ind w:hanging="283" w:start="709" w:end="0"/>
+        <w:rPr>
+          <w:rFonts w:ascii="times new roman " w:hAnsi="times new roman "/>
+          <w:b w:val="false"/>
+          <w:i w:val="false"/>
+          <w:caps w:val="false"/>
+          <w:smallCaps w:val="false"/>
+          <w:strike w:val="false"/>
+          <w:dstrike w:val="false"/>
+          <w:color w:val="000000"/>
+          <w:sz w:val="24"/>
+          <w:u w:val="none"/>
+          <w:effect w:val="none"/>
+          <w:shd w:fill="auto" w:val="clear"/>
+        </w:rPr>
+      </w:pPr>
+      <w:r>
+        <w:rPr>
+          <w:rFonts w:ascii="times new roman " w:hAnsi="times new roman "/>
+          <w:b w:val="false"/>
+          <w:i w:val="false"/>
+          <w:caps w:val="false"/>
+          <w:smallCaps w:val="false"/>
+          <w:strike w:val="false"/>
+          <w:dstrike w:val="false"/>
+          <w:color w:val="000000"/>
+          <w:sz w:val="24"/>
+          <w:u w:val="none"/>
+          <w:effect w:val="none"/>
+          <w:shd w:fill="auto" w:val="clear"/>
+        </w:rPr>
+        <w:t>Se asume que la información proporcionada por los clientes durante el proceso de registro e incorporación es verídica y precisa.</w:t>
+      </w:r>
+    </w:p>
+    <w:p>
+      <w:pPr>
+        <w:pStyle w:val="BodyText"/>
+        <w:numPr>
+          <w:ilvl w:val="0"/>
+          <w:numId w:val="3"/>
+        </w:numPr>
+        <w:pBdr/>
+        <w:tabs>
+          <w:tab w:val="clear" w:pos="708"/>
+          <w:tab w:val="left" w:pos="0" w:leader="none"/>
+        </w:tabs>
+        <w:bidi w:val="0"/>
+        <w:spacing w:lineRule="auto" w:line="331" w:before="0" w:after="0"/>
+        <w:ind w:hanging="283" w:start="709" w:end="0"/>
+        <w:rPr>
+          <w:rFonts w:ascii="times new roman " w:hAnsi="times new roman "/>
+          <w:b w:val="false"/>
+          <w:i w:val="false"/>
+          <w:caps w:val="false"/>
+          <w:smallCaps w:val="false"/>
+          <w:strike w:val="false"/>
+          <w:dstrike w:val="false"/>
+          <w:color w:val="000000"/>
+          <w:sz w:val="24"/>
+          <w:u w:val="none"/>
+          <w:effect w:val="none"/>
+          <w:shd w:fill="auto" w:val="clear"/>
+        </w:rPr>
+      </w:pPr>
+      <w:r>
+        <w:rPr>
+          <w:rFonts w:ascii="times new roman " w:hAnsi="times new roman "/>
+          <w:b w:val="false"/>
+          <w:i w:val="false"/>
+          <w:caps w:val="false"/>
+          <w:smallCaps w:val="false"/>
+          <w:strike w:val="false"/>
+          <w:dstrike w:val="false"/>
+          <w:color w:val="000000"/>
+          <w:sz w:val="24"/>
+          <w:u w:val="none"/>
+          <w:effect w:val="none"/>
+          <w:shd w:fill="auto" w:val="clear"/>
+        </w:rPr>
+        <w:t>Se da por sentado que el personal de campo y los operadores en planta ingresarán los datos operativos de forma oportuna durante sus respectivas jornadas.</w:t>
+      </w:r>
+    </w:p>
+    <w:p>
+      <w:pPr>
+        <w:pStyle w:val="BodyText"/>
+        <w:numPr>
+          <w:ilvl w:val="0"/>
+          <w:numId w:val="3"/>
+        </w:numPr>
+        <w:pBdr/>
+        <w:tabs>
+          <w:tab w:val="clear" w:pos="708"/>
+          <w:tab w:val="left" w:pos="0" w:leader="none"/>
+        </w:tabs>
+        <w:bidi w:val="0"/>
+        <w:spacing w:lineRule="auto" w:line="331" w:before="0" w:after="0"/>
+        <w:ind w:hanging="283" w:start="709" w:end="0"/>
+        <w:rPr>
+          <w:rFonts w:ascii="times new roman " w:hAnsi="times new roman "/>
+          <w:b w:val="false"/>
+          <w:i w:val="false"/>
+          <w:caps w:val="false"/>
+          <w:smallCaps w:val="false"/>
+          <w:strike w:val="false"/>
+          <w:dstrike w:val="false"/>
+          <w:color w:val="000000"/>
+          <w:sz w:val="24"/>
+          <w:u w:val="none"/>
+          <w:effect w:val="none"/>
+          <w:shd w:fill="auto" w:val="clear"/>
+        </w:rPr>
+      </w:pPr>
+      <w:r>
+        <w:rPr>
+          <w:rFonts w:ascii="times new roman " w:hAnsi="times new roman "/>
+          <w:b w:val="false"/>
+          <w:i w:val="false"/>
+          <w:caps w:val="false"/>
+          <w:smallCaps w:val="false"/>
+          <w:strike w:val="false"/>
+          <w:dstrike w:val="false"/>
+          <w:color w:val="000000"/>
+          <w:sz w:val="24"/>
+          <w:u w:val="none"/>
+          <w:effect w:val="none"/>
+          <w:shd w:fill="auto" w:val="clear"/>
+        </w:rPr>
+        <w:t>Se presupone que cada actor del sistema contará con las credenciales de acceso correspondientes y alineadas a sus funciones asignadas.</w:t>
+      </w:r>
+    </w:p>
+    <w:p>
+      <w:pPr>
+        <w:pStyle w:val="BodyText"/>
+        <w:numPr>
+          <w:ilvl w:val="0"/>
+          <w:numId w:val="3"/>
+        </w:numPr>
+        <w:pBdr/>
+        <w:tabs>
+          <w:tab w:val="clear" w:pos="708"/>
+          <w:tab w:val="left" w:pos="0" w:leader="none"/>
+        </w:tabs>
+        <w:bidi w:val="0"/>
+        <w:spacing w:lineRule="auto" w:line="331" w:before="0" w:after="0"/>
+        <w:ind w:hanging="283" w:start="709" w:end="0"/>
+        <w:rPr>
+          <w:rFonts w:ascii="times new roman " w:hAnsi="times new roman "/>
+          <w:b w:val="false"/>
+          <w:i w:val="false"/>
+          <w:caps w:val="false"/>
+          <w:smallCaps w:val="false"/>
+          <w:strike w:val="false"/>
+          <w:dstrike w:val="false"/>
+          <w:color w:val="000000"/>
+          <w:sz w:val="24"/>
+          <w:u w:val="none"/>
+          <w:effect w:val="none"/>
+          <w:shd w:fill="auto" w:val="clear"/>
+        </w:rPr>
+      </w:pPr>
+      <w:r>
+        <w:rPr>
+          <w:rFonts w:ascii="times new roman " w:hAnsi="times new roman "/>
+          <w:b w:val="false"/>
+          <w:i w:val="false"/>
+          <w:caps w:val="false"/>
+          <w:smallCaps w:val="false"/>
+          <w:strike w:val="false"/>
+          <w:dstrike w:val="false"/>
+          <w:color w:val="000000"/>
+          <w:sz w:val="24"/>
+          <w:u w:val="none"/>
+          <w:effect w:val="none"/>
+          <w:shd w:fill="auto" w:val="clear"/>
+        </w:rPr>
+        <w:t>Se contempla que la organización proveerá la infraestructura tecnológica y el soporte de red adecuados para garantizar la alta disponibilidad de la plataforma.</w:t>
+      </w:r>
+    </w:p>
+    <w:p>
+      <w:pPr>
+        <w:pStyle w:val="BodyText"/>
+        <w:numPr>
+          <w:ilvl w:val="0"/>
+          <w:numId w:val="3"/>
+        </w:numPr>
+        <w:pBdr/>
+        <w:tabs>
+          <w:tab w:val="clear" w:pos="708"/>
+          <w:tab w:val="left" w:pos="0" w:leader="none"/>
+        </w:tabs>
+        <w:bidi w:val="0"/>
+        <w:spacing w:lineRule="auto" w:line="331" w:before="0" w:after="240"/>
+        <w:ind w:hanging="283" w:start="709" w:end="0"/>
+        <w:rPr>
+          <w:rFonts w:ascii="times new roman " w:hAnsi="times new roman "/>
+          <w:b w:val="false"/>
+          <w:i w:val="false"/>
+          <w:caps w:val="false"/>
+          <w:smallCaps w:val="false"/>
+          <w:strike w:val="false"/>
+          <w:dstrike w:val="false"/>
+          <w:color w:val="000000"/>
+          <w:sz w:val="24"/>
+          <w:u w:val="none"/>
+          <w:effect w:val="none"/>
+          <w:shd w:fill="auto" w:val="clear"/>
+        </w:rPr>
+      </w:pPr>
+      <w:r>
+        <w:rPr>
+          <w:rFonts w:ascii="times new roman " w:hAnsi="times new roman "/>
+          <w:b w:val="false"/>
+          <w:i w:val="false"/>
+          <w:caps w:val="false"/>
+          <w:smallCaps w:val="false"/>
+          <w:strike w:val="false"/>
+          <w:dstrike w:val="false"/>
+          <w:color w:val="000000"/>
+          <w:sz w:val="24"/>
+          <w:u w:val="none"/>
+          <w:effect w:val="none"/>
+          <w:shd w:fill="auto" w:val="clear"/>
+        </w:rPr>
+        <w:t>Se considera que todo el personal involucrado en la operación habrá completado las sesiones de capacitación previas al uso de la herramienta.</w:t>
+      </w:r>
+    </w:p>
+    <w:p>
+      <w:pPr>
+        <w:pStyle w:val="BodyText"/>
+        <w:bidi w:val="0"/>
+        <w:spacing w:lineRule="auto" w:line="331" w:before="240" w:after="240"/>
+        <w:ind w:hanging="0" w:start="0" w:end="0"/>
+        <w:rPr>
+          <w:rFonts w:ascii="times new roman " w:hAnsi="times new roman "/>
+          <w:b w:val="false"/>
+          <w:i w:val="false"/>
+          <w:caps w:val="false"/>
+          <w:smallCaps w:val="false"/>
+          <w:strike w:val="false"/>
+          <w:dstrike w:val="false"/>
+          <w:color w:val="000000"/>
+          <w:sz w:val="24"/>
+          <w:u w:val="none"/>
+          <w:effect w:val="none"/>
+          <w:shd w:fill="auto" w:val="clear"/>
+        </w:rPr>
+      </w:pPr>
+      <w:r>
+        <w:rPr>
+          <w:rFonts w:ascii="times new roman " w:hAnsi="times new roman "/>
+          <w:b w:val="false"/>
+          <w:i w:val="false"/>
+          <w:caps w:val="false"/>
+          <w:smallCaps w:val="false"/>
+          <w:strike w:val="false"/>
+          <w:dstrike w:val="false"/>
+          <w:color w:val="000000"/>
+          <w:sz w:val="24"/>
+          <w:u w:val="none"/>
+          <w:effect w:val="none"/>
+          <w:shd w:fill="auto" w:val="clear"/>
+        </w:rPr>
+      </w:r>
+    </w:p>
+    <w:p>
+      <w:pPr>
         <w:pStyle w:val="BodyText"/>
         <w:numPr>
           <w:ilvl w:val="0"/>
@@ -2484,6 +3130,280 @@
   <w:abstractNum w:abstractNumId="2">
     <w:lvl w:ilvl="0">
       <w:start w:val="1"/>
+      <w:numFmt w:val="bullet"/>
+      <w:lvlText w:val=""/>
+      <w:lvlJc w:val="start"/>
+      <w:pPr>
+        <w:tabs>
+          <w:tab w:val="num" w:pos="709"/>
+        </w:tabs>
+        <w:ind w:start="709" w:hanging="283"/>
+      </w:pPr>
+      <w:rPr>
+        <w:rFonts w:ascii="Symbol" w:hAnsi="Symbol" w:cs="Symbol" w:hint="default"/>
+      </w:rPr>
+    </w:lvl>
+    <w:lvl w:ilvl="1">
+      <w:start w:val="1"/>
+      <w:numFmt w:val="bullet"/>
+      <w:lvlText w:val=""/>
+      <w:lvlJc w:val="start"/>
+      <w:pPr>
+        <w:tabs>
+          <w:tab w:val="num" w:pos="1418"/>
+        </w:tabs>
+        <w:ind w:start="1418" w:hanging="283"/>
+      </w:pPr>
+      <w:rPr>
+        <w:rFonts w:ascii="Symbol" w:hAnsi="Symbol" w:cs="Symbol" w:hint="default"/>
+      </w:rPr>
+    </w:lvl>
+    <w:lvl w:ilvl="2">
+      <w:start w:val="1"/>
+      <w:numFmt w:val="bullet"/>
+      <w:lvlText w:val=""/>
+      <w:lvlJc w:val="start"/>
+      <w:pPr>
+        <w:tabs>
+          <w:tab w:val="num" w:pos="2127"/>
+        </w:tabs>
+        <w:ind w:start="2127" w:hanging="283"/>
+      </w:pPr>
+      <w:rPr>
+        <w:rFonts w:ascii="Symbol" w:hAnsi="Symbol" w:cs="Symbol" w:hint="default"/>
+      </w:rPr>
+    </w:lvl>
+    <w:lvl w:ilvl="3">
+      <w:start w:val="1"/>
+      <w:numFmt w:val="bullet"/>
+      <w:lvlText w:val=""/>
+      <w:lvlJc w:val="start"/>
+      <w:pPr>
+        <w:tabs>
+          <w:tab w:val="num" w:pos="2836"/>
+        </w:tabs>
+        <w:ind w:start="2836" w:hanging="283"/>
+      </w:pPr>
+      <w:rPr>
+        <w:rFonts w:ascii="Symbol" w:hAnsi="Symbol" w:cs="Symbol" w:hint="default"/>
+      </w:rPr>
+    </w:lvl>
+    <w:lvl w:ilvl="4">
+      <w:start w:val="1"/>
+      <w:numFmt w:val="bullet"/>
+      <w:lvlText w:val=""/>
+      <w:lvlJc w:val="start"/>
+      <w:pPr>
+        <w:tabs>
+          <w:tab w:val="num" w:pos="3545"/>
+        </w:tabs>
+        <w:ind w:start="3545" w:hanging="283"/>
+      </w:pPr>
+      <w:rPr>
+        <w:rFonts w:ascii="Symbol" w:hAnsi="Symbol" w:cs="Symbol" w:hint="default"/>
+      </w:rPr>
+    </w:lvl>
+    <w:lvl w:ilvl="5">
+      <w:start w:val="1"/>
+      <w:numFmt w:val="bullet"/>
+      <w:lvlText w:val=""/>
+      <w:lvlJc w:val="start"/>
+      <w:pPr>
+        <w:tabs>
+          <w:tab w:val="num" w:pos="4254"/>
+        </w:tabs>
+        <w:ind w:start="4254" w:hanging="283"/>
+      </w:pPr>
+      <w:rPr>
+        <w:rFonts w:ascii="Symbol" w:hAnsi="Symbol" w:cs="Symbol" w:hint="default"/>
+      </w:rPr>
+    </w:lvl>
+    <w:lvl w:ilvl="6">
+      <w:start w:val="1"/>
+      <w:numFmt w:val="bullet"/>
+      <w:lvlText w:val=""/>
+      <w:lvlJc w:val="start"/>
+      <w:pPr>
+        <w:tabs>
+          <w:tab w:val="num" w:pos="4963"/>
+        </w:tabs>
+        <w:ind w:start="4963" w:hanging="283"/>
+      </w:pPr>
+      <w:rPr>
+        <w:rFonts w:ascii="Symbol" w:hAnsi="Symbol" w:cs="Symbol" w:hint="default"/>
+      </w:rPr>
+    </w:lvl>
+    <w:lvl w:ilvl="7">
+      <w:start w:val="1"/>
+      <w:numFmt w:val="bullet"/>
+      <w:lvlText w:val=""/>
+      <w:lvlJc w:val="start"/>
+      <w:pPr>
+        <w:tabs>
+          <w:tab w:val="num" w:pos="5672"/>
+        </w:tabs>
+        <w:ind w:start="5672" w:hanging="283"/>
+      </w:pPr>
+      <w:rPr>
+        <w:rFonts w:ascii="Symbol" w:hAnsi="Symbol" w:cs="Symbol" w:hint="default"/>
+      </w:rPr>
+    </w:lvl>
+    <w:lvl w:ilvl="8">
+      <w:start w:val="1"/>
+      <w:numFmt w:val="bullet"/>
+      <w:lvlText w:val=""/>
+      <w:lvlJc w:val="start"/>
+      <w:pPr>
+        <w:tabs>
+          <w:tab w:val="num" w:pos="6381"/>
+        </w:tabs>
+        <w:ind w:start="6381" w:hanging="283"/>
+      </w:pPr>
+      <w:rPr>
+        <w:rFonts w:ascii="Symbol" w:hAnsi="Symbol" w:cs="Symbol" w:hint="default"/>
+      </w:rPr>
+    </w:lvl>
+  </w:abstractNum>
+  <w:abstractNum w:abstractNumId="3">
+    <w:lvl w:ilvl="0">
+      <w:start w:val="1"/>
+      <w:numFmt w:val="bullet"/>
+      <w:lvlText w:val=""/>
+      <w:lvlJc w:val="start"/>
+      <w:pPr>
+        <w:tabs>
+          <w:tab w:val="num" w:pos="709"/>
+        </w:tabs>
+        <w:ind w:start="709" w:hanging="283"/>
+      </w:pPr>
+      <w:rPr>
+        <w:rFonts w:ascii="Symbol" w:hAnsi="Symbol" w:cs="Symbol" w:hint="default"/>
+      </w:rPr>
+    </w:lvl>
+    <w:lvl w:ilvl="1">
+      <w:start w:val="1"/>
+      <w:numFmt w:val="bullet"/>
+      <w:lvlText w:val=""/>
+      <w:lvlJc w:val="start"/>
+      <w:pPr>
+        <w:tabs>
+          <w:tab w:val="num" w:pos="1418"/>
+        </w:tabs>
+        <w:ind w:start="1418" w:hanging="283"/>
+      </w:pPr>
+      <w:rPr>
+        <w:rFonts w:ascii="Symbol" w:hAnsi="Symbol" w:cs="Symbol" w:hint="default"/>
+      </w:rPr>
+    </w:lvl>
+    <w:lvl w:ilvl="2">
+      <w:start w:val="1"/>
+      <w:numFmt w:val="bullet"/>
+      <w:lvlText w:val=""/>
+      <w:lvlJc w:val="start"/>
+      <w:pPr>
+        <w:tabs>
+          <w:tab w:val="num" w:pos="2127"/>
+        </w:tabs>
+        <w:ind w:start="2127" w:hanging="283"/>
+      </w:pPr>
+      <w:rPr>
+        <w:rFonts w:ascii="Symbol" w:hAnsi="Symbol" w:cs="Symbol" w:hint="default"/>
+      </w:rPr>
+    </w:lvl>
+    <w:lvl w:ilvl="3">
+      <w:start w:val="1"/>
+      <w:numFmt w:val="bullet"/>
+      <w:lvlText w:val=""/>
+      <w:lvlJc w:val="start"/>
+      <w:pPr>
+        <w:tabs>
+          <w:tab w:val="num" w:pos="2836"/>
+        </w:tabs>
+        <w:ind w:start="2836" w:hanging="283"/>
+      </w:pPr>
+      <w:rPr>
+        <w:rFonts w:ascii="Symbol" w:hAnsi="Symbol" w:cs="Symbol" w:hint="default"/>
+      </w:rPr>
+    </w:lvl>
+    <w:lvl w:ilvl="4">
+      <w:start w:val="1"/>
+      <w:numFmt w:val="bullet"/>
+      <w:lvlText w:val=""/>
+      <w:lvlJc w:val="start"/>
+      <w:pPr>
+        <w:tabs>
+          <w:tab w:val="num" w:pos="3545"/>
+        </w:tabs>
+        <w:ind w:start="3545" w:hanging="283"/>
+      </w:pPr>
+      <w:rPr>
+        <w:rFonts w:ascii="Symbol" w:hAnsi="Symbol" w:cs="Symbol" w:hint="default"/>
+      </w:rPr>
+    </w:lvl>
+    <w:lvl w:ilvl="5">
+      <w:start w:val="1"/>
+      <w:numFmt w:val="bullet"/>
+      <w:lvlText w:val=""/>
+      <w:lvlJc w:val="start"/>
+      <w:pPr>
+        <w:tabs>
+          <w:tab w:val="num" w:pos="4254"/>
+        </w:tabs>
+        <w:ind w:start="4254" w:hanging="283"/>
+      </w:pPr>
+      <w:rPr>
+        <w:rFonts w:ascii="Symbol" w:hAnsi="Symbol" w:cs="Symbol" w:hint="default"/>
+      </w:rPr>
+    </w:lvl>
+    <w:lvl w:ilvl="6">
+      <w:start w:val="1"/>
+      <w:numFmt w:val="bullet"/>
+      <w:lvlText w:val=""/>
+      <w:lvlJc w:val="start"/>
+      <w:pPr>
+        <w:tabs>
+          <w:tab w:val="num" w:pos="4963"/>
+        </w:tabs>
+        <w:ind w:start="4963" w:hanging="283"/>
+      </w:pPr>
+      <w:rPr>
+        <w:rFonts w:ascii="Symbol" w:hAnsi="Symbol" w:cs="Symbol" w:hint="default"/>
+      </w:rPr>
+    </w:lvl>
+    <w:lvl w:ilvl="7">
+      <w:start w:val="1"/>
+      <w:numFmt w:val="bullet"/>
+      <w:lvlText w:val=""/>
+      <w:lvlJc w:val="start"/>
+      <w:pPr>
+        <w:tabs>
+          <w:tab w:val="num" w:pos="5672"/>
+        </w:tabs>
+        <w:ind w:start="5672" w:hanging="283"/>
+      </w:pPr>
+      <w:rPr>
+        <w:rFonts w:ascii="Symbol" w:hAnsi="Symbol" w:cs="Symbol" w:hint="default"/>
+      </w:rPr>
+    </w:lvl>
+    <w:lvl w:ilvl="8">
+      <w:start w:val="1"/>
+      <w:numFmt w:val="bullet"/>
+      <w:lvlText w:val=""/>
+      <w:lvlJc w:val="start"/>
+      <w:pPr>
+        <w:tabs>
+          <w:tab w:val="num" w:pos="6381"/>
+        </w:tabs>
+        <w:ind w:start="6381" w:hanging="283"/>
+      </w:pPr>
+      <w:rPr>
+        <w:rFonts w:ascii="Symbol" w:hAnsi="Symbol" w:cs="Symbol" w:hint="default"/>
+      </w:rPr>
+    </w:lvl>
+  </w:abstractNum>
+  <w:abstractNum w:abstractNumId="4">
+    <w:lvl w:ilvl="0">
+      <w:start w:val="1"/>
       <w:numFmt w:val="none"/>
       <w:suff w:val="nothing"/>
       <w:lvlText w:val=""/>
@@ -2605,6 +3525,12 @@
   </w:num>
   <w:num w:numId="2">
     <w:abstractNumId w:val="2"/>
+  </w:num>
+  <w:num w:numId="3">
+    <w:abstractNumId w:val="3"/>
+  </w:num>
+  <w:num w:numId="4">
+    <w:abstractNumId w:val="4"/>
   </w:num>
 </w:numbering>
 </file>

</xml_diff>

<commit_message>
Incorporando Requisitos funcionales y No funcionales
</commit_message>
<xml_diff>
--- a/Caso 5.docx
+++ b/Caso 5.docx
@@ -7,6 +7,8 @@
         <w:pStyle w:val="Normal"/>
         <w:rPr>
           <w:rFonts w:ascii="times new roman " w:hAnsi="times new roman "/>
+          <w:sz w:val="24"/>
+          <w:szCs w:val="24"/>
         </w:rPr>
       </w:pPr>
       <w:r>
@@ -14,6 +16,8 @@
           <w:rFonts w:ascii="times new roman " w:hAnsi="times new roman "/>
           <w:b/>
           <w:bCs/>
+          <w:sz w:val="24"/>
+          <w:szCs w:val="24"/>
         </w:rPr>
         <w:t>Caso 5: Plataforma Integral de Trazabilidad y Gestión de Residuos Orgánicos para Compostaje</w:t>
       </w:r>
@@ -23,6 +27,8 @@
         <w:pStyle w:val="Normal"/>
         <w:rPr>
           <w:rFonts w:ascii="times new roman " w:hAnsi="times new roman "/>
+          <w:sz w:val="24"/>
+          <w:szCs w:val="24"/>
         </w:rPr>
       </w:pPr>
       <w:r>
@@ -30,6 +36,8 @@
           <w:rFonts w:ascii="times new roman " w:hAnsi="times new roman "/>
           <w:b/>
           <w:bCs/>
+          <w:sz w:val="24"/>
+          <w:szCs w:val="24"/>
         </w:rPr>
         <w:t>1. Análisis del Problema</w:t>
       </w:r>
@@ -39,6 +47,8 @@
         <w:pStyle w:val="Normal"/>
         <w:rPr>
           <w:rFonts w:ascii="times new roman " w:hAnsi="times new roman "/>
+          <w:sz w:val="24"/>
+          <w:szCs w:val="24"/>
         </w:rPr>
       </w:pPr>
       <w:r>
@@ -46,6 +56,8 @@
           <w:rFonts w:ascii="times new roman " w:hAnsi="times new roman "/>
           <w:b/>
           <w:bCs/>
+          <w:sz w:val="24"/>
+          <w:szCs w:val="24"/>
         </w:rPr>
         <w:t>1.1 Descripción del problema </w:t>
       </w:r>
@@ -55,11 +67,15 @@
         <w:pStyle w:val="Normal"/>
         <w:rPr>
           <w:rFonts w:ascii="times new roman " w:hAnsi="times new roman "/>
+          <w:sz w:val="24"/>
+          <w:szCs w:val="24"/>
         </w:rPr>
       </w:pPr>
       <w:r>
         <w:rPr>
           <w:rFonts w:ascii="times new roman " w:hAnsi="times new roman "/>
+          <w:sz w:val="24"/>
+          <w:szCs w:val="24"/>
         </w:rPr>
         <w:t>BioCircular S.A. opera en la ciudad de Quito gestionando residuos orgánicos de viviendas y locales comerciales. Gracias al aumento de clientes en estos últimos años la demanda se disparó; sin embargo, este crecimiento trajo un problema evidente: la logística diaria de recolección y compostaje se volvió demasiado compleja.</w:t>
       </w:r>
@@ -69,11 +85,15 @@
         <w:pStyle w:val="Normal"/>
         <w:rPr>
           <w:rFonts w:ascii="times new roman " w:hAnsi="times new roman "/>
+          <w:sz w:val="24"/>
+          <w:szCs w:val="24"/>
         </w:rPr>
       </w:pPr>
       <w:r>
         <w:rPr>
           <w:rFonts w:ascii="times new roman " w:hAnsi="times new roman "/>
+          <w:sz w:val="24"/>
+          <w:szCs w:val="24"/>
         </w:rPr>
         <w:t>El principal obstáculo que tienen es trabajar a ciegas, sin un sistema central. Hoy por hoy, la base de usuarios, la planificación de rutas, los pesajes y el control del abono andan totalmente dispersos. Lo que provoca un seguimiento ineficiente y la falta de datos reales para tomar buenas decisiones.</w:t>
       </w:r>
@@ -83,11 +103,15 @@
         <w:pStyle w:val="Normal"/>
         <w:rPr>
           <w:rFonts w:ascii="times new roman " w:hAnsi="times new roman "/>
+          <w:sz w:val="24"/>
+          <w:szCs w:val="24"/>
         </w:rPr>
       </w:pPr>
       <w:r>
         <w:rPr>
           <w:rFonts w:ascii="times new roman " w:hAnsi="times new roman "/>
+          <w:sz w:val="24"/>
+          <w:szCs w:val="24"/>
         </w:rPr>
         <w:t>A esto hay que sumarle la pérdida de trazabilidad. Apenas los camiones recogen el material, prácticamente se pierde el rastro de la basura. Es muy difícil saber cómo ese desecho específico llega a transformarse en compost, y ni hablar de intentar calcular el volumen exacto que entregó cada persona o el impacto ambiental que están logrando.</w:t>
       </w:r>
@@ -97,11 +121,15 @@
         <w:pStyle w:val="Normal"/>
         <w:rPr>
           <w:rFonts w:ascii="times new roman " w:hAnsi="times new roman "/>
+          <w:sz w:val="24"/>
+          <w:szCs w:val="24"/>
         </w:rPr>
       </w:pPr>
       <w:r>
         <w:rPr>
           <w:rFonts w:ascii="times new roman " w:hAnsi="times new roman "/>
+          <w:sz w:val="24"/>
+          <w:szCs w:val="24"/>
         </w:rPr>
         <w:t>Planificar los recorridos también resulta ser un reto pesado. Las frecuencias de recolección cambian bastante dependiendo del usuario. Y por si fuera poco, muchas veces los residuos llegan mal clasificados desde el origen, lo que frena todo el tratamiento y termina golpeando la calidad del compost.</w:t>
       </w:r>
@@ -111,11 +139,15 @@
         <w:pStyle w:val="Normal"/>
         <w:rPr>
           <w:rFonts w:ascii="times new roman " w:hAnsi="times new roman "/>
+          <w:sz w:val="24"/>
+          <w:szCs w:val="24"/>
         </w:rPr>
       </w:pPr>
       <w:r>
         <w:rPr>
           <w:rFonts w:ascii="times new roman " w:hAnsi="times new roman "/>
+          <w:sz w:val="24"/>
+          <w:szCs w:val="24"/>
         </w:rPr>
         <w:t>Para salir de este cuello de botella, a BioCircular le urge implementar una plataforma tecnológica. El objetivo es simple: organizar la información de los clientes, cuadrar bien las rutas, llevar una bitácora de cada etapa del compostaje y arrojar indicadores ambientales claros. Con una herramienta así, la empresa al fin tomará el control de su operación y le demostrará a cada usuario su verdadero aporte a la economía circular.</w:t>
       </w:r>
@@ -135,7 +167,8 @@
           <w:strike w:val="false"/>
           <w:dstrike w:val="false"/>
           <w:color w:val="000000"/>
-          <w:sz w:val="22"/>
+          <w:sz w:val="24"/>
+          <w:szCs w:val="24"/>
           <w:u w:val="none"/>
           <w:effect w:val="none"/>
           <w:shd w:fill="auto" w:val="clear"/>
@@ -153,7 +186,8 @@
           <w:strike w:val="false"/>
           <w:dstrike w:val="false"/>
           <w:color w:val="000000"/>
-          <w:sz w:val="22"/>
+          <w:sz w:val="24"/>
+          <w:szCs w:val="24"/>
           <w:u w:val="none"/>
           <w:effect w:val="none"/>
           <w:shd w:fill="auto" w:val="clear"/>
@@ -167,11 +201,15 @@
         <w:spacing w:lineRule="auto" w:line="259" w:before="0" w:after="160"/>
         <w:rPr>
           <w:rFonts w:ascii="times new roman " w:hAnsi="times new roman "/>
+          <w:sz w:val="24"/>
+          <w:szCs w:val="24"/>
         </w:rPr>
       </w:pPr>
       <w:r>
         <w:rPr>
           <w:rFonts w:ascii="times new roman " w:hAnsi="times new roman "/>
+          <w:sz w:val="24"/>
+          <w:szCs w:val="24"/>
         </w:rPr>
       </w:r>
     </w:p>
@@ -190,7 +228,8 @@
           <w:strike w:val="false"/>
           <w:dstrike w:val="false"/>
           <w:color w:val="000000"/>
-          <w:sz w:val="22"/>
+          <w:sz w:val="24"/>
+          <w:szCs w:val="24"/>
           <w:u w:val="none"/>
           <w:effect w:val="none"/>
           <w:shd w:fill="auto" w:val="clear"/>
@@ -206,7 +245,8 @@
           <w:strike w:val="false"/>
           <w:dstrike w:val="false"/>
           <w:color w:val="000000"/>
-          <w:sz w:val="22"/>
+          <w:sz w:val="24"/>
+          <w:szCs w:val="24"/>
           <w:u w:val="none"/>
           <w:effect w:val="none"/>
           <w:shd w:fill="auto" w:val="clear"/>
@@ -220,11 +260,15 @@
         <w:spacing w:lineRule="auto" w:line="259" w:before="0" w:after="160"/>
         <w:rPr>
           <w:rFonts w:ascii="times new roman " w:hAnsi="times new roman "/>
+          <w:sz w:val="24"/>
+          <w:szCs w:val="24"/>
         </w:rPr>
       </w:pPr>
       <w:r>
         <w:rPr>
           <w:rFonts w:ascii="times new roman " w:hAnsi="times new roman "/>
+          <w:sz w:val="24"/>
+          <w:szCs w:val="24"/>
         </w:rPr>
       </w:r>
     </w:p>
@@ -244,6 +288,7 @@
           <w:dstrike w:val="false"/>
           <w:color w:val="000000"/>
           <w:sz w:val="24"/>
+          <w:szCs w:val="24"/>
           <w:u w:val="none"/>
           <w:effect w:val="none"/>
           <w:shd w:fill="auto" w:val="clear"/>
@@ -260,6 +305,7 @@
           <w:dstrike w:val="false"/>
           <w:color w:val="000000"/>
           <w:sz w:val="24"/>
+          <w:szCs w:val="24"/>
           <w:u w:val="none"/>
           <w:effect w:val="none"/>
           <w:shd w:fill="auto" w:val="clear"/>
@@ -292,6 +338,7 @@
           <w:dstrike w:val="false"/>
           <w:color w:val="000000"/>
           <w:sz w:val="24"/>
+          <w:szCs w:val="24"/>
           <w:u w:val="none"/>
           <w:effect w:val="none"/>
           <w:shd w:fill="auto" w:val="clear"/>
@@ -308,6 +355,7 @@
           <w:dstrike w:val="false"/>
           <w:color w:val="000000"/>
           <w:sz w:val="24"/>
+          <w:szCs w:val="24"/>
           <w:u w:val="none"/>
           <w:effect w:val="none"/>
           <w:shd w:fill="auto" w:val="clear"/>
@@ -340,6 +388,7 @@
           <w:dstrike w:val="false"/>
           <w:color w:val="000000"/>
           <w:sz w:val="24"/>
+          <w:szCs w:val="24"/>
           <w:u w:val="none"/>
           <w:effect w:val="none"/>
           <w:shd w:fill="auto" w:val="clear"/>
@@ -356,6 +405,7 @@
           <w:dstrike w:val="false"/>
           <w:color w:val="000000"/>
           <w:sz w:val="24"/>
+          <w:szCs w:val="24"/>
           <w:u w:val="none"/>
           <w:effect w:val="none"/>
           <w:shd w:fill="auto" w:val="clear"/>
@@ -388,6 +438,7 @@
           <w:dstrike w:val="false"/>
           <w:color w:val="000000"/>
           <w:sz w:val="24"/>
+          <w:szCs w:val="24"/>
           <w:u w:val="none"/>
           <w:effect w:val="none"/>
           <w:shd w:fill="auto" w:val="clear"/>
@@ -404,6 +455,7 @@
           <w:dstrike w:val="false"/>
           <w:color w:val="000000"/>
           <w:sz w:val="24"/>
+          <w:szCs w:val="24"/>
           <w:u w:val="none"/>
           <w:effect w:val="none"/>
           <w:shd w:fill="auto" w:val="clear"/>
@@ -436,6 +488,7 @@
           <w:dstrike w:val="false"/>
           <w:color w:val="000000"/>
           <w:sz w:val="24"/>
+          <w:szCs w:val="24"/>
           <w:u w:val="none"/>
           <w:effect w:val="none"/>
           <w:shd w:fill="auto" w:val="clear"/>
@@ -452,6 +505,7 @@
           <w:dstrike w:val="false"/>
           <w:color w:val="000000"/>
           <w:sz w:val="24"/>
+          <w:szCs w:val="24"/>
           <w:u w:val="none"/>
           <w:effect w:val="none"/>
           <w:shd w:fill="auto" w:val="clear"/>
@@ -484,6 +538,7 @@
           <w:dstrike w:val="false"/>
           <w:color w:val="000000"/>
           <w:sz w:val="24"/>
+          <w:szCs w:val="24"/>
           <w:u w:val="none"/>
           <w:effect w:val="none"/>
           <w:shd w:fill="auto" w:val="clear"/>
@@ -500,6 +555,7 @@
           <w:dstrike w:val="false"/>
           <w:color w:val="000000"/>
           <w:sz w:val="24"/>
+          <w:szCs w:val="24"/>
           <w:u w:val="none"/>
           <w:effect w:val="none"/>
           <w:shd w:fill="auto" w:val="clear"/>
@@ -532,6 +588,7 @@
           <w:dstrike w:val="false"/>
           <w:color w:val="000000"/>
           <w:sz w:val="24"/>
+          <w:szCs w:val="24"/>
           <w:u w:val="none"/>
           <w:effect w:val="none"/>
           <w:shd w:fill="auto" w:val="clear"/>
@@ -548,6 +605,7 @@
           <w:dstrike w:val="false"/>
           <w:color w:val="000000"/>
           <w:sz w:val="24"/>
+          <w:szCs w:val="24"/>
           <w:u w:val="none"/>
           <w:effect w:val="none"/>
           <w:shd w:fill="auto" w:val="clear"/>
@@ -576,6 +634,7 @@
           <w:dstrike w:val="false"/>
           <w:color w:val="000000"/>
           <w:sz w:val="24"/>
+          <w:szCs w:val="24"/>
           <w:u w:val="none"/>
           <w:effect w:val="none"/>
           <w:shd w:fill="auto" w:val="clear"/>
@@ -594,6 +653,7 @@
           <w:dstrike w:val="false"/>
           <w:color w:val="000000"/>
           <w:sz w:val="24"/>
+          <w:szCs w:val="24"/>
           <w:u w:val="none"/>
           <w:effect w:val="none"/>
           <w:shd w:fill="auto" w:val="clear"/>
@@ -609,6 +669,7 @@
           <w:rFonts w:ascii="times new roman " w:hAnsi="times new roman "/>
           <w:color w:val="000000"/>
           <w:sz w:val="24"/>
+          <w:szCs w:val="24"/>
         </w:rPr>
       </w:pPr>
       <w:r>
@@ -616,6 +677,7 @@
           <w:rFonts w:ascii="times new roman " w:hAnsi="times new roman "/>
           <w:color w:val="000000"/>
           <w:sz w:val="24"/>
+          <w:szCs w:val="24"/>
         </w:rPr>
       </w:r>
     </w:p>
@@ -667,6 +729,7 @@
                 <w:dstrike w:val="false"/>
                 <w:color w:val="000000"/>
                 <w:sz w:val="24"/>
+                <w:szCs w:val="24"/>
                 <w:u w:val="none"/>
                 <w:effect w:val="none"/>
                 <w:shd w:fill="auto" w:val="clear"/>
@@ -683,6 +746,7 @@
                 <w:dstrike w:val="false"/>
                 <w:color w:val="000000"/>
                 <w:sz w:val="24"/>
+                <w:szCs w:val="24"/>
                 <w:u w:val="none"/>
                 <w:effect w:val="none"/>
                 <w:shd w:fill="auto" w:val="clear"/>
@@ -719,6 +783,7 @@
                 <w:dstrike w:val="false"/>
                 <w:color w:val="000000"/>
                 <w:sz w:val="24"/>
+                <w:szCs w:val="24"/>
                 <w:u w:val="none"/>
                 <w:effect w:val="none"/>
                 <w:shd w:fill="auto" w:val="clear"/>
@@ -735,6 +800,7 @@
                 <w:dstrike w:val="false"/>
                 <w:color w:val="000000"/>
                 <w:sz w:val="24"/>
+                <w:szCs w:val="24"/>
                 <w:u w:val="none"/>
                 <w:effect w:val="none"/>
                 <w:shd w:fill="auto" w:val="clear"/>
@@ -771,6 +837,7 @@
                 <w:dstrike w:val="false"/>
                 <w:color w:val="000000"/>
                 <w:sz w:val="24"/>
+                <w:szCs w:val="24"/>
                 <w:u w:val="none"/>
                 <w:effect w:val="none"/>
                 <w:shd w:fill="auto" w:val="clear"/>
@@ -787,6 +854,7 @@
                 <w:dstrike w:val="false"/>
                 <w:color w:val="000000"/>
                 <w:sz w:val="24"/>
+                <w:szCs w:val="24"/>
                 <w:u w:val="none"/>
                 <w:effect w:val="none"/>
                 <w:shd w:fill="auto" w:val="clear"/>
@@ -826,6 +894,7 @@
                 <w:dstrike w:val="false"/>
                 <w:color w:val="000000"/>
                 <w:sz w:val="24"/>
+                <w:szCs w:val="24"/>
                 <w:u w:val="none"/>
                 <w:effect w:val="none"/>
                 <w:shd w:fill="auto" w:val="clear"/>
@@ -842,6 +911,7 @@
                 <w:dstrike w:val="false"/>
                 <w:color w:val="000000"/>
                 <w:sz w:val="24"/>
+                <w:szCs w:val="24"/>
                 <w:u w:val="none"/>
                 <w:effect w:val="none"/>
                 <w:shd w:fill="auto" w:val="clear"/>
@@ -879,6 +949,7 @@
                 <w:dstrike w:val="false"/>
                 <w:color w:val="000000"/>
                 <w:sz w:val="24"/>
+                <w:szCs w:val="24"/>
                 <w:u w:val="none"/>
                 <w:effect w:val="none"/>
                 <w:shd w:fill="auto" w:val="clear"/>
@@ -896,6 +967,7 @@
                 <w:dstrike w:val="false"/>
                 <w:color w:val="000000"/>
                 <w:sz w:val="24"/>
+                <w:szCs w:val="24"/>
                 <w:u w:val="none"/>
                 <w:effect w:val="none"/>
                 <w:shd w:fill="auto" w:val="clear"/>
@@ -933,6 +1005,7 @@
                 <w:dstrike w:val="false"/>
                 <w:color w:val="000000"/>
                 <w:sz w:val="24"/>
+                <w:szCs w:val="24"/>
                 <w:u w:val="none"/>
                 <w:effect w:val="none"/>
                 <w:shd w:fill="auto" w:val="clear"/>
@@ -950,6 +1023,7 @@
                 <w:dstrike w:val="false"/>
                 <w:color w:val="000000"/>
                 <w:sz w:val="24"/>
+                <w:szCs w:val="24"/>
                 <w:u w:val="none"/>
                 <w:effect w:val="none"/>
                 <w:shd w:fill="auto" w:val="clear"/>
@@ -989,6 +1063,7 @@
                 <w:dstrike w:val="false"/>
                 <w:color w:val="000000"/>
                 <w:sz w:val="24"/>
+                <w:szCs w:val="24"/>
                 <w:u w:val="none"/>
                 <w:effect w:val="none"/>
                 <w:shd w:fill="auto" w:val="clear"/>
@@ -1005,6 +1080,7 @@
                 <w:dstrike w:val="false"/>
                 <w:color w:val="000000"/>
                 <w:sz w:val="24"/>
+                <w:szCs w:val="24"/>
                 <w:u w:val="none"/>
                 <w:effect w:val="none"/>
                 <w:shd w:fill="auto" w:val="clear"/>
@@ -1042,6 +1118,7 @@
                 <w:dstrike w:val="false"/>
                 <w:color w:val="000000"/>
                 <w:sz w:val="24"/>
+                <w:szCs w:val="24"/>
                 <w:u w:val="none"/>
                 <w:effect w:val="none"/>
                 <w:shd w:fill="auto" w:val="clear"/>
@@ -1059,6 +1136,7 @@
                 <w:dstrike w:val="false"/>
                 <w:color w:val="000000"/>
                 <w:sz w:val="24"/>
+                <w:szCs w:val="24"/>
                 <w:u w:val="none"/>
                 <w:effect w:val="none"/>
                 <w:shd w:fill="auto" w:val="clear"/>
@@ -1096,6 +1174,7 @@
                 <w:dstrike w:val="false"/>
                 <w:color w:val="000000"/>
                 <w:sz w:val="24"/>
+                <w:szCs w:val="24"/>
                 <w:u w:val="none"/>
                 <w:effect w:val="none"/>
                 <w:shd w:fill="auto" w:val="clear"/>
@@ -1113,6 +1192,7 @@
                 <w:dstrike w:val="false"/>
                 <w:color w:val="000000"/>
                 <w:sz w:val="24"/>
+                <w:szCs w:val="24"/>
                 <w:u w:val="none"/>
                 <w:effect w:val="none"/>
                 <w:shd w:fill="auto" w:val="clear"/>
@@ -1152,6 +1232,7 @@
                 <w:dstrike w:val="false"/>
                 <w:color w:val="000000"/>
                 <w:sz w:val="24"/>
+                <w:szCs w:val="24"/>
                 <w:u w:val="none"/>
                 <w:effect w:val="none"/>
                 <w:shd w:fill="auto" w:val="clear"/>
@@ -1168,6 +1249,7 @@
                 <w:dstrike w:val="false"/>
                 <w:color w:val="000000"/>
                 <w:sz w:val="24"/>
+                <w:szCs w:val="24"/>
                 <w:u w:val="none"/>
                 <w:effect w:val="none"/>
                 <w:shd w:fill="auto" w:val="clear"/>
@@ -1205,6 +1287,7 @@
                 <w:dstrike w:val="false"/>
                 <w:color w:val="000000"/>
                 <w:sz w:val="24"/>
+                <w:szCs w:val="24"/>
                 <w:u w:val="none"/>
                 <w:effect w:val="none"/>
                 <w:shd w:fill="auto" w:val="clear"/>
@@ -1222,6 +1305,7 @@
                 <w:dstrike w:val="false"/>
                 <w:color w:val="000000"/>
                 <w:sz w:val="24"/>
+                <w:szCs w:val="24"/>
                 <w:u w:val="none"/>
                 <w:effect w:val="none"/>
                 <w:shd w:fill="auto" w:val="clear"/>
@@ -1259,6 +1343,7 @@
                 <w:dstrike w:val="false"/>
                 <w:color w:val="000000"/>
                 <w:sz w:val="24"/>
+                <w:szCs w:val="24"/>
                 <w:u w:val="none"/>
                 <w:effect w:val="none"/>
                 <w:shd w:fill="auto" w:val="clear"/>
@@ -1276,6 +1361,7 @@
                 <w:dstrike w:val="false"/>
                 <w:color w:val="000000"/>
                 <w:sz w:val="24"/>
+                <w:szCs w:val="24"/>
                 <w:u w:val="none"/>
                 <w:effect w:val="none"/>
                 <w:shd w:fill="auto" w:val="clear"/>
@@ -1315,6 +1401,7 @@
                 <w:dstrike w:val="false"/>
                 <w:color w:val="000000"/>
                 <w:sz w:val="24"/>
+                <w:szCs w:val="24"/>
                 <w:u w:val="none"/>
                 <w:effect w:val="none"/>
                 <w:shd w:fill="auto" w:val="clear"/>
@@ -1331,6 +1418,7 @@
                 <w:dstrike w:val="false"/>
                 <w:color w:val="000000"/>
                 <w:sz w:val="24"/>
+                <w:szCs w:val="24"/>
                 <w:u w:val="none"/>
                 <w:effect w:val="none"/>
                 <w:shd w:fill="auto" w:val="clear"/>
@@ -1368,6 +1456,7 @@
                 <w:dstrike w:val="false"/>
                 <w:color w:val="000000"/>
                 <w:sz w:val="24"/>
+                <w:szCs w:val="24"/>
                 <w:u w:val="none"/>
                 <w:effect w:val="none"/>
                 <w:shd w:fill="auto" w:val="clear"/>
@@ -1385,6 +1474,7 @@
                 <w:dstrike w:val="false"/>
                 <w:color w:val="000000"/>
                 <w:sz w:val="24"/>
+                <w:szCs w:val="24"/>
                 <w:u w:val="none"/>
                 <w:effect w:val="none"/>
                 <w:shd w:fill="auto" w:val="clear"/>
@@ -1422,6 +1512,7 @@
                 <w:dstrike w:val="false"/>
                 <w:color w:val="000000"/>
                 <w:sz w:val="24"/>
+                <w:szCs w:val="24"/>
                 <w:u w:val="none"/>
                 <w:effect w:val="none"/>
                 <w:shd w:fill="auto" w:val="clear"/>
@@ -1439,6 +1530,7 @@
                 <w:dstrike w:val="false"/>
                 <w:color w:val="000000"/>
                 <w:sz w:val="24"/>
+                <w:szCs w:val="24"/>
                 <w:u w:val="none"/>
                 <w:effect w:val="none"/>
                 <w:shd w:fill="auto" w:val="clear"/>
@@ -1478,6 +1570,7 @@
                 <w:dstrike w:val="false"/>
                 <w:color w:val="000000"/>
                 <w:sz w:val="24"/>
+                <w:szCs w:val="24"/>
                 <w:u w:val="none"/>
                 <w:effect w:val="none"/>
                 <w:shd w:fill="auto" w:val="clear"/>
@@ -1494,6 +1587,7 @@
                 <w:dstrike w:val="false"/>
                 <w:color w:val="000000"/>
                 <w:sz w:val="24"/>
+                <w:szCs w:val="24"/>
                 <w:u w:val="none"/>
                 <w:effect w:val="none"/>
                 <w:shd w:fill="auto" w:val="clear"/>
@@ -1531,6 +1625,7 @@
                 <w:dstrike w:val="false"/>
                 <w:color w:val="000000"/>
                 <w:sz w:val="24"/>
+                <w:szCs w:val="24"/>
                 <w:u w:val="none"/>
                 <w:effect w:val="none"/>
                 <w:shd w:fill="auto" w:val="clear"/>
@@ -1548,6 +1643,7 @@
                 <w:dstrike w:val="false"/>
                 <w:color w:val="000000"/>
                 <w:sz w:val="24"/>
+                <w:szCs w:val="24"/>
                 <w:u w:val="none"/>
                 <w:effect w:val="none"/>
                 <w:shd w:fill="auto" w:val="clear"/>
@@ -1585,6 +1681,7 @@
                 <w:dstrike w:val="false"/>
                 <w:color w:val="000000"/>
                 <w:sz w:val="24"/>
+                <w:szCs w:val="24"/>
                 <w:u w:val="none"/>
                 <w:effect w:val="none"/>
                 <w:shd w:fill="auto" w:val="clear"/>
@@ -1602,6 +1699,7 @@
                 <w:dstrike w:val="false"/>
                 <w:color w:val="000000"/>
                 <w:sz w:val="24"/>
+                <w:szCs w:val="24"/>
                 <w:u w:val="none"/>
                 <w:effect w:val="none"/>
                 <w:shd w:fill="auto" w:val="clear"/>
@@ -1641,6 +1739,7 @@
                 <w:dstrike w:val="false"/>
                 <w:color w:val="000000"/>
                 <w:sz w:val="24"/>
+                <w:szCs w:val="24"/>
                 <w:u w:val="none"/>
                 <w:effect w:val="none"/>
                 <w:shd w:fill="auto" w:val="clear"/>
@@ -1657,6 +1756,7 @@
                 <w:dstrike w:val="false"/>
                 <w:color w:val="000000"/>
                 <w:sz w:val="24"/>
+                <w:szCs w:val="24"/>
                 <w:u w:val="none"/>
                 <w:effect w:val="none"/>
                 <w:shd w:fill="auto" w:val="clear"/>
@@ -1694,6 +1794,7 @@
                 <w:dstrike w:val="false"/>
                 <w:color w:val="000000"/>
                 <w:sz w:val="24"/>
+                <w:szCs w:val="24"/>
                 <w:u w:val="none"/>
                 <w:effect w:val="none"/>
                 <w:shd w:fill="auto" w:val="clear"/>
@@ -1711,6 +1812,7 @@
                 <w:dstrike w:val="false"/>
                 <w:color w:val="000000"/>
                 <w:sz w:val="24"/>
+                <w:szCs w:val="24"/>
                 <w:u w:val="none"/>
                 <w:effect w:val="none"/>
                 <w:shd w:fill="auto" w:val="clear"/>
@@ -1748,6 +1850,7 @@
                 <w:dstrike w:val="false"/>
                 <w:color w:val="000000"/>
                 <w:sz w:val="24"/>
+                <w:szCs w:val="24"/>
                 <w:u w:val="none"/>
                 <w:effect w:val="none"/>
                 <w:shd w:fill="auto" w:val="clear"/>
@@ -1765,6 +1868,7 @@
                 <w:dstrike w:val="false"/>
                 <w:color w:val="000000"/>
                 <w:sz w:val="24"/>
+                <w:szCs w:val="24"/>
                 <w:u w:val="none"/>
                 <w:effect w:val="none"/>
                 <w:shd w:fill="auto" w:val="clear"/>
@@ -1804,6 +1908,7 @@
                 <w:dstrike w:val="false"/>
                 <w:color w:val="000000"/>
                 <w:sz w:val="24"/>
+                <w:szCs w:val="24"/>
                 <w:u w:val="none"/>
                 <w:effect w:val="none"/>
                 <w:shd w:fill="auto" w:val="clear"/>
@@ -1820,6 +1925,7 @@
                 <w:dstrike w:val="false"/>
                 <w:color w:val="000000"/>
                 <w:sz w:val="24"/>
+                <w:szCs w:val="24"/>
                 <w:u w:val="none"/>
                 <w:effect w:val="none"/>
                 <w:shd w:fill="auto" w:val="clear"/>
@@ -1857,6 +1963,7 @@
                 <w:dstrike w:val="false"/>
                 <w:color w:val="000000"/>
                 <w:sz w:val="24"/>
+                <w:szCs w:val="24"/>
                 <w:u w:val="none"/>
                 <w:effect w:val="none"/>
                 <w:shd w:fill="auto" w:val="clear"/>
@@ -1874,6 +1981,7 @@
                 <w:dstrike w:val="false"/>
                 <w:color w:val="000000"/>
                 <w:sz w:val="24"/>
+                <w:szCs w:val="24"/>
                 <w:u w:val="none"/>
                 <w:effect w:val="none"/>
                 <w:shd w:fill="auto" w:val="clear"/>
@@ -1911,6 +2019,7 @@
                 <w:dstrike w:val="false"/>
                 <w:color w:val="000000"/>
                 <w:sz w:val="24"/>
+                <w:szCs w:val="24"/>
                 <w:u w:val="none"/>
                 <w:effect w:val="none"/>
                 <w:shd w:fill="auto" w:val="clear"/>
@@ -1928,6 +2037,7 @@
                 <w:dstrike w:val="false"/>
                 <w:color w:val="000000"/>
                 <w:sz w:val="24"/>
+                <w:szCs w:val="24"/>
                 <w:u w:val="none"/>
                 <w:effect w:val="none"/>
                 <w:shd w:fill="auto" w:val="clear"/>
@@ -1967,6 +2077,7 @@
                 <w:dstrike w:val="false"/>
                 <w:color w:val="000000"/>
                 <w:sz w:val="24"/>
+                <w:szCs w:val="24"/>
                 <w:u w:val="none"/>
                 <w:effect w:val="none"/>
                 <w:shd w:fill="auto" w:val="clear"/>
@@ -1983,6 +2094,7 @@
                 <w:dstrike w:val="false"/>
                 <w:color w:val="000000"/>
                 <w:sz w:val="24"/>
+                <w:szCs w:val="24"/>
                 <w:u w:val="none"/>
                 <w:effect w:val="none"/>
                 <w:shd w:fill="auto" w:val="clear"/>
@@ -2020,6 +2132,7 @@
                 <w:dstrike w:val="false"/>
                 <w:color w:val="000000"/>
                 <w:sz w:val="24"/>
+                <w:szCs w:val="24"/>
                 <w:u w:val="none"/>
                 <w:effect w:val="none"/>
                 <w:shd w:fill="auto" w:val="clear"/>
@@ -2037,6 +2150,7 @@
                 <w:dstrike w:val="false"/>
                 <w:color w:val="000000"/>
                 <w:sz w:val="24"/>
+                <w:szCs w:val="24"/>
                 <w:u w:val="none"/>
                 <w:effect w:val="none"/>
                 <w:shd w:fill="auto" w:val="clear"/>
@@ -2074,6 +2188,7 @@
                 <w:dstrike w:val="false"/>
                 <w:color w:val="000000"/>
                 <w:sz w:val="24"/>
+                <w:szCs w:val="24"/>
                 <w:u w:val="none"/>
                 <w:effect w:val="none"/>
                 <w:shd w:fill="auto" w:val="clear"/>
@@ -2091,6 +2206,7 @@
                 <w:dstrike w:val="false"/>
                 <w:color w:val="000000"/>
                 <w:sz w:val="24"/>
+                <w:szCs w:val="24"/>
                 <w:u w:val="none"/>
                 <w:effect w:val="none"/>
                 <w:shd w:fill="auto" w:val="clear"/>
@@ -2116,7 +2232,8 @@
           <w:strike w:val="false"/>
           <w:dstrike w:val="false"/>
           <w:color w:val="000000"/>
-          <w:sz w:val="26"/>
+          <w:sz w:val="24"/>
+          <w:szCs w:val="24"/>
           <w:u w:val="none"/>
           <w:effect w:val="none"/>
           <w:shd w:fill="auto" w:val="clear"/>
@@ -2132,7 +2249,8 @@
           <w:strike w:val="false"/>
           <w:dstrike w:val="false"/>
           <w:color w:val="000000"/>
-          <w:sz w:val="26"/>
+          <w:sz w:val="24"/>
+          <w:szCs w:val="24"/>
           <w:u w:val="none"/>
           <w:effect w:val="none"/>
           <w:shd w:fill="auto" w:val="clear"/>
@@ -2156,6 +2274,7 @@
           <w:dstrike w:val="false"/>
           <w:color w:val="000000"/>
           <w:sz w:val="24"/>
+          <w:szCs w:val="24"/>
           <w:u w:val="none"/>
           <w:effect w:val="none"/>
           <w:shd w:fill="auto" w:val="clear"/>
@@ -2172,6 +2291,7 @@
           <w:dstrike w:val="false"/>
           <w:color w:val="000000"/>
           <w:sz w:val="24"/>
+          <w:szCs w:val="24"/>
           <w:u w:val="none"/>
           <w:effect w:val="none"/>
           <w:shd w:fill="auto" w:val="clear"/>
@@ -2195,6 +2315,7 @@
           <w:dstrike w:val="false"/>
           <w:color w:val="000000"/>
           <w:sz w:val="24"/>
+          <w:szCs w:val="24"/>
           <w:u w:val="none"/>
           <w:effect w:val="none"/>
           <w:shd w:fill="auto" w:val="clear"/>
@@ -2211,6 +2332,7 @@
           <w:dstrike w:val="false"/>
           <w:color w:val="000000"/>
           <w:sz w:val="24"/>
+          <w:szCs w:val="24"/>
           <w:u w:val="none"/>
           <w:effect w:val="none"/>
           <w:shd w:fill="auto" w:val="clear"/>
@@ -2234,6 +2356,7 @@
           <w:dstrike w:val="false"/>
           <w:color w:val="000000"/>
           <w:sz w:val="24"/>
+          <w:szCs w:val="24"/>
           <w:u w:val="none"/>
           <w:effect w:val="none"/>
           <w:shd w:fill="auto" w:val="clear"/>
@@ -2250,6 +2373,7 @@
           <w:dstrike w:val="false"/>
           <w:color w:val="000000"/>
           <w:sz w:val="24"/>
+          <w:szCs w:val="24"/>
           <w:u w:val="none"/>
           <w:effect w:val="none"/>
           <w:shd w:fill="auto" w:val="clear"/>
@@ -2272,7 +2396,8 @@
           <w:strike w:val="false"/>
           <w:dstrike w:val="false"/>
           <w:color w:val="000000"/>
-          <w:sz w:val="26"/>
+          <w:sz w:val="24"/>
+          <w:szCs w:val="24"/>
           <w:u w:val="none"/>
           <w:effect w:val="none"/>
           <w:shd w:fill="auto" w:val="clear"/>
@@ -2290,7 +2415,8 @@
           <w:strike w:val="false"/>
           <w:dstrike w:val="false"/>
           <w:color w:val="000000"/>
-          <w:sz w:val="26"/>
+          <w:sz w:val="24"/>
+          <w:szCs w:val="24"/>
           <w:u w:val="none"/>
           <w:effect w:val="none"/>
           <w:shd w:fill="auto" w:val="clear"/>
@@ -2323,6 +2449,7 @@
           <w:dstrike w:val="false"/>
           <w:color w:val="000000"/>
           <w:sz w:val="24"/>
+          <w:szCs w:val="24"/>
           <w:u w:val="none"/>
           <w:effect w:val="none"/>
           <w:shd w:fill="auto" w:val="clear"/>
@@ -2339,6 +2466,7 @@
           <w:dstrike w:val="false"/>
           <w:color w:val="000000"/>
           <w:sz w:val="24"/>
+          <w:szCs w:val="24"/>
           <w:u w:val="none"/>
           <w:effect w:val="none"/>
           <w:shd w:fill="auto" w:val="clear"/>
@@ -2371,6 +2499,7 @@
           <w:dstrike w:val="false"/>
           <w:color w:val="000000"/>
           <w:sz w:val="24"/>
+          <w:szCs w:val="24"/>
           <w:u w:val="none"/>
           <w:effect w:val="none"/>
           <w:shd w:fill="auto" w:val="clear"/>
@@ -2387,6 +2516,7 @@
           <w:dstrike w:val="false"/>
           <w:color w:val="000000"/>
           <w:sz w:val="24"/>
+          <w:szCs w:val="24"/>
           <w:u w:val="none"/>
           <w:effect w:val="none"/>
           <w:shd w:fill="auto" w:val="clear"/>
@@ -2419,6 +2549,7 @@
           <w:dstrike w:val="false"/>
           <w:color w:val="000000"/>
           <w:sz w:val="24"/>
+          <w:szCs w:val="24"/>
           <w:u w:val="none"/>
           <w:effect w:val="none"/>
           <w:shd w:fill="auto" w:val="clear"/>
@@ -2435,6 +2566,7 @@
           <w:dstrike w:val="false"/>
           <w:color w:val="000000"/>
           <w:sz w:val="24"/>
+          <w:szCs w:val="24"/>
           <w:u w:val="none"/>
           <w:effect w:val="none"/>
           <w:shd w:fill="auto" w:val="clear"/>
@@ -2467,6 +2599,7 @@
           <w:dstrike w:val="false"/>
           <w:color w:val="000000"/>
           <w:sz w:val="24"/>
+          <w:szCs w:val="24"/>
           <w:u w:val="none"/>
           <w:effect w:val="none"/>
           <w:shd w:fill="auto" w:val="clear"/>
@@ -2483,6 +2616,7 @@
           <w:dstrike w:val="false"/>
           <w:color w:val="000000"/>
           <w:sz w:val="24"/>
+          <w:szCs w:val="24"/>
           <w:u w:val="none"/>
           <w:effect w:val="none"/>
           <w:shd w:fill="auto" w:val="clear"/>
@@ -2515,6 +2649,7 @@
           <w:dstrike w:val="false"/>
           <w:color w:val="000000"/>
           <w:sz w:val="24"/>
+          <w:szCs w:val="24"/>
           <w:u w:val="none"/>
           <w:effect w:val="none"/>
           <w:shd w:fill="auto" w:val="clear"/>
@@ -2531,6 +2666,7 @@
           <w:dstrike w:val="false"/>
           <w:color w:val="000000"/>
           <w:sz w:val="24"/>
+          <w:szCs w:val="24"/>
           <w:u w:val="none"/>
           <w:effect w:val="none"/>
           <w:shd w:fill="auto" w:val="clear"/>
@@ -2563,6 +2699,7 @@
           <w:dstrike w:val="false"/>
           <w:color w:val="000000"/>
           <w:sz w:val="24"/>
+          <w:szCs w:val="24"/>
           <w:u w:val="none"/>
           <w:effect w:val="none"/>
           <w:shd w:fill="auto" w:val="clear"/>
@@ -2579,6 +2716,7 @@
           <w:dstrike w:val="false"/>
           <w:color w:val="000000"/>
           <w:sz w:val="24"/>
+          <w:szCs w:val="24"/>
           <w:u w:val="none"/>
           <w:effect w:val="none"/>
           <w:shd w:fill="auto" w:val="clear"/>
@@ -2601,7 +2739,8 @@
           <w:strike w:val="false"/>
           <w:dstrike w:val="false"/>
           <w:color w:val="000000"/>
-          <w:sz w:val="26"/>
+          <w:sz w:val="24"/>
+          <w:szCs w:val="24"/>
           <w:u w:val="none"/>
           <w:effect w:val="none"/>
           <w:shd w:fill="auto" w:val="clear"/>
@@ -2617,7 +2756,8 @@
           <w:strike w:val="false"/>
           <w:dstrike w:val="false"/>
           <w:color w:val="000000"/>
-          <w:sz w:val="26"/>
+          <w:sz w:val="24"/>
+          <w:szCs w:val="24"/>
           <w:u w:val="none"/>
           <w:effect w:val="none"/>
           <w:shd w:fill="auto" w:val="clear"/>
@@ -2650,6 +2790,7 @@
           <w:dstrike w:val="false"/>
           <w:color w:val="000000"/>
           <w:sz w:val="24"/>
+          <w:szCs w:val="24"/>
           <w:u w:val="none"/>
           <w:effect w:val="none"/>
           <w:shd w:fill="auto" w:val="clear"/>
@@ -2666,6 +2807,7 @@
           <w:dstrike w:val="false"/>
           <w:color w:val="000000"/>
           <w:sz w:val="24"/>
+          <w:szCs w:val="24"/>
           <w:u w:val="none"/>
           <w:effect w:val="none"/>
           <w:shd w:fill="auto" w:val="clear"/>
@@ -2698,6 +2840,7 @@
           <w:dstrike w:val="false"/>
           <w:color w:val="000000"/>
           <w:sz w:val="24"/>
+          <w:szCs w:val="24"/>
           <w:u w:val="none"/>
           <w:effect w:val="none"/>
           <w:shd w:fill="auto" w:val="clear"/>
@@ -2714,6 +2857,7 @@
           <w:dstrike w:val="false"/>
           <w:color w:val="000000"/>
           <w:sz w:val="24"/>
+          <w:szCs w:val="24"/>
           <w:u w:val="none"/>
           <w:effect w:val="none"/>
           <w:shd w:fill="auto" w:val="clear"/>
@@ -2746,6 +2890,7 @@
           <w:dstrike w:val="false"/>
           <w:color w:val="000000"/>
           <w:sz w:val="24"/>
+          <w:szCs w:val="24"/>
           <w:u w:val="none"/>
           <w:effect w:val="none"/>
           <w:shd w:fill="auto" w:val="clear"/>
@@ -2762,6 +2907,7 @@
           <w:dstrike w:val="false"/>
           <w:color w:val="000000"/>
           <w:sz w:val="24"/>
+          <w:szCs w:val="24"/>
           <w:u w:val="none"/>
           <w:effect w:val="none"/>
           <w:shd w:fill="auto" w:val="clear"/>
@@ -2794,6 +2940,7 @@
           <w:dstrike w:val="false"/>
           <w:color w:val="000000"/>
           <w:sz w:val="24"/>
+          <w:szCs w:val="24"/>
           <w:u w:val="none"/>
           <w:effect w:val="none"/>
           <w:shd w:fill="auto" w:val="clear"/>
@@ -2810,6 +2957,7 @@
           <w:dstrike w:val="false"/>
           <w:color w:val="000000"/>
           <w:sz w:val="24"/>
+          <w:szCs w:val="24"/>
           <w:u w:val="none"/>
           <w:effect w:val="none"/>
           <w:shd w:fill="auto" w:val="clear"/>
@@ -2842,6 +2990,7 @@
           <w:dstrike w:val="false"/>
           <w:color w:val="000000"/>
           <w:sz w:val="24"/>
+          <w:szCs w:val="24"/>
           <w:u w:val="none"/>
           <w:effect w:val="none"/>
           <w:shd w:fill="auto" w:val="clear"/>
@@ -2858,6 +3007,7 @@
           <w:dstrike w:val="false"/>
           <w:color w:val="000000"/>
           <w:sz w:val="24"/>
+          <w:szCs w:val="24"/>
           <w:u w:val="none"/>
           <w:effect w:val="none"/>
           <w:shd w:fill="auto" w:val="clear"/>
@@ -2868,8 +3018,9 @@
     <w:p>
       <w:pPr>
         <w:pStyle w:val="BodyText"/>
+        <w:pBdr/>
         <w:bidi w:val="0"/>
-        <w:spacing w:lineRule="auto" w:line="331" w:before="240" w:after="240"/>
+        <w:spacing w:lineRule="auto" w:line="331" w:before="0" w:after="240"/>
         <w:ind w:hanging="0" w:start="0" w:end="0"/>
         <w:rPr>
           <w:rFonts w:ascii="times new roman " w:hAnsi="times new roman "/>
@@ -2881,6 +3032,7 @@
           <w:dstrike w:val="false"/>
           <w:color w:val="000000"/>
           <w:sz w:val="24"/>
+          <w:szCs w:val="24"/>
           <w:u w:val="none"/>
           <w:effect w:val="none"/>
           <w:shd w:fill="auto" w:val="clear"/>
@@ -2897,10 +3049,100 @@
           <w:dstrike w:val="false"/>
           <w:color w:val="000000"/>
           <w:sz w:val="24"/>
+          <w:szCs w:val="24"/>
           <w:u w:val="none"/>
           <w:effect w:val="none"/>
           <w:shd w:fill="auto" w:val="clear"/>
         </w:rPr>
+      </w:r>
+    </w:p>
+    <w:p>
+      <w:pPr>
+        <w:pStyle w:val="BodyText"/>
+        <w:pBdr/>
+        <w:bidi w:val="0"/>
+        <w:spacing w:lineRule="auto" w:line="331" w:before="0" w:after="240"/>
+        <w:ind w:hanging="0" w:start="0" w:end="0"/>
+        <w:rPr>
+          <w:rFonts w:ascii="times new roman " w:hAnsi="times new roman "/>
+          <w:b w:val="false"/>
+          <w:i w:val="false"/>
+          <w:caps w:val="false"/>
+          <w:smallCaps w:val="false"/>
+          <w:strike w:val="false"/>
+          <w:dstrike w:val="false"/>
+          <w:color w:val="000000"/>
+          <w:sz w:val="24"/>
+          <w:szCs w:val="24"/>
+          <w:u w:val="none"/>
+          <w:effect w:val="none"/>
+          <w:shd w:fill="auto" w:val="clear"/>
+        </w:rPr>
+      </w:pPr>
+      <w:r>
+        <w:rPr>
+          <w:rFonts w:ascii="times new roman " w:hAnsi="times new roman "/>
+          <w:b w:val="false"/>
+          <w:i w:val="false"/>
+          <w:caps w:val="false"/>
+          <w:smallCaps w:val="false"/>
+          <w:strike w:val="false"/>
+          <w:dstrike w:val="false"/>
+          <w:color w:val="000000"/>
+          <w:sz w:val="24"/>
+          <w:szCs w:val="24"/>
+          <w:u w:val="none"/>
+          <w:effect w:val="none"/>
+          <w:shd w:fill="auto" w:val="clear"/>
+        </w:rPr>
+      </w:r>
+    </w:p>
+    <w:p>
+      <w:pPr>
+        <w:pStyle w:val="Normal"/>
+        <w:numPr>
+          <w:ilvl w:val="0"/>
+          <w:numId w:val="0"/>
+        </w:numPr>
+        <w:pBdr/>
+        <w:bidi w:val="0"/>
+        <w:spacing w:lineRule="auto" w:line="331" w:before="0" w:after="240"/>
+        <w:ind w:hanging="0" w:start="0" w:end="0"/>
+        <w:rPr>
+          <w:rFonts w:ascii="times new roman " w:hAnsi="times new roman "/>
+          <w:b/>
+          <w:i w:val="false"/>
+          <w:caps w:val="false"/>
+          <w:smallCaps w:val="false"/>
+          <w:strike w:val="false"/>
+          <w:dstrike w:val="false"/>
+          <w:color w:val="000000"/>
+          <w:sz w:val="24"/>
+          <w:szCs w:val="24"/>
+          <w:u w:val="none"/>
+          <w:effect w:val="none"/>
+          <w:shd w:fill="auto" w:val="clear"/>
+        </w:rPr>
+      </w:pPr>
+      <w:bookmarkStart w:id="3" w:name="docs-internal-guid-cb7f2303-7fff-e1d6-74"/>
+      <w:bookmarkEnd w:id="3"/>
+      <w:r>
+        <w:rPr>
+          <w:rFonts w:ascii="times new roman " w:hAnsi="times new roman "/>
+          <w:b/>
+          <w:i w:val="false"/>
+          <w:caps w:val="false"/>
+          <w:smallCaps w:val="false"/>
+          <w:strike w:val="false"/>
+          <w:dstrike w:val="false"/>
+          <w:color w:val="000000"/>
+          <w:sz w:val="24"/>
+          <w:szCs w:val="24"/>
+          <w:u w:val="none"/>
+          <w:effect w:val="none"/>
+          <w:shd w:fill="auto" w:val="clear"/>
+        </w:rPr>
+        <w:t>2.1 Requisitos Funcionales</w:t>
       </w:r>
     </w:p>
     <w:p>
@@ -2912,66 +3154,3038 @@
         </w:numPr>
         <w:pBdr/>
         <w:bidi w:val="0"/>
-        <w:spacing w:lineRule="auto" w:line="331" w:before="0" w:after="0"/>
+        <w:spacing w:lineRule="auto" w:line="331" w:before="0" w:after="240"/>
         <w:ind w:hanging="0" w:start="0" w:end="0"/>
         <w:rPr>
           <w:rFonts w:ascii="times new roman " w:hAnsi="times new roman "/>
-          <w:b w:val="false"/>
-          <w:i w:val="false"/>
-          <w:caps w:val="false"/>
-          <w:smallCaps w:val="false"/>
-          <w:strike w:val="false"/>
-          <w:dstrike w:val="false"/>
-          <w:color w:val="000000"/>
-          <w:sz w:val="24"/>
-          <w:szCs w:val="24"/>
-          <w:u w:val="none"/>
-          <w:effect w:val="none"/>
-          <w:shd w:fill="auto" w:val="clear"/>
+          <w:sz w:val="24"/>
+          <w:szCs w:val="24"/>
         </w:rPr>
       </w:pPr>
       <w:r>
         <w:rPr>
           <w:rFonts w:ascii="times new roman " w:hAnsi="times new roman "/>
-          <w:b w:val="false"/>
-          <w:i w:val="false"/>
-          <w:caps w:val="false"/>
-          <w:smallCaps w:val="false"/>
-          <w:strike w:val="false"/>
-          <w:dstrike w:val="false"/>
-          <w:color w:val="000000"/>
-          <w:sz w:val="24"/>
-          <w:szCs w:val="24"/>
-          <w:u w:val="none"/>
-          <w:effect w:val="none"/>
-          <w:shd w:fill="auto" w:val="clear"/>
+          <w:sz w:val="24"/>
+          <w:szCs w:val="24"/>
+        </w:rPr>
+      </w:r>
+    </w:p>
+    <w:tbl>
+      <w:tblPr>
+        <w:tblW w:w="5000" w:type="pct"/>
+        <w:jc w:val="start"/>
+        <w:tblInd w:w="0" w:type="dxa"/>
+        <w:tblLayout w:type="fixed"/>
+        <w:tblCellMar>
+          <w:top w:w="28" w:type="dxa"/>
+          <w:start w:w="28" w:type="dxa"/>
+          <w:bottom w:w="28" w:type="dxa"/>
+          <w:end w:w="28" w:type="dxa"/>
+        </w:tblCellMar>
+      </w:tblPr>
+      <w:tblGrid>
+        <w:gridCol w:w="795"/>
+        <w:gridCol w:w="7709"/>
+      </w:tblGrid>
+      <w:tr>
+        <w:trPr>
+          <w:tblHeader w:val="true"/>
+        </w:trPr>
+        <w:tc>
+          <w:tcPr>
+            <w:tcW w:w="795" w:type="dxa"/>
+            <w:tcBorders/>
+            <w:vAlign w:val="center"/>
+          </w:tcPr>
+          <w:p>
+            <w:pPr>
+              <w:pStyle w:val="Ttulodelatabla"/>
+              <w:spacing w:before="0" w:after="160"/>
+              <w:rPr>
+                <w:rFonts w:ascii="times new roman " w:hAnsi="times new roman "/>
+                <w:sz w:val="24"/>
+                <w:szCs w:val="24"/>
+              </w:rPr>
+            </w:pPr>
+            <w:r>
+              <w:rPr>
+                <w:rFonts w:ascii="times new roman " w:hAnsi="times new roman "/>
+                <w:sz w:val="24"/>
+                <w:szCs w:val="24"/>
+              </w:rPr>
+              <w:t>Código</w:t>
+            </w:r>
+          </w:p>
+        </w:tc>
+        <w:tc>
+          <w:tcPr>
+            <w:tcW w:w="7709" w:type="dxa"/>
+            <w:tcBorders/>
+            <w:vAlign w:val="center"/>
+          </w:tcPr>
+          <w:p>
+            <w:pPr>
+              <w:pStyle w:val="Ttulodelatabla"/>
+              <w:spacing w:before="0" w:after="160"/>
+              <w:rPr>
+                <w:rFonts w:ascii="times new roman " w:hAnsi="times new roman "/>
+                <w:sz w:val="24"/>
+                <w:szCs w:val="24"/>
+              </w:rPr>
+            </w:pPr>
+            <w:r>
+              <w:rPr>
+                <w:rFonts w:ascii="times new roman " w:hAnsi="times new roman "/>
+                <w:sz w:val="24"/>
+                <w:szCs w:val="24"/>
+              </w:rPr>
+              <w:t>Requisito Funcional</w:t>
+            </w:r>
+          </w:p>
+        </w:tc>
+      </w:tr>
+    </w:tbl>
+    <w:tbl>
+      <w:tblPr>
+        <w:tblW w:w="8504" w:type="dxa"/>
+        <w:jc w:val="start"/>
+        <w:tblInd w:w="0" w:type="dxa"/>
+        <w:tblLayout w:type="fixed"/>
+        <w:tblCellMar>
+          <w:top w:w="28" w:type="dxa"/>
+          <w:start w:w="28" w:type="dxa"/>
+          <w:bottom w:w="28" w:type="dxa"/>
+          <w:end w:w="28" w:type="dxa"/>
+        </w:tblCellMar>
+      </w:tblPr>
+      <w:tblGrid>
+        <w:gridCol w:w="765"/>
+        <w:gridCol w:w="7739"/>
+      </w:tblGrid>
+      <w:tr>
+        <w:trPr/>
+        <w:tc>
+          <w:tcPr>
+            <w:tcW w:w="765" w:type="dxa"/>
+            <w:tcBorders/>
+            <w:vAlign w:val="center"/>
+          </w:tcPr>
+          <w:p>
+            <w:pPr>
+              <w:pStyle w:val="Contenidodelatabla"/>
+              <w:widowControl w:val="false"/>
+              <w:suppressLineNumbers/>
+              <w:spacing w:before="0" w:after="160"/>
+              <w:rPr/>
+            </w:pPr>
+            <w:r>
+              <w:rPr>
+                <w:rStyle w:val="Strong"/>
+                <w:rFonts w:ascii="times new roman " w:hAnsi="times new roman "/>
+                <w:sz w:val="24"/>
+                <w:szCs w:val="24"/>
+              </w:rPr>
+              <w:t>RF01</w:t>
+            </w:r>
+          </w:p>
+        </w:tc>
+        <w:tc>
+          <w:tcPr>
+            <w:tcW w:w="7739" w:type="dxa"/>
+            <w:tcBorders/>
+            <w:vAlign w:val="center"/>
+          </w:tcPr>
+          <w:p>
+            <w:pPr>
+              <w:pStyle w:val="Contenidodelatabla"/>
+              <w:widowControl w:val="false"/>
+              <w:suppressLineNumbers/>
+              <w:spacing w:before="0" w:after="160"/>
+              <w:rPr/>
+            </w:pPr>
+            <w:r>
+              <w:rPr>
+                <w:rStyle w:val="Strong"/>
+                <w:rFonts w:ascii="times new roman " w:hAnsi="times new roman "/>
+                <w:sz w:val="24"/>
+                <w:szCs w:val="24"/>
+              </w:rPr>
+              <w:t>El sistema debe permitir</w:t>
+            </w:r>
+            <w:r>
+              <w:rPr>
+                <w:rFonts w:ascii="times new roman " w:hAnsi="times new roman "/>
+                <w:sz w:val="24"/>
+                <w:szCs w:val="24"/>
+              </w:rPr>
+              <w:t xml:space="preserve"> gestionar el alta e incorporación de clientes residenciales y comerciales, capturando su información técnica y de contacto.</w:t>
+            </w:r>
+          </w:p>
+        </w:tc>
+      </w:tr>
+    </w:tbl>
+    <w:tbl>
+      <w:tblPr>
+        <w:tblW w:w="8504" w:type="dxa"/>
+        <w:jc w:val="start"/>
+        <w:tblInd w:w="0" w:type="dxa"/>
+        <w:tblLayout w:type="fixed"/>
+        <w:tblCellMar>
+          <w:top w:w="28" w:type="dxa"/>
+          <w:start w:w="28" w:type="dxa"/>
+          <w:bottom w:w="28" w:type="dxa"/>
+          <w:end w:w="28" w:type="dxa"/>
+        </w:tblCellMar>
+      </w:tblPr>
+      <w:tblGrid>
+        <w:gridCol w:w="765"/>
+        <w:gridCol w:w="7739"/>
+      </w:tblGrid>
+      <w:tr>
+        <w:trPr/>
+        <w:tc>
+          <w:tcPr>
+            <w:tcW w:w="765" w:type="dxa"/>
+            <w:tcBorders/>
+            <w:vAlign w:val="center"/>
+          </w:tcPr>
+          <w:p>
+            <w:pPr>
+              <w:pStyle w:val="Contenidodelatabla"/>
+              <w:widowControl w:val="false"/>
+              <w:suppressLineNumbers/>
+              <w:spacing w:before="0" w:after="160"/>
+              <w:rPr/>
+            </w:pPr>
+            <w:r>
+              <w:rPr>
+                <w:rStyle w:val="Strong"/>
+                <w:rFonts w:ascii="times new roman " w:hAnsi="times new roman "/>
+                <w:sz w:val="24"/>
+                <w:szCs w:val="24"/>
+              </w:rPr>
+              <w:t>RF02</w:t>
+            </w:r>
+          </w:p>
+        </w:tc>
+        <w:tc>
+          <w:tcPr>
+            <w:tcW w:w="7739" w:type="dxa"/>
+            <w:tcBorders/>
+            <w:vAlign w:val="center"/>
+          </w:tcPr>
+          <w:p>
+            <w:pPr>
+              <w:pStyle w:val="Contenidodelatabla"/>
+              <w:widowControl w:val="false"/>
+              <w:suppressLineNumbers/>
+              <w:spacing w:before="0" w:after="160"/>
+              <w:rPr/>
+            </w:pPr>
+            <w:r>
+              <w:rPr>
+                <w:rStyle w:val="Strong"/>
+                <w:rFonts w:ascii="times new roman " w:hAnsi="times new roman "/>
+                <w:sz w:val="24"/>
+                <w:szCs w:val="24"/>
+              </w:rPr>
+              <w:t>El sistema debe permitir</w:t>
+            </w:r>
+            <w:r>
+              <w:rPr>
+                <w:rFonts w:ascii="times new roman " w:hAnsi="times new roman "/>
+                <w:sz w:val="24"/>
+                <w:szCs w:val="24"/>
+              </w:rPr>
+              <w:t xml:space="preserve"> la actualización, consulta detallada y baja lógica de la información de la base de clientes.</w:t>
+            </w:r>
+          </w:p>
+        </w:tc>
+      </w:tr>
+    </w:tbl>
+    <w:tbl>
+      <w:tblPr>
+        <w:tblW w:w="5000" w:type="pct"/>
+        <w:jc w:val="start"/>
+        <w:tblInd w:w="0" w:type="dxa"/>
+        <w:tblLayout w:type="fixed"/>
+        <w:tblCellMar>
+          <w:top w:w="28" w:type="dxa"/>
+          <w:start w:w="28" w:type="dxa"/>
+          <w:bottom w:w="28" w:type="dxa"/>
+          <w:end w:w="28" w:type="dxa"/>
+        </w:tblCellMar>
+      </w:tblPr>
+      <w:tblGrid>
+        <w:gridCol w:w="795"/>
+        <w:gridCol w:w="7709"/>
+      </w:tblGrid>
+      <w:tr>
+        <w:trPr/>
+        <w:tc>
+          <w:tcPr>
+            <w:tcW w:w="795" w:type="dxa"/>
+            <w:tcBorders/>
+            <w:vAlign w:val="center"/>
+          </w:tcPr>
+          <w:p>
+            <w:pPr>
+              <w:pStyle w:val="Contenidodelatabla"/>
+              <w:widowControl w:val="false"/>
+              <w:suppressLineNumbers/>
+              <w:spacing w:before="0" w:after="160"/>
+              <w:rPr/>
+            </w:pPr>
+            <w:r>
+              <w:rPr>
+                <w:rStyle w:val="Strong"/>
+                <w:rFonts w:ascii="times new roman " w:hAnsi="times new roman "/>
+                <w:sz w:val="24"/>
+                <w:szCs w:val="24"/>
+              </w:rPr>
+              <w:t>RF03</w:t>
+            </w:r>
+          </w:p>
+        </w:tc>
+        <w:tc>
+          <w:tcPr>
+            <w:tcW w:w="7709" w:type="dxa"/>
+            <w:tcBorders/>
+            <w:vAlign w:val="center"/>
+          </w:tcPr>
+          <w:p>
+            <w:pPr>
+              <w:pStyle w:val="Contenidodelatabla"/>
+              <w:widowControl w:val="false"/>
+              <w:suppressLineNumbers/>
+              <w:spacing w:before="0" w:after="160"/>
+              <w:rPr/>
+            </w:pPr>
+            <w:r>
+              <w:rPr>
+                <w:rStyle w:val="Strong"/>
+                <w:rFonts w:ascii="times new roman " w:hAnsi="times new roman "/>
+                <w:sz w:val="24"/>
+                <w:szCs w:val="24"/>
+              </w:rPr>
+              <w:t>El sistema debe permitir</w:t>
+            </w:r>
+            <w:r>
+              <w:rPr>
+                <w:rFonts w:ascii="times new roman " w:hAnsi="times new roman "/>
+                <w:sz w:val="24"/>
+                <w:szCs w:val="24"/>
+              </w:rPr>
+              <w:t xml:space="preserve"> administrar el inventario y la asignación de contenedores vinculados a cada usuario.</w:t>
+            </w:r>
+          </w:p>
+        </w:tc>
+      </w:tr>
+    </w:tbl>
+    <w:tbl>
+      <w:tblPr>
+        <w:tblW w:w="8504" w:type="dxa"/>
+        <w:jc w:val="start"/>
+        <w:tblInd w:w="0" w:type="dxa"/>
+        <w:tblLayout w:type="fixed"/>
+        <w:tblCellMar>
+          <w:top w:w="28" w:type="dxa"/>
+          <w:start w:w="28" w:type="dxa"/>
+          <w:bottom w:w="28" w:type="dxa"/>
+          <w:end w:w="28" w:type="dxa"/>
+        </w:tblCellMar>
+      </w:tblPr>
+      <w:tblGrid>
+        <w:gridCol w:w="795"/>
+        <w:gridCol w:w="7709"/>
+      </w:tblGrid>
+      <w:tr>
+        <w:trPr/>
+        <w:tc>
+          <w:tcPr>
+            <w:tcW w:w="795" w:type="dxa"/>
+            <w:tcBorders/>
+            <w:vAlign w:val="center"/>
+          </w:tcPr>
+          <w:p>
+            <w:pPr>
+              <w:pStyle w:val="Contenidodelatabla"/>
+              <w:widowControl w:val="false"/>
+              <w:suppressLineNumbers/>
+              <w:spacing w:before="0" w:after="160"/>
+              <w:rPr/>
+            </w:pPr>
+            <w:r>
+              <w:rPr>
+                <w:rStyle w:val="Strong"/>
+                <w:rFonts w:ascii="times new roman " w:hAnsi="times new roman "/>
+                <w:sz w:val="24"/>
+                <w:szCs w:val="24"/>
+              </w:rPr>
+              <w:t>RF04</w:t>
+            </w:r>
+          </w:p>
+        </w:tc>
+        <w:tc>
+          <w:tcPr>
+            <w:tcW w:w="7709" w:type="dxa"/>
+            <w:tcBorders/>
+            <w:vAlign w:val="center"/>
+          </w:tcPr>
+          <w:p>
+            <w:pPr>
+              <w:pStyle w:val="Contenidodelatabla"/>
+              <w:widowControl w:val="false"/>
+              <w:suppressLineNumbers/>
+              <w:spacing w:before="0" w:after="160"/>
+              <w:rPr/>
+            </w:pPr>
+            <w:r>
+              <w:rPr>
+                <w:rStyle w:val="Strong"/>
+                <w:rFonts w:ascii="times new roman " w:hAnsi="times new roman "/>
+                <w:sz w:val="24"/>
+                <w:szCs w:val="24"/>
+              </w:rPr>
+              <w:t>El sistema debe permitir</w:t>
+            </w:r>
+            <w:r>
+              <w:rPr>
+                <w:rFonts w:ascii="times new roman " w:hAnsi="times new roman "/>
+                <w:sz w:val="24"/>
+                <w:szCs w:val="24"/>
+              </w:rPr>
+              <w:t xml:space="preserve"> planificar las rutas logísticas de recolección en función de la zonificación geográfica y los esquemas de frecuencia establecidos.</w:t>
+            </w:r>
+          </w:p>
+        </w:tc>
+      </w:tr>
+    </w:tbl>
+    <w:tbl>
+      <w:tblPr>
+        <w:tblW w:w="8504" w:type="dxa"/>
+        <w:jc w:val="start"/>
+        <w:tblInd w:w="0" w:type="dxa"/>
+        <w:tblLayout w:type="fixed"/>
+        <w:tblCellMar>
+          <w:top w:w="28" w:type="dxa"/>
+          <w:start w:w="28" w:type="dxa"/>
+          <w:bottom w:w="28" w:type="dxa"/>
+          <w:end w:w="28" w:type="dxa"/>
+        </w:tblCellMar>
+      </w:tblPr>
+      <w:tblGrid>
+        <w:gridCol w:w="795"/>
+        <w:gridCol w:w="7709"/>
+      </w:tblGrid>
+      <w:tr>
+        <w:trPr/>
+        <w:tc>
+          <w:tcPr>
+            <w:tcW w:w="795" w:type="dxa"/>
+            <w:tcBorders/>
+            <w:vAlign w:val="center"/>
+          </w:tcPr>
+          <w:p>
+            <w:pPr>
+              <w:pStyle w:val="Contenidodelatabla"/>
+              <w:widowControl w:val="false"/>
+              <w:suppressLineNumbers/>
+              <w:spacing w:before="0" w:after="160"/>
+              <w:rPr/>
+            </w:pPr>
+            <w:r>
+              <w:rPr>
+                <w:rStyle w:val="Strong"/>
+                <w:rFonts w:ascii="times new roman " w:hAnsi="times new roman "/>
+                <w:sz w:val="24"/>
+                <w:szCs w:val="24"/>
+              </w:rPr>
+              <w:t>RF05</w:t>
+            </w:r>
+          </w:p>
+        </w:tc>
+        <w:tc>
+          <w:tcPr>
+            <w:tcW w:w="7709" w:type="dxa"/>
+            <w:tcBorders/>
+            <w:vAlign w:val="center"/>
+          </w:tcPr>
+          <w:p>
+            <w:pPr>
+              <w:pStyle w:val="Contenidodelatabla"/>
+              <w:widowControl w:val="false"/>
+              <w:suppressLineNumbers/>
+              <w:spacing w:before="0" w:after="160"/>
+              <w:rPr/>
+            </w:pPr>
+            <w:r>
+              <w:rPr>
+                <w:rStyle w:val="Strong"/>
+                <w:rFonts w:ascii="times new roman " w:hAnsi="times new roman "/>
+                <w:sz w:val="24"/>
+                <w:szCs w:val="24"/>
+              </w:rPr>
+              <w:t>El sistema debe permitir</w:t>
+            </w:r>
+            <w:r>
+              <w:rPr>
+                <w:rFonts w:ascii="times new roman " w:hAnsi="times new roman "/>
+                <w:sz w:val="24"/>
+                <w:szCs w:val="24"/>
+              </w:rPr>
+              <w:t xml:space="preserve"> coordinar la asignación del personal operativo de recolección a las distintas rutas programadas.</w:t>
+            </w:r>
+          </w:p>
+        </w:tc>
+      </w:tr>
+    </w:tbl>
+    <w:tbl>
+      <w:tblPr>
+        <w:tblW w:w="8504" w:type="dxa"/>
+        <w:jc w:val="start"/>
+        <w:tblInd w:w="0" w:type="dxa"/>
+        <w:tblLayout w:type="fixed"/>
+        <w:tblCellMar>
+          <w:top w:w="28" w:type="dxa"/>
+          <w:start w:w="28" w:type="dxa"/>
+          <w:bottom w:w="28" w:type="dxa"/>
+          <w:end w:w="28" w:type="dxa"/>
+        </w:tblCellMar>
+      </w:tblPr>
+      <w:tblGrid>
+        <w:gridCol w:w="795"/>
+        <w:gridCol w:w="7709"/>
+      </w:tblGrid>
+      <w:tr>
+        <w:trPr/>
+        <w:tc>
+          <w:tcPr>
+            <w:tcW w:w="795" w:type="dxa"/>
+            <w:tcBorders/>
+            <w:vAlign w:val="center"/>
+          </w:tcPr>
+          <w:p>
+            <w:pPr>
+              <w:pStyle w:val="Contenidodelatabla"/>
+              <w:widowControl w:val="false"/>
+              <w:suppressLineNumbers/>
+              <w:spacing w:before="0" w:after="160"/>
+              <w:rPr/>
+            </w:pPr>
+            <w:r>
+              <w:rPr>
+                <w:rStyle w:val="Strong"/>
+                <w:rFonts w:ascii="times new roman " w:hAnsi="times new roman "/>
+                <w:sz w:val="24"/>
+                <w:szCs w:val="24"/>
+              </w:rPr>
+              <w:t>RF06</w:t>
+            </w:r>
+          </w:p>
+        </w:tc>
+        <w:tc>
+          <w:tcPr>
+            <w:tcW w:w="7709" w:type="dxa"/>
+            <w:tcBorders/>
+            <w:vAlign w:val="center"/>
+          </w:tcPr>
+          <w:p>
+            <w:pPr>
+              <w:pStyle w:val="Contenidodelatabla"/>
+              <w:widowControl w:val="false"/>
+              <w:suppressLineNumbers/>
+              <w:spacing w:before="0" w:after="160"/>
+              <w:rPr/>
+            </w:pPr>
+            <w:r>
+              <w:rPr>
+                <w:rStyle w:val="Strong"/>
+                <w:rFonts w:ascii="times new roman " w:hAnsi="times new roman "/>
+                <w:sz w:val="24"/>
+                <w:szCs w:val="24"/>
+              </w:rPr>
+              <w:t>El sistema debe permitir</w:t>
+            </w:r>
+            <w:r>
+              <w:rPr>
+                <w:rFonts w:ascii="times new roman " w:hAnsi="times new roman "/>
+                <w:sz w:val="24"/>
+                <w:szCs w:val="24"/>
+              </w:rPr>
+              <w:t xml:space="preserve"> habilitar la consulta de rutas e itinerarios asignados directamente al personal de campo.</w:t>
+            </w:r>
+          </w:p>
+        </w:tc>
+      </w:tr>
+    </w:tbl>
+    <w:tbl>
+      <w:tblPr>
+        <w:tblW w:w="8504" w:type="dxa"/>
+        <w:jc w:val="start"/>
+        <w:tblInd w:w="0" w:type="dxa"/>
+        <w:tblLayout w:type="fixed"/>
+        <w:tblCellMar>
+          <w:top w:w="28" w:type="dxa"/>
+          <w:start w:w="28" w:type="dxa"/>
+          <w:bottom w:w="28" w:type="dxa"/>
+          <w:end w:w="28" w:type="dxa"/>
+        </w:tblCellMar>
+      </w:tblPr>
+      <w:tblGrid>
+        <w:gridCol w:w="795"/>
+        <w:gridCol w:w="7709"/>
+      </w:tblGrid>
+      <w:tr>
+        <w:trPr/>
+        <w:tc>
+          <w:tcPr>
+            <w:tcW w:w="795" w:type="dxa"/>
+            <w:tcBorders/>
+            <w:vAlign w:val="center"/>
+          </w:tcPr>
+          <w:p>
+            <w:pPr>
+              <w:pStyle w:val="Contenidodelatabla"/>
+              <w:widowControl w:val="false"/>
+              <w:suppressLineNumbers/>
+              <w:spacing w:before="0" w:after="160"/>
+              <w:rPr/>
+            </w:pPr>
+            <w:r>
+              <w:rPr>
+                <w:rStyle w:val="Strong"/>
+                <w:rFonts w:ascii="times new roman " w:hAnsi="times new roman "/>
+                <w:sz w:val="24"/>
+                <w:szCs w:val="24"/>
+              </w:rPr>
+              <w:t>RF07</w:t>
+            </w:r>
+          </w:p>
+        </w:tc>
+        <w:tc>
+          <w:tcPr>
+            <w:tcW w:w="7709" w:type="dxa"/>
+            <w:tcBorders/>
+            <w:vAlign w:val="center"/>
+          </w:tcPr>
+          <w:p>
+            <w:pPr>
+              <w:pStyle w:val="Contenidodelatabla"/>
+              <w:widowControl w:val="false"/>
+              <w:suppressLineNumbers/>
+              <w:spacing w:before="0" w:after="160"/>
+              <w:rPr/>
+            </w:pPr>
+            <w:r>
+              <w:rPr>
+                <w:rStyle w:val="Strong"/>
+                <w:rFonts w:ascii="times new roman " w:hAnsi="times new roman "/>
+                <w:sz w:val="24"/>
+                <w:szCs w:val="24"/>
+              </w:rPr>
+              <w:t>El sistema debe permitir</w:t>
+            </w:r>
+            <w:r>
+              <w:rPr>
+                <w:rFonts w:ascii="times new roman " w:hAnsi="times new roman "/>
+                <w:sz w:val="24"/>
+                <w:szCs w:val="24"/>
+              </w:rPr>
+              <w:t xml:space="preserve"> registrar la ejecución de cada evento de recolección, dejando trazabilidad de fecha, hora, geolocalización y cliente atendido.</w:t>
+            </w:r>
+          </w:p>
+        </w:tc>
+      </w:tr>
+    </w:tbl>
+    <w:tbl>
+      <w:tblPr>
+        <w:tblW w:w="8504" w:type="dxa"/>
+        <w:jc w:val="start"/>
+        <w:tblInd w:w="0" w:type="dxa"/>
+        <w:tblLayout w:type="fixed"/>
+        <w:tblCellMar>
+          <w:top w:w="28" w:type="dxa"/>
+          <w:start w:w="28" w:type="dxa"/>
+          <w:bottom w:w="28" w:type="dxa"/>
+          <w:end w:w="28" w:type="dxa"/>
+        </w:tblCellMar>
+      </w:tblPr>
+      <w:tblGrid>
+        <w:gridCol w:w="795"/>
+        <w:gridCol w:w="7709"/>
+      </w:tblGrid>
+      <w:tr>
+        <w:trPr/>
+        <w:tc>
+          <w:tcPr>
+            <w:tcW w:w="795" w:type="dxa"/>
+            <w:tcBorders/>
+            <w:vAlign w:val="center"/>
+          </w:tcPr>
+          <w:p>
+            <w:pPr>
+              <w:pStyle w:val="Contenidodelatabla"/>
+              <w:widowControl w:val="false"/>
+              <w:suppressLineNumbers/>
+              <w:spacing w:before="0" w:after="160"/>
+              <w:rPr/>
+            </w:pPr>
+            <w:r>
+              <w:rPr>
+                <w:rStyle w:val="Strong"/>
+                <w:rFonts w:ascii="times new roman " w:hAnsi="times new roman "/>
+                <w:sz w:val="24"/>
+                <w:szCs w:val="24"/>
+              </w:rPr>
+              <w:t>RF08</w:t>
+            </w:r>
+          </w:p>
+        </w:tc>
+        <w:tc>
+          <w:tcPr>
+            <w:tcW w:w="7709" w:type="dxa"/>
+            <w:tcBorders/>
+            <w:vAlign w:val="center"/>
+          </w:tcPr>
+          <w:p>
+            <w:pPr>
+              <w:pStyle w:val="Contenidodelatabla"/>
+              <w:widowControl w:val="false"/>
+              <w:suppressLineNumbers/>
+              <w:spacing w:before="0" w:after="160"/>
+              <w:rPr/>
+            </w:pPr>
+            <w:r>
+              <w:rPr>
+                <w:rStyle w:val="Strong"/>
+                <w:rFonts w:ascii="times new roman " w:hAnsi="times new roman "/>
+                <w:sz w:val="24"/>
+                <w:szCs w:val="24"/>
+              </w:rPr>
+              <w:t>El sistema debe permitir</w:t>
+            </w:r>
+            <w:r>
+              <w:rPr>
+                <w:rFonts w:ascii="times new roman " w:hAnsi="times new roman "/>
+                <w:sz w:val="24"/>
+                <w:szCs w:val="24"/>
+              </w:rPr>
+              <w:t xml:space="preserve"> capturar la métrica de peso o volumen de los desechos orgánicos recolectados en cada punto de atención.</w:t>
+            </w:r>
+          </w:p>
+        </w:tc>
+      </w:tr>
+    </w:tbl>
+    <w:tbl>
+      <w:tblPr>
+        <w:tblW w:w="8504" w:type="dxa"/>
+        <w:jc w:val="start"/>
+        <w:tblInd w:w="0" w:type="dxa"/>
+        <w:tblLayout w:type="fixed"/>
+        <w:tblCellMar>
+          <w:top w:w="28" w:type="dxa"/>
+          <w:start w:w="28" w:type="dxa"/>
+          <w:bottom w:w="28" w:type="dxa"/>
+          <w:end w:w="28" w:type="dxa"/>
+        </w:tblCellMar>
+      </w:tblPr>
+      <w:tblGrid>
+        <w:gridCol w:w="795"/>
+        <w:gridCol w:w="7709"/>
+      </w:tblGrid>
+      <w:tr>
+        <w:trPr/>
+        <w:tc>
+          <w:tcPr>
+            <w:tcW w:w="795" w:type="dxa"/>
+            <w:tcBorders/>
+            <w:vAlign w:val="center"/>
+          </w:tcPr>
+          <w:p>
+            <w:pPr>
+              <w:pStyle w:val="Contenidodelatabla"/>
+              <w:widowControl w:val="false"/>
+              <w:suppressLineNumbers/>
+              <w:spacing w:before="0" w:after="160"/>
+              <w:rPr/>
+            </w:pPr>
+            <w:r>
+              <w:rPr>
+                <w:rStyle w:val="Strong"/>
+                <w:rFonts w:ascii="times new roman " w:hAnsi="times new roman "/>
+                <w:sz w:val="24"/>
+                <w:szCs w:val="24"/>
+              </w:rPr>
+              <w:t>RF09</w:t>
+            </w:r>
+          </w:p>
+        </w:tc>
+        <w:tc>
+          <w:tcPr>
+            <w:tcW w:w="7709" w:type="dxa"/>
+            <w:tcBorders/>
+            <w:vAlign w:val="center"/>
+          </w:tcPr>
+          <w:p>
+            <w:pPr>
+              <w:pStyle w:val="Contenidodelatabla"/>
+              <w:widowControl w:val="false"/>
+              <w:suppressLineNumbers/>
+              <w:spacing w:before="0" w:after="160"/>
+              <w:rPr/>
+            </w:pPr>
+            <w:r>
+              <w:rPr>
+                <w:rStyle w:val="Strong"/>
+                <w:rFonts w:ascii="times new roman " w:hAnsi="times new roman "/>
+                <w:sz w:val="24"/>
+                <w:szCs w:val="24"/>
+              </w:rPr>
+              <w:t>El sistema debe permitir</w:t>
+            </w:r>
+            <w:r>
+              <w:rPr>
+                <w:rFonts w:ascii="times new roman " w:hAnsi="times new roman "/>
+                <w:sz w:val="24"/>
+                <w:szCs w:val="24"/>
+              </w:rPr>
+              <w:t xml:space="preserve"> reportar y categorizar eventualidades e incidencias operativas durante la ruta (p. ej., cliente ausente, contaminación de residuos).</w:t>
+            </w:r>
+          </w:p>
+        </w:tc>
+      </w:tr>
+    </w:tbl>
+    <w:tbl>
+      <w:tblPr>
+        <w:tblW w:w="8504" w:type="dxa"/>
+        <w:jc w:val="start"/>
+        <w:tblInd w:w="0" w:type="dxa"/>
+        <w:tblLayout w:type="fixed"/>
+        <w:tblCellMar>
+          <w:top w:w="28" w:type="dxa"/>
+          <w:start w:w="28" w:type="dxa"/>
+          <w:bottom w:w="28" w:type="dxa"/>
+          <w:end w:w="28" w:type="dxa"/>
+        </w:tblCellMar>
+      </w:tblPr>
+      <w:tblGrid>
+        <w:gridCol w:w="795"/>
+        <w:gridCol w:w="7709"/>
+      </w:tblGrid>
+      <w:tr>
+        <w:trPr/>
+        <w:tc>
+          <w:tcPr>
+            <w:tcW w:w="795" w:type="dxa"/>
+            <w:tcBorders/>
+            <w:vAlign w:val="center"/>
+          </w:tcPr>
+          <w:p>
+            <w:pPr>
+              <w:pStyle w:val="Contenidodelatabla"/>
+              <w:widowControl w:val="false"/>
+              <w:suppressLineNumbers/>
+              <w:spacing w:before="0" w:after="160"/>
+              <w:rPr/>
+            </w:pPr>
+            <w:r>
+              <w:rPr>
+                <w:rStyle w:val="Strong"/>
+                <w:rFonts w:ascii="times new roman " w:hAnsi="times new roman "/>
+                <w:sz w:val="24"/>
+                <w:szCs w:val="24"/>
+              </w:rPr>
+              <w:t>RF10</w:t>
+            </w:r>
+          </w:p>
+        </w:tc>
+        <w:tc>
+          <w:tcPr>
+            <w:tcW w:w="7709" w:type="dxa"/>
+            <w:tcBorders/>
+            <w:vAlign w:val="center"/>
+          </w:tcPr>
+          <w:p>
+            <w:pPr>
+              <w:pStyle w:val="Contenidodelatabla"/>
+              <w:widowControl w:val="false"/>
+              <w:suppressLineNumbers/>
+              <w:spacing w:before="0" w:after="160"/>
+              <w:rPr/>
+            </w:pPr>
+            <w:r>
+              <w:rPr>
+                <w:rStyle w:val="Strong"/>
+                <w:rFonts w:ascii="times new roman " w:hAnsi="times new roman "/>
+                <w:sz w:val="24"/>
+                <w:szCs w:val="24"/>
+              </w:rPr>
+              <w:t>El sistema debe garantizar</w:t>
+            </w:r>
+            <w:r>
+              <w:rPr>
+                <w:rFonts w:ascii="times new roman " w:hAnsi="times new roman "/>
+                <w:sz w:val="24"/>
+                <w:szCs w:val="24"/>
+              </w:rPr>
+              <w:t xml:space="preserve"> la trazabilidad end-to-end de los lotes de residuos, desde el punto de acopio original hasta su recepción en la planta.</w:t>
+            </w:r>
+          </w:p>
+        </w:tc>
+      </w:tr>
+    </w:tbl>
+    <w:tbl>
+      <w:tblPr>
+        <w:tblW w:w="8504" w:type="dxa"/>
+        <w:jc w:val="start"/>
+        <w:tblInd w:w="0" w:type="dxa"/>
+        <w:tblLayout w:type="fixed"/>
+        <w:tblCellMar>
+          <w:top w:w="28" w:type="dxa"/>
+          <w:start w:w="28" w:type="dxa"/>
+          <w:bottom w:w="28" w:type="dxa"/>
+          <w:end w:w="28" w:type="dxa"/>
+        </w:tblCellMar>
+      </w:tblPr>
+      <w:tblGrid>
+        <w:gridCol w:w="795"/>
+        <w:gridCol w:w="7709"/>
+      </w:tblGrid>
+      <w:tr>
+        <w:trPr/>
+        <w:tc>
+          <w:tcPr>
+            <w:tcW w:w="795" w:type="dxa"/>
+            <w:tcBorders/>
+            <w:vAlign w:val="center"/>
+          </w:tcPr>
+          <w:p>
+            <w:pPr>
+              <w:pStyle w:val="Contenidodelatabla"/>
+              <w:widowControl w:val="false"/>
+              <w:suppressLineNumbers/>
+              <w:spacing w:before="0" w:after="160"/>
+              <w:rPr/>
+            </w:pPr>
+            <w:r>
+              <w:rPr>
+                <w:rStyle w:val="Strong"/>
+                <w:rFonts w:ascii="times new roman " w:hAnsi="times new roman "/>
+                <w:sz w:val="24"/>
+                <w:szCs w:val="24"/>
+              </w:rPr>
+              <w:t>RF11</w:t>
+            </w:r>
+          </w:p>
+        </w:tc>
+        <w:tc>
+          <w:tcPr>
+            <w:tcW w:w="7709" w:type="dxa"/>
+            <w:tcBorders/>
+            <w:vAlign w:val="center"/>
+          </w:tcPr>
+          <w:p>
+            <w:pPr>
+              <w:pStyle w:val="Contenidodelatabla"/>
+              <w:widowControl w:val="false"/>
+              <w:suppressLineNumbers/>
+              <w:spacing w:before="0" w:after="160"/>
+              <w:rPr/>
+            </w:pPr>
+            <w:r>
+              <w:rPr>
+                <w:rStyle w:val="Strong"/>
+                <w:rFonts w:ascii="times new roman " w:hAnsi="times new roman "/>
+                <w:sz w:val="24"/>
+                <w:szCs w:val="24"/>
+              </w:rPr>
+              <w:t>El sistema debe permitir</w:t>
+            </w:r>
+            <w:r>
+              <w:rPr>
+                <w:rFonts w:ascii="times new roman " w:hAnsi="times new roman "/>
+                <w:sz w:val="24"/>
+                <w:szCs w:val="24"/>
+              </w:rPr>
+              <w:t xml:space="preserve"> validar y registrar la recepción de los cargamentos de residuos al momento de su ingreso a la planta de compostaje.</w:t>
+            </w:r>
+          </w:p>
+        </w:tc>
+      </w:tr>
+    </w:tbl>
+    <w:tbl>
+      <w:tblPr>
+        <w:tblW w:w="8504" w:type="dxa"/>
+        <w:jc w:val="start"/>
+        <w:tblInd w:w="0" w:type="dxa"/>
+        <w:tblLayout w:type="fixed"/>
+        <w:tblCellMar>
+          <w:top w:w="28" w:type="dxa"/>
+          <w:start w:w="28" w:type="dxa"/>
+          <w:bottom w:w="28" w:type="dxa"/>
+          <w:end w:w="28" w:type="dxa"/>
+        </w:tblCellMar>
+      </w:tblPr>
+      <w:tblGrid>
+        <w:gridCol w:w="795"/>
+        <w:gridCol w:w="7709"/>
+      </w:tblGrid>
+      <w:tr>
+        <w:trPr/>
+        <w:tc>
+          <w:tcPr>
+            <w:tcW w:w="795" w:type="dxa"/>
+            <w:tcBorders/>
+            <w:vAlign w:val="center"/>
+          </w:tcPr>
+          <w:p>
+            <w:pPr>
+              <w:pStyle w:val="Contenidodelatabla"/>
+              <w:widowControl w:val="false"/>
+              <w:suppressLineNumbers/>
+              <w:spacing w:before="0" w:after="160"/>
+              <w:rPr/>
+            </w:pPr>
+            <w:r>
+              <w:rPr>
+                <w:rStyle w:val="Strong"/>
+                <w:rFonts w:ascii="times new roman " w:hAnsi="times new roman "/>
+                <w:sz w:val="24"/>
+                <w:szCs w:val="24"/>
+              </w:rPr>
+              <w:t>RF12</w:t>
+            </w:r>
+          </w:p>
+        </w:tc>
+        <w:tc>
+          <w:tcPr>
+            <w:tcW w:w="7709" w:type="dxa"/>
+            <w:tcBorders/>
+            <w:vAlign w:val="center"/>
+          </w:tcPr>
+          <w:p>
+            <w:pPr>
+              <w:pStyle w:val="Contenidodelatabla"/>
+              <w:widowControl w:val="false"/>
+              <w:suppressLineNumbers/>
+              <w:spacing w:before="0" w:after="160"/>
+              <w:rPr/>
+            </w:pPr>
+            <w:r>
+              <w:rPr>
+                <w:rStyle w:val="Strong"/>
+                <w:rFonts w:ascii="times new roman " w:hAnsi="times new roman "/>
+                <w:sz w:val="24"/>
+                <w:szCs w:val="24"/>
+              </w:rPr>
+              <w:t>El sistema debe permitir</w:t>
+            </w:r>
+            <w:r>
+              <w:rPr>
+                <w:rFonts w:ascii="times new roman " w:hAnsi="times new roman "/>
+                <w:sz w:val="24"/>
+                <w:szCs w:val="24"/>
+              </w:rPr>
+              <w:t xml:space="preserve"> dar seguimiento al flujo de trabajo y evolución de cada lote a lo largo de las distintas etapas del tratamiento orgánico.</w:t>
+            </w:r>
+          </w:p>
+        </w:tc>
+      </w:tr>
+    </w:tbl>
+    <w:tbl>
+      <w:tblPr>
+        <w:tblW w:w="8504" w:type="dxa"/>
+        <w:jc w:val="start"/>
+        <w:tblInd w:w="0" w:type="dxa"/>
+        <w:tblLayout w:type="fixed"/>
+        <w:tblCellMar>
+          <w:top w:w="28" w:type="dxa"/>
+          <w:start w:w="28" w:type="dxa"/>
+          <w:bottom w:w="28" w:type="dxa"/>
+          <w:end w:w="28" w:type="dxa"/>
+        </w:tblCellMar>
+      </w:tblPr>
+      <w:tblGrid>
+        <w:gridCol w:w="795"/>
+        <w:gridCol w:w="7709"/>
+      </w:tblGrid>
+      <w:tr>
+        <w:trPr/>
+        <w:tc>
+          <w:tcPr>
+            <w:tcW w:w="795" w:type="dxa"/>
+            <w:tcBorders/>
+            <w:vAlign w:val="center"/>
+          </w:tcPr>
+          <w:p>
+            <w:pPr>
+              <w:pStyle w:val="Contenidodelatabla"/>
+              <w:widowControl w:val="false"/>
+              <w:suppressLineNumbers/>
+              <w:spacing w:before="0" w:after="160"/>
+              <w:rPr/>
+            </w:pPr>
+            <w:r>
+              <w:rPr>
+                <w:rStyle w:val="Strong"/>
+                <w:rFonts w:ascii="times new roman " w:hAnsi="times new roman "/>
+                <w:sz w:val="24"/>
+                <w:szCs w:val="24"/>
+              </w:rPr>
+              <w:t>RF13</w:t>
+            </w:r>
+          </w:p>
+        </w:tc>
+        <w:tc>
+          <w:tcPr>
+            <w:tcW w:w="7709" w:type="dxa"/>
+            <w:tcBorders/>
+            <w:vAlign w:val="center"/>
+          </w:tcPr>
+          <w:p>
+            <w:pPr>
+              <w:pStyle w:val="Contenidodelatabla"/>
+              <w:widowControl w:val="false"/>
+              <w:suppressLineNumbers/>
+              <w:spacing w:before="0" w:after="160"/>
+              <w:rPr/>
+            </w:pPr>
+            <w:r>
+              <w:rPr>
+                <w:rStyle w:val="Strong"/>
+                <w:rFonts w:ascii="times new roman " w:hAnsi="times new roman "/>
+                <w:sz w:val="24"/>
+                <w:szCs w:val="24"/>
+              </w:rPr>
+              <w:t>El sistema debe permitir</w:t>
+            </w:r>
+            <w:r>
+              <w:rPr>
+                <w:rFonts w:ascii="times new roman " w:hAnsi="times new roman "/>
+                <w:sz w:val="24"/>
+                <w:szCs w:val="24"/>
+              </w:rPr>
+              <w:t xml:space="preserve"> consolidar el volumen de compost final obtenido al término del ciclo de procesamiento de cada lote.</w:t>
+            </w:r>
+          </w:p>
+        </w:tc>
+      </w:tr>
+    </w:tbl>
+    <w:tbl>
+      <w:tblPr>
+        <w:tblW w:w="8504" w:type="dxa"/>
+        <w:jc w:val="start"/>
+        <w:tblInd w:w="0" w:type="dxa"/>
+        <w:tblLayout w:type="fixed"/>
+        <w:tblCellMar>
+          <w:top w:w="28" w:type="dxa"/>
+          <w:start w:w="28" w:type="dxa"/>
+          <w:bottom w:w="28" w:type="dxa"/>
+          <w:end w:w="28" w:type="dxa"/>
+        </w:tblCellMar>
+      </w:tblPr>
+      <w:tblGrid>
+        <w:gridCol w:w="795"/>
+        <w:gridCol w:w="7709"/>
+      </w:tblGrid>
+      <w:tr>
+        <w:trPr/>
+        <w:tc>
+          <w:tcPr>
+            <w:tcW w:w="795" w:type="dxa"/>
+            <w:tcBorders/>
+            <w:vAlign w:val="center"/>
+          </w:tcPr>
+          <w:p>
+            <w:pPr>
+              <w:pStyle w:val="Contenidodelatabla"/>
+              <w:widowControl w:val="false"/>
+              <w:suppressLineNumbers/>
+              <w:spacing w:before="0" w:after="160"/>
+              <w:rPr/>
+            </w:pPr>
+            <w:r>
+              <w:rPr>
+                <w:rStyle w:val="Strong"/>
+                <w:rFonts w:ascii="times new roman " w:hAnsi="times new roman "/>
+                <w:sz w:val="24"/>
+                <w:szCs w:val="24"/>
+              </w:rPr>
+              <w:t>RF14</w:t>
+            </w:r>
+          </w:p>
+        </w:tc>
+        <w:tc>
+          <w:tcPr>
+            <w:tcW w:w="7709" w:type="dxa"/>
+            <w:tcBorders/>
+            <w:vAlign w:val="center"/>
+          </w:tcPr>
+          <w:p>
+            <w:pPr>
+              <w:pStyle w:val="Contenidodelatabla"/>
+              <w:widowControl w:val="false"/>
+              <w:suppressLineNumbers/>
+              <w:spacing w:before="0" w:after="160"/>
+              <w:rPr/>
+            </w:pPr>
+            <w:r>
+              <w:rPr>
+                <w:rStyle w:val="Strong"/>
+                <w:rFonts w:ascii="times new roman " w:hAnsi="times new roman "/>
+                <w:sz w:val="24"/>
+                <w:szCs w:val="24"/>
+              </w:rPr>
+              <w:t>El sistema debe permitir</w:t>
+            </w:r>
+            <w:r>
+              <w:rPr>
+                <w:rFonts w:ascii="times new roman " w:hAnsi="times new roman "/>
+                <w:sz w:val="24"/>
+                <w:szCs w:val="24"/>
+              </w:rPr>
+              <w:t xml:space="preserve"> procesar automáticamente métricas e indicadores ambientales respecto a la tasa de recuperación de materia prima y rendimiento del producto.</w:t>
+            </w:r>
+          </w:p>
+        </w:tc>
+      </w:tr>
+    </w:tbl>
+    <w:tbl>
+      <w:tblPr>
+        <w:tblW w:w="8504" w:type="dxa"/>
+        <w:jc w:val="start"/>
+        <w:tblInd w:w="0" w:type="dxa"/>
+        <w:tblLayout w:type="fixed"/>
+        <w:tblCellMar>
+          <w:top w:w="28" w:type="dxa"/>
+          <w:start w:w="28" w:type="dxa"/>
+          <w:bottom w:w="28" w:type="dxa"/>
+          <w:end w:w="28" w:type="dxa"/>
+        </w:tblCellMar>
+      </w:tblPr>
+      <w:tblGrid>
+        <w:gridCol w:w="795"/>
+        <w:gridCol w:w="7709"/>
+      </w:tblGrid>
+      <w:tr>
+        <w:trPr/>
+        <w:tc>
+          <w:tcPr>
+            <w:tcW w:w="795" w:type="dxa"/>
+            <w:tcBorders/>
+            <w:vAlign w:val="center"/>
+          </w:tcPr>
+          <w:p>
+            <w:pPr>
+              <w:pStyle w:val="Contenidodelatabla"/>
+              <w:widowControl w:val="false"/>
+              <w:suppressLineNumbers/>
+              <w:spacing w:before="0" w:after="160"/>
+              <w:rPr/>
+            </w:pPr>
+            <w:r>
+              <w:rPr>
+                <w:rStyle w:val="Strong"/>
+                <w:rFonts w:ascii="times new roman " w:hAnsi="times new roman "/>
+                <w:sz w:val="24"/>
+                <w:szCs w:val="24"/>
+              </w:rPr>
+              <w:t>RF15</w:t>
+            </w:r>
+          </w:p>
+        </w:tc>
+        <w:tc>
+          <w:tcPr>
+            <w:tcW w:w="7709" w:type="dxa"/>
+            <w:tcBorders/>
+            <w:vAlign w:val="center"/>
+          </w:tcPr>
+          <w:p>
+            <w:pPr>
+              <w:pStyle w:val="Contenidodelatabla"/>
+              <w:widowControl w:val="false"/>
+              <w:suppressLineNumbers/>
+              <w:spacing w:before="0" w:after="160"/>
+              <w:rPr/>
+            </w:pPr>
+            <w:r>
+              <w:rPr>
+                <w:rStyle w:val="Strong"/>
+                <w:rFonts w:ascii="times new roman " w:hAnsi="times new roman "/>
+                <w:sz w:val="24"/>
+                <w:szCs w:val="24"/>
+              </w:rPr>
+              <w:t>El sistema debe permitir</w:t>
+            </w:r>
+            <w:r>
+              <w:rPr>
+                <w:rFonts w:ascii="times new roman " w:hAnsi="times new roman "/>
+                <w:sz w:val="24"/>
+                <w:szCs w:val="24"/>
+              </w:rPr>
+              <w:t xml:space="preserve"> consolidar reportes consolidados de recolección parametrizables por rango de fechas, zonas geográficas y segmento de usuario.</w:t>
+            </w:r>
+          </w:p>
+        </w:tc>
+      </w:tr>
+    </w:tbl>
+    <w:tbl>
+      <w:tblPr>
+        <w:tblW w:w="8504" w:type="dxa"/>
+        <w:jc w:val="start"/>
+        <w:tblInd w:w="0" w:type="dxa"/>
+        <w:tblLayout w:type="fixed"/>
+        <w:tblCellMar>
+          <w:top w:w="28" w:type="dxa"/>
+          <w:start w:w="28" w:type="dxa"/>
+          <w:bottom w:w="28" w:type="dxa"/>
+          <w:end w:w="28" w:type="dxa"/>
+        </w:tblCellMar>
+      </w:tblPr>
+      <w:tblGrid>
+        <w:gridCol w:w="795"/>
+        <w:gridCol w:w="7709"/>
+      </w:tblGrid>
+      <w:tr>
+        <w:trPr/>
+        <w:tc>
+          <w:tcPr>
+            <w:tcW w:w="795" w:type="dxa"/>
+            <w:tcBorders/>
+            <w:vAlign w:val="center"/>
+          </w:tcPr>
+          <w:p>
+            <w:pPr>
+              <w:pStyle w:val="Contenidodelatabla"/>
+              <w:widowControl w:val="false"/>
+              <w:suppressLineNumbers/>
+              <w:spacing w:before="0" w:after="160"/>
+              <w:rPr/>
+            </w:pPr>
+            <w:r>
+              <w:rPr>
+                <w:rStyle w:val="Strong"/>
+                <w:rFonts w:ascii="times new roman " w:hAnsi="times new roman "/>
+                <w:sz w:val="24"/>
+                <w:szCs w:val="24"/>
+              </w:rPr>
+              <w:t>RF16</w:t>
+            </w:r>
+          </w:p>
+        </w:tc>
+        <w:tc>
+          <w:tcPr>
+            <w:tcW w:w="7709" w:type="dxa"/>
+            <w:tcBorders/>
+            <w:vAlign w:val="center"/>
+          </w:tcPr>
+          <w:p>
+            <w:pPr>
+              <w:pStyle w:val="Contenidodelatabla"/>
+              <w:widowControl w:val="false"/>
+              <w:suppressLineNumbers/>
+              <w:spacing w:before="0" w:after="160"/>
+              <w:rPr/>
+            </w:pPr>
+            <w:r>
+              <w:rPr>
+                <w:rStyle w:val="Strong"/>
+                <w:rFonts w:ascii="times new roman " w:hAnsi="times new roman "/>
+                <w:sz w:val="24"/>
+                <w:szCs w:val="24"/>
+              </w:rPr>
+              <w:t>El sistema debe permitir</w:t>
+            </w:r>
+            <w:r>
+              <w:rPr>
+                <w:rFonts w:ascii="times new roman " w:hAnsi="times new roman "/>
+                <w:sz w:val="24"/>
+                <w:szCs w:val="24"/>
+              </w:rPr>
+              <w:t xml:space="preserve"> generar informes analíticos sobre el comportamiento de las fases de compostaje y los niveles de producción alcanzados.</w:t>
+            </w:r>
+          </w:p>
+        </w:tc>
+      </w:tr>
+    </w:tbl>
+    <w:tbl>
+      <w:tblPr>
+        <w:tblW w:w="8504" w:type="dxa"/>
+        <w:jc w:val="start"/>
+        <w:tblInd w:w="0" w:type="dxa"/>
+        <w:tblLayout w:type="fixed"/>
+        <w:tblCellMar>
+          <w:top w:w="28" w:type="dxa"/>
+          <w:start w:w="28" w:type="dxa"/>
+          <w:bottom w:w="28" w:type="dxa"/>
+          <w:end w:w="28" w:type="dxa"/>
+        </w:tblCellMar>
+      </w:tblPr>
+      <w:tblGrid>
+        <w:gridCol w:w="795"/>
+        <w:gridCol w:w="7709"/>
+      </w:tblGrid>
+      <w:tr>
+        <w:trPr/>
+        <w:tc>
+          <w:tcPr>
+            <w:tcW w:w="795" w:type="dxa"/>
+            <w:tcBorders/>
+            <w:vAlign w:val="center"/>
+          </w:tcPr>
+          <w:p>
+            <w:pPr>
+              <w:pStyle w:val="Contenidodelatabla"/>
+              <w:widowControl w:val="false"/>
+              <w:suppressLineNumbers/>
+              <w:spacing w:before="0" w:after="160"/>
+              <w:rPr/>
+            </w:pPr>
+            <w:r>
+              <w:rPr>
+                <w:rStyle w:val="Strong"/>
+                <w:rFonts w:ascii="times new roman " w:hAnsi="times new roman "/>
+                <w:sz w:val="24"/>
+                <w:szCs w:val="24"/>
+              </w:rPr>
+              <w:t>RF17</w:t>
+            </w:r>
+          </w:p>
+        </w:tc>
+        <w:tc>
+          <w:tcPr>
+            <w:tcW w:w="7709" w:type="dxa"/>
+            <w:tcBorders/>
+            <w:vAlign w:val="center"/>
+          </w:tcPr>
+          <w:p>
+            <w:pPr>
+              <w:pStyle w:val="Contenidodelatabla"/>
+              <w:widowControl w:val="false"/>
+              <w:suppressLineNumbers/>
+              <w:spacing w:before="0" w:after="160"/>
+              <w:rPr/>
+            </w:pPr>
+            <w:r>
+              <w:rPr>
+                <w:rStyle w:val="Strong"/>
+                <w:rFonts w:ascii="times new roman " w:hAnsi="times new roman "/>
+                <w:sz w:val="24"/>
+                <w:szCs w:val="24"/>
+              </w:rPr>
+              <w:t>El sistema debe permitir</w:t>
+            </w:r>
+            <w:r>
+              <w:rPr>
+                <w:rFonts w:ascii="times new roman " w:hAnsi="times new roman "/>
+                <w:sz w:val="24"/>
+                <w:szCs w:val="24"/>
+              </w:rPr>
+              <w:t xml:space="preserve"> proveer un portal de autoconsulta para que los clientes revisen su historial de entregas e interacciones con el servicio.</w:t>
+            </w:r>
+          </w:p>
+        </w:tc>
+      </w:tr>
+    </w:tbl>
+    <w:tbl>
+      <w:tblPr>
+        <w:tblW w:w="8504" w:type="dxa"/>
+        <w:jc w:val="start"/>
+        <w:tblInd w:w="0" w:type="dxa"/>
+        <w:tblLayout w:type="fixed"/>
+        <w:tblCellMar>
+          <w:top w:w="28" w:type="dxa"/>
+          <w:start w:w="28" w:type="dxa"/>
+          <w:bottom w:w="28" w:type="dxa"/>
+          <w:end w:w="28" w:type="dxa"/>
+        </w:tblCellMar>
+      </w:tblPr>
+      <w:tblGrid>
+        <w:gridCol w:w="795"/>
+        <w:gridCol w:w="7709"/>
+      </w:tblGrid>
+      <w:tr>
+        <w:trPr/>
+        <w:tc>
+          <w:tcPr>
+            <w:tcW w:w="795" w:type="dxa"/>
+            <w:tcBorders/>
+            <w:vAlign w:val="center"/>
+          </w:tcPr>
+          <w:p>
+            <w:pPr>
+              <w:pStyle w:val="Contenidodelatabla"/>
+              <w:widowControl w:val="false"/>
+              <w:suppressLineNumbers/>
+              <w:spacing w:before="0" w:after="160"/>
+              <w:rPr/>
+            </w:pPr>
+            <w:r>
+              <w:rPr>
+                <w:rStyle w:val="Strong"/>
+                <w:rFonts w:ascii="times new roman " w:hAnsi="times new roman "/>
+                <w:sz w:val="24"/>
+                <w:szCs w:val="24"/>
+              </w:rPr>
+              <w:t>RF18</w:t>
+            </w:r>
+          </w:p>
+        </w:tc>
+        <w:tc>
+          <w:tcPr>
+            <w:tcW w:w="7709" w:type="dxa"/>
+            <w:tcBorders/>
+            <w:vAlign w:val="center"/>
+          </w:tcPr>
+          <w:p>
+            <w:pPr>
+              <w:pStyle w:val="Contenidodelatabla"/>
+              <w:widowControl w:val="false"/>
+              <w:suppressLineNumbers/>
+              <w:spacing w:before="0" w:after="160"/>
+              <w:rPr/>
+            </w:pPr>
+            <w:r>
+              <w:rPr>
+                <w:rStyle w:val="Strong"/>
+                <w:rFonts w:ascii="times new roman " w:hAnsi="times new roman "/>
+                <w:sz w:val="24"/>
+                <w:szCs w:val="24"/>
+              </w:rPr>
+              <w:t>El sistema debe permitir</w:t>
+            </w:r>
+            <w:r>
+              <w:rPr>
+                <w:rFonts w:ascii="times new roman " w:hAnsi="times new roman "/>
+                <w:sz w:val="24"/>
+                <w:szCs w:val="24"/>
+              </w:rPr>
+              <w:t xml:space="preserve"> visualizar el impacto ambiental individualizado del cliente en la economía circular mediante dashboards con métricas personalizadas.</w:t>
+            </w:r>
+          </w:p>
+        </w:tc>
+      </w:tr>
+    </w:tbl>
+    <w:tbl>
+      <w:tblPr>
+        <w:tblW w:w="8504" w:type="dxa"/>
+        <w:jc w:val="start"/>
+        <w:tblInd w:w="0" w:type="dxa"/>
+        <w:tblLayout w:type="fixed"/>
+        <w:tblCellMar>
+          <w:top w:w="28" w:type="dxa"/>
+          <w:start w:w="28" w:type="dxa"/>
+          <w:bottom w:w="28" w:type="dxa"/>
+          <w:end w:w="28" w:type="dxa"/>
+        </w:tblCellMar>
+      </w:tblPr>
+      <w:tblGrid>
+        <w:gridCol w:w="795"/>
+        <w:gridCol w:w="7709"/>
+      </w:tblGrid>
+      <w:tr>
+        <w:trPr/>
+        <w:tc>
+          <w:tcPr>
+            <w:tcW w:w="795" w:type="dxa"/>
+            <w:tcBorders/>
+            <w:vAlign w:val="center"/>
+          </w:tcPr>
+          <w:p>
+            <w:pPr>
+              <w:pStyle w:val="Contenidodelatabla"/>
+              <w:widowControl w:val="false"/>
+              <w:suppressLineNumbers/>
+              <w:spacing w:before="0" w:after="160"/>
+              <w:rPr/>
+            </w:pPr>
+            <w:r>
+              <w:rPr>
+                <w:rStyle w:val="Strong"/>
+                <w:rFonts w:ascii="times new roman " w:hAnsi="times new roman "/>
+                <w:sz w:val="24"/>
+                <w:szCs w:val="24"/>
+              </w:rPr>
+              <w:t>RF19</w:t>
+            </w:r>
+          </w:p>
+        </w:tc>
+        <w:tc>
+          <w:tcPr>
+            <w:tcW w:w="7709" w:type="dxa"/>
+            <w:tcBorders/>
+            <w:vAlign w:val="center"/>
+          </w:tcPr>
+          <w:p>
+            <w:pPr>
+              <w:pStyle w:val="Contenidodelatabla"/>
+              <w:widowControl w:val="false"/>
+              <w:suppressLineNumbers/>
+              <w:spacing w:before="0" w:after="160"/>
+              <w:rPr/>
+            </w:pPr>
+            <w:r>
+              <w:rPr>
+                <w:rStyle w:val="Strong"/>
+                <w:rFonts w:ascii="times new roman " w:hAnsi="times new roman "/>
+                <w:sz w:val="24"/>
+                <w:szCs w:val="24"/>
+              </w:rPr>
+              <w:t>El sistema debe permitir</w:t>
+            </w:r>
+            <w:r>
+              <w:rPr>
+                <w:rFonts w:ascii="times new roman " w:hAnsi="times new roman "/>
+                <w:sz w:val="24"/>
+                <w:szCs w:val="24"/>
+              </w:rPr>
+              <w:t xml:space="preserve"> controlar el acceso, la autenticación y la gestión del ciclo de vida de usuarios, roles y matriz de permisos.</w:t>
+            </w:r>
+          </w:p>
+        </w:tc>
+      </w:tr>
+    </w:tbl>
+    <w:tbl>
+      <w:tblPr>
+        <w:tblW w:w="8504" w:type="dxa"/>
+        <w:jc w:val="start"/>
+        <w:tblInd w:w="0" w:type="dxa"/>
+        <w:tblLayout w:type="fixed"/>
+        <w:tblCellMar>
+          <w:top w:w="28" w:type="dxa"/>
+          <w:start w:w="28" w:type="dxa"/>
+          <w:bottom w:w="28" w:type="dxa"/>
+          <w:end w:w="28" w:type="dxa"/>
+        </w:tblCellMar>
+      </w:tblPr>
+      <w:tblGrid>
+        <w:gridCol w:w="795"/>
+        <w:gridCol w:w="7709"/>
+      </w:tblGrid>
+      <w:tr>
+        <w:trPr/>
+        <w:tc>
+          <w:tcPr>
+            <w:tcW w:w="795" w:type="dxa"/>
+            <w:tcBorders/>
+            <w:vAlign w:val="center"/>
+          </w:tcPr>
+          <w:p>
+            <w:pPr>
+              <w:pStyle w:val="Contenidodelatabla"/>
+              <w:widowControl w:val="false"/>
+              <w:suppressLineNumbers/>
+              <w:spacing w:before="0" w:after="160"/>
+              <w:rPr/>
+            </w:pPr>
+            <w:r>
+              <w:rPr>
+                <w:rStyle w:val="Strong"/>
+                <w:rFonts w:ascii="times new roman " w:hAnsi="times new roman "/>
+                <w:sz w:val="24"/>
+                <w:szCs w:val="24"/>
+              </w:rPr>
+              <w:t>RF20</w:t>
+            </w:r>
+          </w:p>
+        </w:tc>
+        <w:tc>
+          <w:tcPr>
+            <w:tcW w:w="7709" w:type="dxa"/>
+            <w:tcBorders/>
+            <w:vAlign w:val="center"/>
+          </w:tcPr>
+          <w:p>
+            <w:pPr>
+              <w:pStyle w:val="Contenidodelatabla"/>
+              <w:widowControl w:val="false"/>
+              <w:suppressLineNumbers/>
+              <w:spacing w:before="0" w:after="160"/>
+              <w:rPr/>
+            </w:pPr>
+            <w:r>
+              <w:rPr>
+                <w:rStyle w:val="Strong"/>
+                <w:rFonts w:ascii="times new roman " w:hAnsi="times new roman "/>
+                <w:sz w:val="24"/>
+                <w:szCs w:val="24"/>
+              </w:rPr>
+              <w:t>El sistema debe permitir</w:t>
+            </w:r>
+            <w:r>
+              <w:rPr>
+                <w:rFonts w:ascii="times new roman " w:hAnsi="times new roman "/>
+                <w:sz w:val="24"/>
+                <w:szCs w:val="24"/>
+              </w:rPr>
+              <w:t xml:space="preserve"> descargar informes sobre el impacto ambiental en PDF o Excel para presentarlos fácil ante las revisiones del gobierno.</w:t>
+            </w:r>
+          </w:p>
+        </w:tc>
+      </w:tr>
+    </w:tbl>
+    <w:tbl>
+      <w:tblPr>
+        <w:tblW w:w="8504" w:type="dxa"/>
+        <w:jc w:val="start"/>
+        <w:tblInd w:w="0" w:type="dxa"/>
+        <w:tblLayout w:type="fixed"/>
+        <w:tblCellMar>
+          <w:top w:w="28" w:type="dxa"/>
+          <w:start w:w="28" w:type="dxa"/>
+          <w:bottom w:w="28" w:type="dxa"/>
+          <w:end w:w="28" w:type="dxa"/>
+        </w:tblCellMar>
+      </w:tblPr>
+      <w:tblGrid>
+        <w:gridCol w:w="795"/>
+        <w:gridCol w:w="7709"/>
+      </w:tblGrid>
+      <w:tr>
+        <w:trPr/>
+        <w:tc>
+          <w:tcPr>
+            <w:tcW w:w="795" w:type="dxa"/>
+            <w:tcBorders/>
+            <w:vAlign w:val="center"/>
+          </w:tcPr>
+          <w:p>
+            <w:pPr>
+              <w:pStyle w:val="Contenidodelatabla"/>
+              <w:widowControl w:val="false"/>
+              <w:suppressLineNumbers/>
+              <w:spacing w:before="0" w:after="160"/>
+              <w:rPr/>
+            </w:pPr>
+            <w:r>
+              <w:rPr>
+                <w:rStyle w:val="Strong"/>
+                <w:rFonts w:ascii="times new roman " w:hAnsi="times new roman "/>
+                <w:sz w:val="24"/>
+                <w:szCs w:val="24"/>
+              </w:rPr>
+              <w:t>RF21</w:t>
+            </w:r>
+          </w:p>
+        </w:tc>
+        <w:tc>
+          <w:tcPr>
+            <w:tcW w:w="7709" w:type="dxa"/>
+            <w:tcBorders/>
+            <w:vAlign w:val="center"/>
+          </w:tcPr>
+          <w:p>
+            <w:pPr>
+              <w:pStyle w:val="Contenidodelatabla"/>
+              <w:widowControl w:val="false"/>
+              <w:suppressLineNumbers/>
+              <w:spacing w:before="0" w:after="160"/>
+              <w:rPr/>
+            </w:pPr>
+            <w:r>
+              <w:rPr>
+                <w:rStyle w:val="Strong"/>
+                <w:rFonts w:ascii="times new roman " w:hAnsi="times new roman "/>
+                <w:sz w:val="24"/>
+                <w:szCs w:val="24"/>
+              </w:rPr>
+              <w:t>El sistema debe permitir</w:t>
+            </w:r>
+            <w:r>
+              <w:rPr>
+                <w:rFonts w:ascii="times new roman " w:hAnsi="times new roman "/>
+                <w:sz w:val="24"/>
+                <w:szCs w:val="24"/>
+              </w:rPr>
+              <w:t xml:space="preserve"> publicar la disponibilidad de inventario de compost terminado para la consulta de clientes corporativos e interesados.</w:t>
+            </w:r>
+          </w:p>
+        </w:tc>
+      </w:tr>
+    </w:tbl>
+    <w:tbl>
+      <w:tblPr>
+        <w:tblW w:w="8504" w:type="dxa"/>
+        <w:jc w:val="start"/>
+        <w:tblInd w:w="0" w:type="dxa"/>
+        <w:tblLayout w:type="fixed"/>
+        <w:tblCellMar>
+          <w:top w:w="28" w:type="dxa"/>
+          <w:start w:w="28" w:type="dxa"/>
+          <w:bottom w:w="28" w:type="dxa"/>
+          <w:end w:w="28" w:type="dxa"/>
+        </w:tblCellMar>
+      </w:tblPr>
+      <w:tblGrid>
+        <w:gridCol w:w="795"/>
+        <w:gridCol w:w="7709"/>
+      </w:tblGrid>
+      <w:tr>
+        <w:trPr/>
+        <w:tc>
+          <w:tcPr>
+            <w:tcW w:w="795" w:type="dxa"/>
+            <w:tcBorders/>
+            <w:vAlign w:val="center"/>
+          </w:tcPr>
+          <w:p>
+            <w:pPr>
+              <w:pStyle w:val="Contenidodelatabla"/>
+              <w:widowControl w:val="false"/>
+              <w:suppressLineNumbers/>
+              <w:spacing w:before="0" w:after="160"/>
+              <w:rPr/>
+            </w:pPr>
+            <w:r>
+              <w:rPr>
+                <w:rStyle w:val="Strong"/>
+                <w:rFonts w:ascii="times new roman " w:hAnsi="times new roman "/>
+                <w:sz w:val="24"/>
+                <w:szCs w:val="24"/>
+              </w:rPr>
+              <w:t>RF22</w:t>
+            </w:r>
+          </w:p>
+        </w:tc>
+        <w:tc>
+          <w:tcPr>
+            <w:tcW w:w="7709" w:type="dxa"/>
+            <w:tcBorders/>
+            <w:vAlign w:val="center"/>
+          </w:tcPr>
+          <w:p>
+            <w:pPr>
+              <w:pStyle w:val="Contenidodelatabla"/>
+              <w:widowControl w:val="false"/>
+              <w:suppressLineNumbers/>
+              <w:spacing w:before="0" w:after="160"/>
+              <w:rPr/>
+            </w:pPr>
+            <w:r>
+              <w:rPr>
+                <w:rStyle w:val="Strong"/>
+                <w:rFonts w:ascii="times new roman " w:hAnsi="times new roman "/>
+                <w:sz w:val="24"/>
+                <w:szCs w:val="24"/>
+              </w:rPr>
+              <w:t>El sistema debe permitir</w:t>
+            </w:r>
+            <w:r>
+              <w:rPr>
+                <w:rFonts w:ascii="times new roman " w:hAnsi="times new roman "/>
+                <w:sz w:val="24"/>
+                <w:szCs w:val="24"/>
+              </w:rPr>
+              <w:t xml:space="preserve"> recibir y gestionar las solicitudes formales de adquisición de compost emitidas por empresas interesadas.</w:t>
+            </w:r>
+          </w:p>
+        </w:tc>
+      </w:tr>
+    </w:tbl>
+    <w:tbl>
+      <w:tblPr>
+        <w:tblW w:w="8504" w:type="dxa"/>
+        <w:jc w:val="start"/>
+        <w:tblInd w:w="0" w:type="dxa"/>
+        <w:tblLayout w:type="fixed"/>
+        <w:tblCellMar>
+          <w:top w:w="28" w:type="dxa"/>
+          <w:start w:w="28" w:type="dxa"/>
+          <w:bottom w:w="28" w:type="dxa"/>
+          <w:end w:w="28" w:type="dxa"/>
+        </w:tblCellMar>
+      </w:tblPr>
+      <w:tblGrid>
+        <w:gridCol w:w="795"/>
+        <w:gridCol w:w="7709"/>
+      </w:tblGrid>
+      <w:tr>
+        <w:trPr/>
+        <w:tc>
+          <w:tcPr>
+            <w:tcW w:w="795" w:type="dxa"/>
+            <w:tcBorders/>
+            <w:vAlign w:val="center"/>
+          </w:tcPr>
+          <w:p>
+            <w:pPr>
+              <w:pStyle w:val="Contenidodelatabla"/>
+              <w:widowControl w:val="false"/>
+              <w:suppressLineNumbers/>
+              <w:spacing w:before="0" w:after="160"/>
+              <w:rPr/>
+            </w:pPr>
+            <w:r>
+              <w:rPr>
+                <w:rStyle w:val="Strong"/>
+                <w:rFonts w:ascii="times new roman " w:hAnsi="times new roman "/>
+                <w:sz w:val="24"/>
+                <w:szCs w:val="24"/>
+              </w:rPr>
+              <w:t>RF23</w:t>
+            </w:r>
+          </w:p>
+        </w:tc>
+        <w:tc>
+          <w:tcPr>
+            <w:tcW w:w="7709" w:type="dxa"/>
+            <w:tcBorders/>
+            <w:vAlign w:val="center"/>
+          </w:tcPr>
+          <w:p>
+            <w:pPr>
+              <w:pStyle w:val="Contenidodelatabla"/>
+              <w:widowControl w:val="false"/>
+              <w:suppressLineNumbers/>
+              <w:spacing w:before="0" w:after="160"/>
+              <w:rPr/>
+            </w:pPr>
+            <w:r>
+              <w:rPr>
+                <w:rStyle w:val="Strong"/>
+                <w:rFonts w:ascii="times new roman " w:hAnsi="times new roman "/>
+                <w:sz w:val="24"/>
+                <w:szCs w:val="24"/>
+              </w:rPr>
+              <w:t>El sistema debe permitir</w:t>
+            </w:r>
+            <w:r>
+              <w:rPr>
+                <w:rFonts w:ascii="times new roman " w:hAnsi="times new roman "/>
+                <w:sz w:val="24"/>
+                <w:szCs w:val="24"/>
+              </w:rPr>
+              <w:t xml:space="preserve"> controlar qué puede hacer cada usuario en el sistema según su puesto (Administrador, Operador, Técnico o Cliente), para que cada persona solo entre a las partes que le corresponden.</w:t>
+            </w:r>
+          </w:p>
+        </w:tc>
+      </w:tr>
+    </w:tbl>
+    <w:p>
+      <w:pPr>
+        <w:pStyle w:val="BodyText"/>
+        <w:pBdr/>
+        <w:bidi w:val="0"/>
+        <w:spacing w:lineRule="auto" w:line="331" w:before="0" w:after="240"/>
+        <w:ind w:hanging="0" w:start="0" w:end="0"/>
+        <w:rPr>
+          <w:rFonts w:ascii="times new roman " w:hAnsi="times new roman "/>
+          <w:sz w:val="24"/>
+          <w:szCs w:val="24"/>
+        </w:rPr>
+      </w:pPr>
+      <w:r>
+        <w:rPr>
+          <w:rFonts w:ascii="times new roman " w:hAnsi="times new roman "/>
+          <w:sz w:val="24"/>
+          <w:szCs w:val="24"/>
         </w:rPr>
       </w:r>
     </w:p>
     <w:p>
       <w:pPr>
-        <w:pStyle w:val="Normal"/>
-        <w:rPr>
-          <w:rFonts w:ascii="times new roman " w:hAnsi="times new roman "/>
+        <w:pStyle w:val="BodyText"/>
+        <w:pBdr/>
+        <w:bidi w:val="0"/>
+        <w:spacing w:lineRule="auto" w:line="331" w:before="0" w:after="240"/>
+        <w:ind w:hanging="0" w:start="0" w:end="0"/>
+        <w:rPr>
+          <w:rFonts w:ascii="times new roman " w:hAnsi="times new roman "/>
+          <w:b/>
+          <w:bCs/>
+          <w:sz w:val="24"/>
+          <w:szCs w:val="24"/>
         </w:rPr>
       </w:pPr>
       <w:r>
         <w:rPr>
           <w:rFonts w:ascii="times new roman " w:hAnsi="times new roman "/>
-        </w:rPr>
+          <w:b/>
+          <w:bCs/>
+          <w:sz w:val="24"/>
+          <w:szCs w:val="24"/>
+        </w:rPr>
+        <w:t>2.2 Requisitos No Funcionales</w:t>
       </w:r>
     </w:p>
     <w:p>
       <w:pPr>
-        <w:pStyle w:val="Normal"/>
-        <w:spacing w:before="0" w:after="160"/>
-        <w:rPr>
-          <w:rFonts w:ascii="times new roman " w:hAnsi="times new roman "/>
+        <w:pStyle w:val="BodyText"/>
+        <w:pBdr/>
+        <w:bidi w:val="0"/>
+        <w:spacing w:lineRule="auto" w:line="331" w:before="0" w:after="240"/>
+        <w:ind w:hanging="0" w:start="0" w:end="0"/>
+        <w:rPr>
+          <w:rFonts w:ascii="times new roman " w:hAnsi="times new roman "/>
+          <w:b/>
+          <w:bCs/>
+          <w:sz w:val="24"/>
+          <w:szCs w:val="24"/>
         </w:rPr>
       </w:pPr>
       <w:r>
         <w:rPr>
           <w:rFonts w:ascii="times new roman " w:hAnsi="times new roman "/>
+          <w:b/>
+          <w:bCs/>
+          <w:sz w:val="24"/>
+          <w:szCs w:val="24"/>
+        </w:rPr>
+      </w:r>
+    </w:p>
+    <w:tbl>
+      <w:tblPr>
+        <w:tblW w:w="8504" w:type="dxa"/>
+        <w:jc w:val="start"/>
+        <w:tblInd w:w="0" w:type="dxa"/>
+        <w:tblLayout w:type="fixed"/>
+        <w:tblCellMar>
+          <w:top w:w="28" w:type="dxa"/>
+          <w:start w:w="28" w:type="dxa"/>
+          <w:bottom w:w="28" w:type="dxa"/>
+          <w:end w:w="28" w:type="dxa"/>
+        </w:tblCellMar>
+      </w:tblPr>
+      <w:tblGrid>
+        <w:gridCol w:w="1020"/>
+        <w:gridCol w:w="7484"/>
+      </w:tblGrid>
+      <w:tr>
+        <w:trPr/>
+        <w:tc>
+          <w:tcPr>
+            <w:tcW w:w="1020" w:type="dxa"/>
+            <w:tcBorders/>
+            <w:vAlign w:val="center"/>
+          </w:tcPr>
+          <w:p>
+            <w:pPr>
+              <w:pStyle w:val="Ttulodelatabla"/>
+              <w:spacing w:before="0" w:after="160"/>
+              <w:rPr>
+                <w:rFonts w:ascii="times new roman " w:hAnsi="times new roman "/>
+                <w:sz w:val="24"/>
+                <w:szCs w:val="24"/>
+              </w:rPr>
+            </w:pPr>
+            <w:r>
+              <w:rPr>
+                <w:rFonts w:ascii="times new roman " w:hAnsi="times new roman "/>
+                <w:sz w:val="24"/>
+                <w:szCs w:val="24"/>
+              </w:rPr>
+              <w:t>Código</w:t>
+            </w:r>
+          </w:p>
+        </w:tc>
+        <w:tc>
+          <w:tcPr>
+            <w:tcW w:w="7484" w:type="dxa"/>
+            <w:tcBorders/>
+            <w:vAlign w:val="center"/>
+          </w:tcPr>
+          <w:p>
+            <w:pPr>
+              <w:pStyle w:val="Ttulodelatabla"/>
+              <w:spacing w:before="0" w:after="160"/>
+              <w:rPr>
+                <w:rFonts w:ascii="times new roman " w:hAnsi="times new roman "/>
+                <w:sz w:val="24"/>
+                <w:szCs w:val="24"/>
+              </w:rPr>
+            </w:pPr>
+            <w:r>
+              <w:rPr>
+                <w:rFonts w:ascii="times new roman " w:hAnsi="times new roman "/>
+                <w:sz w:val="24"/>
+                <w:szCs w:val="24"/>
+              </w:rPr>
+              <w:t>Requisito No Funcional</w:t>
+            </w:r>
+          </w:p>
+        </w:tc>
+      </w:tr>
+      <w:tr>
+        <w:trPr/>
+        <w:tc>
+          <w:tcPr>
+            <w:tcW w:w="1020" w:type="dxa"/>
+            <w:tcBorders/>
+            <w:vAlign w:val="center"/>
+          </w:tcPr>
+          <w:p>
+            <w:pPr>
+              <w:pStyle w:val="Contenidodelatabla"/>
+              <w:widowControl w:val="false"/>
+              <w:suppressLineNumbers/>
+              <w:spacing w:before="0" w:after="160"/>
+              <w:rPr/>
+            </w:pPr>
+            <w:r>
+              <w:rPr>
+                <w:rStyle w:val="Strong"/>
+                <w:rFonts w:ascii="times new roman " w:hAnsi="times new roman "/>
+                <w:sz w:val="24"/>
+                <w:szCs w:val="24"/>
+              </w:rPr>
+              <w:t>RNF01</w:t>
+            </w:r>
+          </w:p>
+        </w:tc>
+        <w:tc>
+          <w:tcPr>
+            <w:tcW w:w="7484" w:type="dxa"/>
+            <w:tcBorders/>
+            <w:vAlign w:val="center"/>
+          </w:tcPr>
+          <w:p>
+            <w:pPr>
+              <w:pStyle w:val="Contenidodelatabla"/>
+              <w:widowControl w:val="false"/>
+              <w:suppressLineNumbers/>
+              <w:spacing w:before="0" w:after="160"/>
+              <w:rPr/>
+            </w:pPr>
+            <w:r>
+              <w:rPr>
+                <w:rStyle w:val="Strong"/>
+                <w:rFonts w:ascii="times new roman " w:hAnsi="times new roman "/>
+                <w:sz w:val="24"/>
+                <w:szCs w:val="24"/>
+              </w:rPr>
+              <w:t>El sistema debe</w:t>
+            </w:r>
+            <w:r>
+              <w:rPr>
+                <w:rFonts w:ascii="times new roman " w:hAnsi="times new roman "/>
+                <w:sz w:val="24"/>
+                <w:szCs w:val="24"/>
+              </w:rPr>
+              <w:t xml:space="preserve"> implementar un esquema de autenticación obligatorio basado en credenciales únicas (usuario y contraseña) para el ingreso a la plataforma.</w:t>
+            </w:r>
+          </w:p>
+        </w:tc>
+      </w:tr>
+      <w:tr>
+        <w:trPr/>
+        <w:tc>
+          <w:tcPr>
+            <w:tcW w:w="1020" w:type="dxa"/>
+            <w:tcBorders/>
+            <w:vAlign w:val="center"/>
+          </w:tcPr>
+          <w:p>
+            <w:pPr>
+              <w:pStyle w:val="Contenidodelatabla"/>
+              <w:widowControl w:val="false"/>
+              <w:suppressLineNumbers/>
+              <w:spacing w:before="0" w:after="160"/>
+              <w:rPr/>
+            </w:pPr>
+            <w:r>
+              <w:rPr>
+                <w:rStyle w:val="Strong"/>
+                <w:rFonts w:ascii="times new roman " w:hAnsi="times new roman "/>
+                <w:sz w:val="24"/>
+                <w:szCs w:val="24"/>
+              </w:rPr>
+              <w:t>RNF02</w:t>
+            </w:r>
+          </w:p>
+        </w:tc>
+        <w:tc>
+          <w:tcPr>
+            <w:tcW w:w="7484" w:type="dxa"/>
+            <w:tcBorders/>
+            <w:vAlign w:val="center"/>
+          </w:tcPr>
+          <w:p>
+            <w:pPr>
+              <w:pStyle w:val="Contenidodelatabla"/>
+              <w:widowControl w:val="false"/>
+              <w:suppressLineNumbers/>
+              <w:spacing w:before="0" w:after="160"/>
+              <w:rPr/>
+            </w:pPr>
+            <w:r>
+              <w:rPr>
+                <w:rStyle w:val="Strong"/>
+                <w:rFonts w:ascii="times new roman " w:hAnsi="times new roman "/>
+                <w:sz w:val="24"/>
+                <w:szCs w:val="24"/>
+              </w:rPr>
+              <w:t>El sistema debe</w:t>
+            </w:r>
+            <w:r>
+              <w:rPr>
+                <w:rFonts w:ascii="times new roman " w:hAnsi="times new roman "/>
+                <w:sz w:val="24"/>
+                <w:szCs w:val="24"/>
+              </w:rPr>
+              <w:t xml:space="preserve"> garantizar la confidencialidad de la información en tránsito mediante el cifrado del canal de comunicación utilizando el protocolo HTTPS (TLS/SSL).</w:t>
+            </w:r>
+          </w:p>
+        </w:tc>
+      </w:tr>
+      <w:tr>
+        <w:trPr/>
+        <w:tc>
+          <w:tcPr>
+            <w:tcW w:w="1020" w:type="dxa"/>
+            <w:tcBorders/>
+            <w:vAlign w:val="center"/>
+          </w:tcPr>
+          <w:p>
+            <w:pPr>
+              <w:pStyle w:val="Contenidodelatabla"/>
+              <w:widowControl w:val="false"/>
+              <w:suppressLineNumbers/>
+              <w:spacing w:before="0" w:after="160"/>
+              <w:rPr/>
+            </w:pPr>
+            <w:r>
+              <w:rPr>
+                <w:rStyle w:val="Strong"/>
+                <w:rFonts w:ascii="times new roman " w:hAnsi="times new roman "/>
+                <w:sz w:val="24"/>
+                <w:szCs w:val="24"/>
+              </w:rPr>
+              <w:t>RNF03</w:t>
+            </w:r>
+          </w:p>
+        </w:tc>
+        <w:tc>
+          <w:tcPr>
+            <w:tcW w:w="7484" w:type="dxa"/>
+            <w:tcBorders/>
+            <w:vAlign w:val="center"/>
+          </w:tcPr>
+          <w:p>
+            <w:pPr>
+              <w:pStyle w:val="Contenidodelatabla"/>
+              <w:widowControl w:val="false"/>
+              <w:suppressLineNumbers/>
+              <w:spacing w:before="0" w:after="160"/>
+              <w:rPr/>
+            </w:pPr>
+            <w:r>
+              <w:rPr>
+                <w:rStyle w:val="Strong"/>
+                <w:rFonts w:ascii="times new roman " w:hAnsi="times new roman "/>
+                <w:sz w:val="24"/>
+                <w:szCs w:val="24"/>
+              </w:rPr>
+              <w:t>El sistema debe</w:t>
+            </w:r>
+            <w:r>
+              <w:rPr>
+                <w:rFonts w:ascii="times new roman " w:hAnsi="times new roman "/>
+                <w:sz w:val="24"/>
+                <w:szCs w:val="24"/>
+              </w:rPr>
+              <w:t xml:space="preserve"> aplicar algoritmos de hashing y cifrado robustos para el almacenamiento seguro de las contraseñas de los usuarios en la base de datos.</w:t>
+            </w:r>
+          </w:p>
+        </w:tc>
+      </w:tr>
+      <w:tr>
+        <w:trPr/>
+        <w:tc>
+          <w:tcPr>
+            <w:tcW w:w="1020" w:type="dxa"/>
+            <w:tcBorders/>
+            <w:vAlign w:val="center"/>
+          </w:tcPr>
+          <w:p>
+            <w:pPr>
+              <w:pStyle w:val="Contenidodelatabla"/>
+              <w:widowControl w:val="false"/>
+              <w:suppressLineNumbers/>
+              <w:spacing w:before="0" w:after="160"/>
+              <w:rPr/>
+            </w:pPr>
+            <w:r>
+              <w:rPr>
+                <w:rStyle w:val="Strong"/>
+                <w:rFonts w:ascii="times new roman " w:hAnsi="times new roman "/>
+                <w:sz w:val="24"/>
+                <w:szCs w:val="24"/>
+              </w:rPr>
+              <w:t>RNF04</w:t>
+            </w:r>
+          </w:p>
+        </w:tc>
+        <w:tc>
+          <w:tcPr>
+            <w:tcW w:w="7484" w:type="dxa"/>
+            <w:tcBorders/>
+            <w:vAlign w:val="center"/>
+          </w:tcPr>
+          <w:p>
+            <w:pPr>
+              <w:pStyle w:val="Contenidodelatabla"/>
+              <w:widowControl w:val="false"/>
+              <w:suppressLineNumbers/>
+              <w:spacing w:before="0" w:after="160"/>
+              <w:rPr/>
+            </w:pPr>
+            <w:r>
+              <w:rPr>
+                <w:rStyle w:val="Strong"/>
+                <w:rFonts w:ascii="times new roman " w:hAnsi="times new roman "/>
+                <w:sz w:val="24"/>
+                <w:szCs w:val="24"/>
+              </w:rPr>
+              <w:t>El sistema debe</w:t>
+            </w:r>
+            <w:r>
+              <w:rPr>
+                <w:rFonts w:ascii="times new roman " w:hAnsi="times new roman "/>
+                <w:sz w:val="24"/>
+                <w:szCs w:val="24"/>
+              </w:rPr>
+              <w:t xml:space="preserve"> enforzar el principio de menor privilegio mediante un control de acceso basado en roles (RBAC), restringiendo las vistas y funciones según el perfil asignado.</w:t>
+            </w:r>
+          </w:p>
+        </w:tc>
+      </w:tr>
+      <w:tr>
+        <w:trPr/>
+        <w:tc>
+          <w:tcPr>
+            <w:tcW w:w="1020" w:type="dxa"/>
+            <w:tcBorders/>
+            <w:vAlign w:val="center"/>
+          </w:tcPr>
+          <w:p>
+            <w:pPr>
+              <w:pStyle w:val="Contenidodelatabla"/>
+              <w:widowControl w:val="false"/>
+              <w:suppressLineNumbers/>
+              <w:spacing w:before="0" w:after="160"/>
+              <w:rPr/>
+            </w:pPr>
+            <w:r>
+              <w:rPr>
+                <w:rStyle w:val="Strong"/>
+                <w:rFonts w:ascii="times new roman " w:hAnsi="times new roman "/>
+                <w:sz w:val="24"/>
+                <w:szCs w:val="24"/>
+              </w:rPr>
+              <w:t>RNF05</w:t>
+            </w:r>
+          </w:p>
+        </w:tc>
+        <w:tc>
+          <w:tcPr>
+            <w:tcW w:w="7484" w:type="dxa"/>
+            <w:tcBorders/>
+            <w:vAlign w:val="center"/>
+          </w:tcPr>
+          <w:p>
+            <w:pPr>
+              <w:pStyle w:val="Contenidodelatabla"/>
+              <w:widowControl w:val="false"/>
+              <w:suppressLineNumbers/>
+              <w:spacing w:before="0" w:after="160"/>
+              <w:rPr/>
+            </w:pPr>
+            <w:r>
+              <w:rPr>
+                <w:rStyle w:val="Strong"/>
+                <w:rFonts w:ascii="times new roman " w:hAnsi="times new roman "/>
+                <w:sz w:val="24"/>
+                <w:szCs w:val="24"/>
+              </w:rPr>
+              <w:t>El sistema debe</w:t>
+            </w:r>
+            <w:r>
+              <w:rPr>
+                <w:rFonts w:ascii="times new roman " w:hAnsi="times new roman "/>
+                <w:sz w:val="24"/>
+                <w:szCs w:val="24"/>
+              </w:rPr>
+              <w:t xml:space="preserve"> asegurar una tasa de disponibilidad del servicio (SLA) de al menos el 99 % dentro de la ventana de operación productiva.</w:t>
+            </w:r>
+          </w:p>
+        </w:tc>
+      </w:tr>
+      <w:tr>
+        <w:trPr/>
+        <w:tc>
+          <w:tcPr>
+            <w:tcW w:w="1020" w:type="dxa"/>
+            <w:tcBorders/>
+            <w:vAlign w:val="center"/>
+          </w:tcPr>
+          <w:p>
+            <w:pPr>
+              <w:pStyle w:val="Contenidodelatabla"/>
+              <w:widowControl w:val="false"/>
+              <w:suppressLineNumbers/>
+              <w:spacing w:before="0" w:after="160"/>
+              <w:rPr/>
+            </w:pPr>
+            <w:r>
+              <w:rPr>
+                <w:rStyle w:val="Strong"/>
+                <w:rFonts w:ascii="times new roman " w:hAnsi="times new roman "/>
+                <w:sz w:val="24"/>
+                <w:szCs w:val="24"/>
+              </w:rPr>
+              <w:t>RNF06</w:t>
+            </w:r>
+          </w:p>
+        </w:tc>
+        <w:tc>
+          <w:tcPr>
+            <w:tcW w:w="7484" w:type="dxa"/>
+            <w:tcBorders/>
+            <w:vAlign w:val="center"/>
+          </w:tcPr>
+          <w:p>
+            <w:pPr>
+              <w:pStyle w:val="Contenidodelatabla"/>
+              <w:widowControl w:val="false"/>
+              <w:suppressLineNumbers/>
+              <w:spacing w:before="0" w:after="160"/>
+              <w:rPr/>
+            </w:pPr>
+            <w:r>
+              <w:rPr>
+                <w:rStyle w:val="Strong"/>
+                <w:rFonts w:ascii="times new roman " w:hAnsi="times new roman "/>
+                <w:sz w:val="24"/>
+                <w:szCs w:val="24"/>
+              </w:rPr>
+              <w:t>El sistema debe</w:t>
+            </w:r>
+            <w:r>
+              <w:rPr>
+                <w:rFonts w:ascii="times new roman " w:hAnsi="times new roman "/>
+                <w:sz w:val="24"/>
+                <w:szCs w:val="24"/>
+              </w:rPr>
+              <w:t xml:space="preserve"> mantener tiempos de respuesta de cara al usuario inferiores a 3 segundos para transacciones y consultas estándar bajo carga habitual.</w:t>
+            </w:r>
+          </w:p>
+        </w:tc>
+      </w:tr>
+      <w:tr>
+        <w:trPr/>
+        <w:tc>
+          <w:tcPr>
+            <w:tcW w:w="1020" w:type="dxa"/>
+            <w:tcBorders/>
+            <w:vAlign w:val="center"/>
+          </w:tcPr>
+          <w:p>
+            <w:pPr>
+              <w:pStyle w:val="Contenidodelatabla"/>
+              <w:widowControl w:val="false"/>
+              <w:suppressLineNumbers/>
+              <w:spacing w:before="0" w:after="160"/>
+              <w:rPr/>
+            </w:pPr>
+            <w:r>
+              <w:rPr>
+                <w:rStyle w:val="Strong"/>
+                <w:rFonts w:ascii="times new roman " w:hAnsi="times new roman "/>
+                <w:sz w:val="24"/>
+                <w:szCs w:val="24"/>
+              </w:rPr>
+              <w:t>RNF07</w:t>
+            </w:r>
+          </w:p>
+        </w:tc>
+        <w:tc>
+          <w:tcPr>
+            <w:tcW w:w="7484" w:type="dxa"/>
+            <w:tcBorders/>
+            <w:vAlign w:val="center"/>
+          </w:tcPr>
+          <w:p>
+            <w:pPr>
+              <w:pStyle w:val="Contenidodelatabla"/>
+              <w:widowControl w:val="false"/>
+              <w:suppressLineNumbers/>
+              <w:spacing w:before="0" w:after="160"/>
+              <w:rPr/>
+            </w:pPr>
+            <w:r>
+              <w:rPr>
+                <w:rStyle w:val="Strong"/>
+                <w:rFonts w:ascii="times new roman " w:hAnsi="times new roman "/>
+                <w:sz w:val="24"/>
+                <w:szCs w:val="24"/>
+              </w:rPr>
+              <w:t>El sistema debe</w:t>
+            </w:r>
+            <w:r>
+              <w:rPr>
+                <w:rFonts w:ascii="times new roman " w:hAnsi="times new roman "/>
+                <w:sz w:val="24"/>
+                <w:szCs w:val="24"/>
+              </w:rPr>
+              <w:t xml:space="preserve"> garantizar la escalabilidad del sistema para absorber el incremento gradual de usuarios y el volumen transaccional sin degradar la experiencia de uso.</w:t>
+            </w:r>
+          </w:p>
+        </w:tc>
+      </w:tr>
+      <w:tr>
+        <w:trPr/>
+        <w:tc>
+          <w:tcPr>
+            <w:tcW w:w="1020" w:type="dxa"/>
+            <w:tcBorders/>
+            <w:vAlign w:val="center"/>
+          </w:tcPr>
+          <w:p>
+            <w:pPr>
+              <w:pStyle w:val="Contenidodelatabla"/>
+              <w:widowControl w:val="false"/>
+              <w:suppressLineNumbers/>
+              <w:spacing w:before="0" w:after="160"/>
+              <w:rPr/>
+            </w:pPr>
+            <w:r>
+              <w:rPr>
+                <w:rStyle w:val="Strong"/>
+                <w:rFonts w:ascii="times new roman " w:hAnsi="times new roman "/>
+                <w:sz w:val="24"/>
+                <w:szCs w:val="24"/>
+              </w:rPr>
+              <w:t>RNF08</w:t>
+            </w:r>
+          </w:p>
+        </w:tc>
+        <w:tc>
+          <w:tcPr>
+            <w:tcW w:w="7484" w:type="dxa"/>
+            <w:tcBorders/>
+            <w:vAlign w:val="center"/>
+          </w:tcPr>
+          <w:p>
+            <w:pPr>
+              <w:pStyle w:val="Contenidodelatabla"/>
+              <w:widowControl w:val="false"/>
+              <w:suppressLineNumbers/>
+              <w:spacing w:before="0" w:after="160"/>
+              <w:rPr/>
+            </w:pPr>
+            <w:r>
+              <w:rPr>
+                <w:rStyle w:val="Strong"/>
+                <w:rFonts w:ascii="times new roman " w:hAnsi="times new roman "/>
+                <w:sz w:val="24"/>
+                <w:szCs w:val="24"/>
+              </w:rPr>
+              <w:t>El sistema debe</w:t>
+            </w:r>
+            <w:r>
+              <w:rPr>
+                <w:rFonts w:ascii="times new roman " w:hAnsi="times new roman "/>
+                <w:sz w:val="24"/>
+                <w:szCs w:val="24"/>
+              </w:rPr>
+              <w:t xml:space="preserve"> diseñar una interfaz de usuario (UI/UX) intuitiva, consistente y orientada a minimizar la curva de aprendizaje de los distintos perfiles de usuario.</w:t>
+            </w:r>
+          </w:p>
+        </w:tc>
+      </w:tr>
+      <w:tr>
+        <w:trPr/>
+        <w:tc>
+          <w:tcPr>
+            <w:tcW w:w="1020" w:type="dxa"/>
+            <w:tcBorders/>
+            <w:vAlign w:val="center"/>
+          </w:tcPr>
+          <w:p>
+            <w:pPr>
+              <w:pStyle w:val="Contenidodelatabla"/>
+              <w:widowControl w:val="false"/>
+              <w:suppressLineNumbers/>
+              <w:spacing w:before="0" w:after="160"/>
+              <w:rPr/>
+            </w:pPr>
+            <w:r>
+              <w:rPr>
+                <w:rStyle w:val="Strong"/>
+                <w:rFonts w:ascii="times new roman " w:hAnsi="times new roman "/>
+                <w:sz w:val="24"/>
+                <w:szCs w:val="24"/>
+              </w:rPr>
+              <w:t>RNF09</w:t>
+            </w:r>
+          </w:p>
+        </w:tc>
+        <w:tc>
+          <w:tcPr>
+            <w:tcW w:w="7484" w:type="dxa"/>
+            <w:tcBorders/>
+            <w:vAlign w:val="center"/>
+          </w:tcPr>
+          <w:p>
+            <w:pPr>
+              <w:pStyle w:val="Contenidodelatabla"/>
+              <w:widowControl w:val="false"/>
+              <w:suppressLineNumbers/>
+              <w:spacing w:before="0" w:after="160"/>
+              <w:rPr/>
+            </w:pPr>
+            <w:r>
+              <w:rPr>
+                <w:rStyle w:val="Strong"/>
+                <w:rFonts w:ascii="times new roman " w:hAnsi="times new roman "/>
+                <w:sz w:val="24"/>
+                <w:szCs w:val="24"/>
+              </w:rPr>
+              <w:t>El sistema debe</w:t>
+            </w:r>
+            <w:r>
+              <w:rPr>
+                <w:rFonts w:ascii="times new roman " w:hAnsi="times new roman "/>
+                <w:sz w:val="24"/>
+                <w:szCs w:val="24"/>
+              </w:rPr>
+              <w:t xml:space="preserve"> asegurar la compatibilidad e interoperabilidad de la aplicación web en los principales navegadores del mercado (Chrome, Edge, Firefox, Safari).</w:t>
+            </w:r>
+          </w:p>
+        </w:tc>
+      </w:tr>
+      <w:tr>
+        <w:trPr/>
+        <w:tc>
+          <w:tcPr>
+            <w:tcW w:w="1020" w:type="dxa"/>
+            <w:tcBorders/>
+            <w:vAlign w:val="center"/>
+          </w:tcPr>
+          <w:p>
+            <w:pPr>
+              <w:pStyle w:val="Contenidodelatabla"/>
+              <w:widowControl w:val="false"/>
+              <w:suppressLineNumbers/>
+              <w:spacing w:before="0" w:after="160"/>
+              <w:rPr/>
+            </w:pPr>
+            <w:r>
+              <w:rPr>
+                <w:rStyle w:val="Strong"/>
+                <w:rFonts w:ascii="times new roman " w:hAnsi="times new roman "/>
+                <w:sz w:val="24"/>
+                <w:szCs w:val="24"/>
+              </w:rPr>
+              <w:t>RNF10</w:t>
+            </w:r>
+          </w:p>
+        </w:tc>
+        <w:tc>
+          <w:tcPr>
+            <w:tcW w:w="7484" w:type="dxa"/>
+            <w:tcBorders/>
+            <w:vAlign w:val="center"/>
+          </w:tcPr>
+          <w:p>
+            <w:pPr>
+              <w:pStyle w:val="Contenidodelatabla"/>
+              <w:widowControl w:val="false"/>
+              <w:suppressLineNumbers/>
+              <w:spacing w:before="0" w:after="160"/>
+              <w:rPr/>
+            </w:pPr>
+            <w:r>
+              <w:rPr>
+                <w:rStyle w:val="Strong"/>
+                <w:rFonts w:ascii="times new roman " w:hAnsi="times new roman "/>
+                <w:sz w:val="24"/>
+                <w:szCs w:val="24"/>
+              </w:rPr>
+              <w:t>El sistema debe</w:t>
+            </w:r>
+            <w:r>
+              <w:rPr>
+                <w:rFonts w:ascii="times new roman " w:hAnsi="times new roman "/>
+                <w:sz w:val="24"/>
+                <w:szCs w:val="24"/>
+              </w:rPr>
+              <w:t xml:space="preserve"> incorporar un diseño adaptativo (responsive design) que ajuste la interfaz a múltiples resoluciones y tipos de dispositivos (escritorio, tabletas y móviles).</w:t>
+            </w:r>
+          </w:p>
+        </w:tc>
+      </w:tr>
+      <w:tr>
+        <w:trPr/>
+        <w:tc>
+          <w:tcPr>
+            <w:tcW w:w="1020" w:type="dxa"/>
+            <w:tcBorders/>
+            <w:vAlign w:val="center"/>
+          </w:tcPr>
+          <w:p>
+            <w:pPr>
+              <w:pStyle w:val="Contenidodelatabla"/>
+              <w:widowControl w:val="false"/>
+              <w:suppressLineNumbers/>
+              <w:spacing w:before="0" w:after="160"/>
+              <w:rPr/>
+            </w:pPr>
+            <w:r>
+              <w:rPr>
+                <w:rStyle w:val="Strong"/>
+                <w:rFonts w:ascii="times new roman " w:hAnsi="times new roman "/>
+                <w:sz w:val="24"/>
+                <w:szCs w:val="24"/>
+              </w:rPr>
+              <w:t>RNF11</w:t>
+            </w:r>
+          </w:p>
+        </w:tc>
+        <w:tc>
+          <w:tcPr>
+            <w:tcW w:w="7484" w:type="dxa"/>
+            <w:tcBorders/>
+            <w:vAlign w:val="center"/>
+          </w:tcPr>
+          <w:p>
+            <w:pPr>
+              <w:pStyle w:val="Contenidodelatabla"/>
+              <w:widowControl w:val="false"/>
+              <w:suppressLineNumbers/>
+              <w:spacing w:before="0" w:after="160"/>
+              <w:rPr/>
+            </w:pPr>
+            <w:r>
+              <w:rPr>
+                <w:rStyle w:val="Strong"/>
+                <w:rFonts w:ascii="times new roman " w:hAnsi="times new roman "/>
+                <w:sz w:val="24"/>
+                <w:szCs w:val="24"/>
+              </w:rPr>
+              <w:t>El sistema debe</w:t>
+            </w:r>
+            <w:r>
+              <w:rPr>
+                <w:rFonts w:ascii="times new roman " w:hAnsi="times new roman "/>
+                <w:sz w:val="24"/>
+                <w:szCs w:val="24"/>
+              </w:rPr>
+              <w:t xml:space="preserve"> programar un esquema automatizado de respaldos periódicos de la base de datos para prevenir la pérdida imprevista de información.</w:t>
+            </w:r>
+          </w:p>
+        </w:tc>
+      </w:tr>
+      <w:tr>
+        <w:trPr/>
+        <w:tc>
+          <w:tcPr>
+            <w:tcW w:w="1020" w:type="dxa"/>
+            <w:tcBorders/>
+            <w:vAlign w:val="center"/>
+          </w:tcPr>
+          <w:p>
+            <w:pPr>
+              <w:pStyle w:val="Contenidodelatabla"/>
+              <w:widowControl w:val="false"/>
+              <w:suppressLineNumbers/>
+              <w:spacing w:before="0" w:after="160"/>
+              <w:rPr/>
+            </w:pPr>
+            <w:r>
+              <w:rPr>
+                <w:rStyle w:val="Strong"/>
+                <w:rFonts w:ascii="times new roman " w:hAnsi="times new roman "/>
+                <w:sz w:val="24"/>
+                <w:szCs w:val="24"/>
+              </w:rPr>
+              <w:t>RNF12</w:t>
+            </w:r>
+          </w:p>
+        </w:tc>
+        <w:tc>
+          <w:tcPr>
+            <w:tcW w:w="7484" w:type="dxa"/>
+            <w:tcBorders/>
+            <w:vAlign w:val="center"/>
+          </w:tcPr>
+          <w:p>
+            <w:pPr>
+              <w:pStyle w:val="Contenidodelatabla"/>
+              <w:widowControl w:val="false"/>
+              <w:suppressLineNumbers/>
+              <w:spacing w:before="0" w:after="160"/>
+              <w:rPr/>
+            </w:pPr>
+            <w:r>
+              <w:rPr>
+                <w:rStyle w:val="Strong"/>
+                <w:rFonts w:ascii="times new roman " w:hAnsi="times new roman "/>
+                <w:sz w:val="24"/>
+                <w:szCs w:val="24"/>
+              </w:rPr>
+              <w:t>El sistema debe</w:t>
+            </w:r>
+            <w:r>
+              <w:rPr>
+                <w:rFonts w:ascii="times new roman " w:hAnsi="times new roman "/>
+                <w:sz w:val="24"/>
+                <w:szCs w:val="24"/>
+              </w:rPr>
+              <w:t xml:space="preserve"> registrar las operaciones críticas y eventos del sistema en una bitácora de auditoría inmutable para fines de trazabilidad y seguridad.</w:t>
+            </w:r>
+          </w:p>
+        </w:tc>
+      </w:tr>
+      <w:tr>
+        <w:trPr/>
+        <w:tc>
+          <w:tcPr>
+            <w:tcW w:w="1020" w:type="dxa"/>
+            <w:tcBorders/>
+            <w:vAlign w:val="center"/>
+          </w:tcPr>
+          <w:p>
+            <w:pPr>
+              <w:pStyle w:val="Contenidodelatabla"/>
+              <w:widowControl w:val="false"/>
+              <w:suppressLineNumbers/>
+              <w:spacing w:before="0" w:after="160"/>
+              <w:rPr/>
+            </w:pPr>
+            <w:r>
+              <w:rPr>
+                <w:rStyle w:val="Strong"/>
+                <w:rFonts w:ascii="times new roman " w:hAnsi="times new roman "/>
+                <w:sz w:val="24"/>
+                <w:szCs w:val="24"/>
+              </w:rPr>
+              <w:t>RNF13</w:t>
+            </w:r>
+          </w:p>
+        </w:tc>
+        <w:tc>
+          <w:tcPr>
+            <w:tcW w:w="7484" w:type="dxa"/>
+            <w:tcBorders/>
+            <w:vAlign w:val="center"/>
+          </w:tcPr>
+          <w:p>
+            <w:pPr>
+              <w:pStyle w:val="Contenidodelatabla"/>
+              <w:widowControl w:val="false"/>
+              <w:suppressLineNumbers/>
+              <w:spacing w:before="0" w:after="160"/>
+              <w:rPr/>
+            </w:pPr>
+            <w:r>
+              <w:rPr>
+                <w:rStyle w:val="Strong"/>
+                <w:rFonts w:ascii="times new roman " w:hAnsi="times new roman "/>
+                <w:sz w:val="24"/>
+                <w:szCs w:val="24"/>
+              </w:rPr>
+              <w:t>El sistema debe</w:t>
+            </w:r>
+            <w:r>
+              <w:rPr>
+                <w:rFonts w:ascii="times new roman " w:hAnsi="times new roman "/>
+                <w:sz w:val="24"/>
+                <w:szCs w:val="24"/>
+              </w:rPr>
+              <w:t xml:space="preserve"> adoptar patrones de diseño y estándares de código que faciliten el mantenimiento, el refactorizado y la adición de nuevas capacidades operativas.</w:t>
+            </w:r>
+          </w:p>
+        </w:tc>
+      </w:tr>
+      <w:tr>
+        <w:trPr/>
+        <w:tc>
+          <w:tcPr>
+            <w:tcW w:w="1020" w:type="dxa"/>
+            <w:tcBorders/>
+            <w:vAlign w:val="center"/>
+          </w:tcPr>
+          <w:p>
+            <w:pPr>
+              <w:pStyle w:val="Contenidodelatabla"/>
+              <w:widowControl w:val="false"/>
+              <w:suppressLineNumbers/>
+              <w:spacing w:before="0" w:after="160"/>
+              <w:rPr/>
+            </w:pPr>
+            <w:r>
+              <w:rPr>
+                <w:rStyle w:val="Strong"/>
+                <w:rFonts w:ascii="times new roman " w:hAnsi="times new roman "/>
+                <w:sz w:val="24"/>
+                <w:szCs w:val="24"/>
+              </w:rPr>
+              <w:t>RNF14</w:t>
+            </w:r>
+          </w:p>
+        </w:tc>
+        <w:tc>
+          <w:tcPr>
+            <w:tcW w:w="7484" w:type="dxa"/>
+            <w:tcBorders/>
+            <w:vAlign w:val="center"/>
+          </w:tcPr>
+          <w:p>
+            <w:pPr>
+              <w:pStyle w:val="Contenidodelatabla"/>
+              <w:widowControl w:val="false"/>
+              <w:suppressLineNumbers/>
+              <w:spacing w:before="0" w:after="160"/>
+              <w:rPr/>
+            </w:pPr>
+            <w:r>
+              <w:rPr>
+                <w:rStyle w:val="Strong"/>
+                <w:rFonts w:ascii="times new roman " w:hAnsi="times new roman "/>
+                <w:sz w:val="24"/>
+                <w:szCs w:val="24"/>
+              </w:rPr>
+              <w:t>El sistema debe</w:t>
+            </w:r>
+            <w:r>
+              <w:rPr>
+                <w:rFonts w:ascii="times new roman " w:hAnsi="times new roman "/>
+                <w:sz w:val="24"/>
+                <w:szCs w:val="24"/>
+              </w:rPr>
+              <w:t xml:space="preserve"> contar con mecanismos de recuperación ante fallos (Disaster Recovery) que aseguren un tiempo de restablecimiento óptimo con un RPO cercano a cero.</w:t>
+            </w:r>
+          </w:p>
+        </w:tc>
+      </w:tr>
+      <w:tr>
+        <w:trPr/>
+        <w:tc>
+          <w:tcPr>
+            <w:tcW w:w="1020" w:type="dxa"/>
+            <w:tcBorders/>
+            <w:vAlign w:val="center"/>
+          </w:tcPr>
+          <w:p>
+            <w:pPr>
+              <w:pStyle w:val="Contenidodelatabla"/>
+              <w:widowControl w:val="false"/>
+              <w:suppressLineNumbers/>
+              <w:spacing w:before="0" w:after="160"/>
+              <w:rPr/>
+            </w:pPr>
+            <w:r>
+              <w:rPr>
+                <w:rStyle w:val="Strong"/>
+                <w:rFonts w:ascii="times new roman " w:hAnsi="times new roman "/>
+                <w:sz w:val="24"/>
+                <w:szCs w:val="24"/>
+              </w:rPr>
+              <w:t>RNF15</w:t>
+            </w:r>
+          </w:p>
+        </w:tc>
+        <w:tc>
+          <w:tcPr>
+            <w:tcW w:w="7484" w:type="dxa"/>
+            <w:tcBorders/>
+            <w:vAlign w:val="center"/>
+          </w:tcPr>
+          <w:p>
+            <w:pPr>
+              <w:pStyle w:val="Contenidodelatabla"/>
+              <w:widowControl w:val="false"/>
+              <w:suppressLineNumbers/>
+              <w:spacing w:before="0" w:after="160"/>
+              <w:rPr/>
+            </w:pPr>
+            <w:r>
+              <w:rPr>
+                <w:rStyle w:val="Strong"/>
+                <w:rFonts w:ascii="times new roman " w:hAnsi="times new roman "/>
+                <w:sz w:val="24"/>
+                <w:szCs w:val="24"/>
+              </w:rPr>
+              <w:t>El sistema debe</w:t>
+            </w:r>
+            <w:r>
+              <w:rPr>
+                <w:rFonts w:ascii="times new roman " w:hAnsi="times new roman "/>
+                <w:sz w:val="24"/>
+                <w:szCs w:val="24"/>
+              </w:rPr>
+              <w:t xml:space="preserve"> organizar el sistema en partes independientes usando contenedores de Docker y conectarlas con Docker Compose, para que cada componente se pueda instalar o actualizar sin afectar a los demás.</w:t>
+            </w:r>
+          </w:p>
+        </w:tc>
+      </w:tr>
+    </w:tbl>
+    <w:p>
+      <w:pPr>
+        <w:pStyle w:val="BodyText"/>
+        <w:pBdr/>
+        <w:bidi w:val="0"/>
+        <w:spacing w:lineRule="auto" w:line="331" w:before="0" w:after="240"/>
+        <w:ind w:hanging="0" w:start="0" w:end="0"/>
+        <w:rPr>
+          <w:rFonts w:ascii="times new roman " w:hAnsi="times new roman "/>
+          <w:b/>
+          <w:bCs/>
+          <w:sz w:val="24"/>
+          <w:szCs w:val="24"/>
+        </w:rPr>
+      </w:pPr>
+      <w:r>
+        <w:rPr>
+          <w:rFonts w:ascii="times new roman " w:hAnsi="times new roman "/>
+          <w:b/>
+          <w:bCs/>
+          <w:sz w:val="24"/>
+          <w:szCs w:val="24"/>
+        </w:rPr>
+      </w:r>
+    </w:p>
+    <w:p>
+      <w:pPr>
+        <w:pStyle w:val="BodyText"/>
+        <w:pBdr/>
+        <w:bidi w:val="0"/>
+        <w:spacing w:lineRule="auto" w:line="331" w:before="0" w:after="240"/>
+        <w:ind w:hanging="0" w:start="0" w:end="0"/>
+        <w:rPr>
+          <w:rFonts w:ascii="times new roman " w:hAnsi="times new roman "/>
+          <w:sz w:val="24"/>
+          <w:szCs w:val="24"/>
+        </w:rPr>
+      </w:pPr>
+      <w:r>
+        <w:rPr>
+          <w:rFonts w:ascii="times new roman " w:hAnsi="times new roman "/>
+          <w:sz w:val="24"/>
+          <w:szCs w:val="24"/>
+        </w:rPr>
+      </w:r>
+    </w:p>
+    <w:p>
+      <w:pPr>
+        <w:pStyle w:val="BodyText"/>
+        <w:pBdr/>
+        <w:bidi w:val="0"/>
+        <w:spacing w:lineRule="auto" w:line="331" w:before="0" w:after="240"/>
+        <w:ind w:hanging="0" w:start="0" w:end="0"/>
+        <w:rPr>
+          <w:rFonts w:ascii="times new roman " w:hAnsi="times new roman "/>
+          <w:sz w:val="24"/>
+          <w:szCs w:val="24"/>
+        </w:rPr>
+      </w:pPr>
+      <w:r>
+        <w:rPr>
+          <w:rFonts w:ascii="times new roman " w:hAnsi="times new roman "/>
+          <w:sz w:val="24"/>
+          <w:szCs w:val="24"/>
         </w:rPr>
       </w:r>
     </w:p>
@@ -4363,6 +7577,14 @@
       <w:rFonts w:ascii="OpenSymbol" w:hAnsi="OpenSymbol" w:eastAsia="OpenSymbol" w:cs="OpenSymbol"/>
     </w:rPr>
   </w:style>
+  <w:style w:type="character" w:styleId="Strong">
+    <w:name w:val="Strong"/>
+    <w:qFormat/>
+    <w:rPr>
+      <w:b/>
+      <w:bCs/>
+    </w:rPr>
+  </w:style>
   <w:style w:type="paragraph" w:styleId="Ttulo">
     <w:name w:val="Título"/>
     <w:basedOn w:val="Normal"/>

</xml_diff>